<commit_message>
feat: add in rest of tags in doc and add images to pdf
</commit_message>
<xml_diff>
--- a/src/templates/report.docx
+++ b/src/templates/report.docx
@@ -904,21 +904,7 @@
           <w:b/>
           <w:bCs/>
         </w:rPr>
-        <w:t>{</w:t>
-      </w:r>
-      <w:r>
-        <w:rPr>
-          <w:b/>
-          <w:bCs/>
-        </w:rPr>
-        <w:t>2V2</w:t>
-      </w:r>
-      <w:r>
-        <w:rPr>
-          <w:b/>
-          <w:bCs/>
-        </w:rPr>
-        <w:t>}</w:t>
+        <w:t>{2V2}</w:t>
       </w:r>
     </w:p>
     <w:p>
@@ -940,21 +926,7 @@
           <w:b/>
           <w:bCs/>
         </w:rPr>
-        <w:t>{</w:t>
-      </w:r>
-      <w:r>
-        <w:rPr>
-          <w:b/>
-          <w:bCs/>
-        </w:rPr>
-        <w:t>2V3</w:t>
-      </w:r>
-      <w:r>
-        <w:rPr>
-          <w:b/>
-          <w:bCs/>
-        </w:rPr>
-        <w:t>}</w:t>
+        <w:t>{2V3}</w:t>
       </w:r>
     </w:p>
     <w:p>
@@ -976,21 +948,7 @@
           <w:b/>
           <w:bCs/>
         </w:rPr>
-        <w:t>{</w:t>
-      </w:r>
-      <w:r>
-        <w:rPr>
-          <w:b/>
-          <w:bCs/>
-        </w:rPr>
-        <w:t>2V4</w:t>
-      </w:r>
-      <w:r>
-        <w:rPr>
-          <w:b/>
-          <w:bCs/>
-        </w:rPr>
-        <w:t>}</w:t>
+        <w:t>{2V4}</w:t>
       </w:r>
     </w:p>
     <w:p>
@@ -1019,21 +977,7 @@
           <w:b/>
           <w:bCs/>
         </w:rPr>
-        <w:t>{</w:t>
-      </w:r>
-      <w:r>
-        <w:rPr>
-          <w:b/>
-          <w:bCs/>
-        </w:rPr>
-        <w:t>2V5</w:t>
-      </w:r>
-      <w:r>
-        <w:rPr>
-          <w:b/>
-          <w:bCs/>
-        </w:rPr>
-        <w:t>}</w:t>
+        <w:t>{2V5}</w:t>
       </w:r>
     </w:p>
     <w:p>
@@ -1055,21 +999,7 @@
           <w:b/>
           <w:bCs/>
         </w:rPr>
-        <w:t>{</w:t>
-      </w:r>
-      <w:r>
-        <w:rPr>
-          <w:b/>
-          <w:bCs/>
-        </w:rPr>
-        <w:t>2B1</w:t>
-      </w:r>
-      <w:r>
-        <w:rPr>
-          <w:b/>
-          <w:bCs/>
-        </w:rPr>
-        <w:t>}</w:t>
+        <w:t>{2B1}</w:t>
       </w:r>
     </w:p>
     <w:p>
@@ -1126,8 +1056,16 @@
           <w:p>
             <w:pPr>
               <w:pStyle w:val="BodytextBGI"/>
-            </w:pPr>
-            <w:r>
+              <w:rPr>
+                <w:b/>
+                <w:bCs/>
+              </w:rPr>
+            </w:pPr>
+            <w:r>
+              <w:rPr>
+                <w:b/>
+                <w:bCs/>
+              </w:rPr>
               <w:t>Maßnahme</w:t>
             </w:r>
           </w:p>
@@ -1139,8 +1077,16 @@
           <w:p>
             <w:pPr>
               <w:pStyle w:val="BodytextBGI"/>
-            </w:pPr>
-            <w:r>
+              <w:rPr>
+                <w:b/>
+                <w:bCs/>
+              </w:rPr>
+            </w:pPr>
+            <w:r>
+              <w:rPr>
+                <w:b/>
+                <w:bCs/>
+              </w:rPr>
               <w:t>Anzahl</w:t>
             </w:r>
           </w:p>
@@ -1152,12 +1098,17 @@
           <w:p>
             <w:pPr>
               <w:pStyle w:val="BodytextBGI"/>
-            </w:pPr>
-            <w:r>
-              <w:t>m²</w:t>
-            </w:r>
-            <w:r>
-              <w:t xml:space="preserve"> Maßnahme</w:t>
+              <w:rPr>
+                <w:b/>
+                <w:bCs/>
+              </w:rPr>
+            </w:pPr>
+            <w:r>
+              <w:rPr>
+                <w:b/>
+                <w:bCs/>
+              </w:rPr>
+              <w:t>m² Maßnahme</w:t>
             </w:r>
           </w:p>
         </w:tc>
@@ -1168,8 +1119,16 @@
           <w:p>
             <w:pPr>
               <w:pStyle w:val="BodytextBGI"/>
-            </w:pPr>
-            <w:r>
+              <w:rPr>
+                <w:b/>
+                <w:bCs/>
+              </w:rPr>
+            </w:pPr>
+            <w:r>
+              <w:rPr>
+                <w:b/>
+                <w:bCs/>
+              </w:rPr>
               <w:t>m² angeschlossen</w:t>
             </w:r>
           </w:p>
@@ -1412,13 +1371,7 @@
               <w:pStyle w:val="BodytextBGI"/>
             </w:pPr>
             <w:r>
-              <w:t>{</w:t>
-            </w:r>
-            <w:r>
-              <w:t>ca</w:t>
-            </w:r>
-            <w:r>
-              <w:t>_3G5}</w:t>
+              <w:t>{ca_3G5}</w:t>
             </w:r>
           </w:p>
         </w:tc>
@@ -1490,10 +1443,7 @@
             </w:r>
             <w:proofErr w:type="spellStart"/>
             <w:r>
-              <w:t>ca</w:t>
-            </w:r>
-            <w:r>
-              <w:t>_</w:t>
+              <w:t>ca_</w:t>
             </w:r>
             <w:r>
               <w:t>permeable_paving</w:t>
@@ -2092,10 +2042,7 @@
             </w:r>
             <w:proofErr w:type="spellStart"/>
             <w:r>
-              <w:t>t_</w:t>
-            </w:r>
-            <w:r>
-              <w:t>o</w:t>
+              <w:t>t_o</w:t>
             </w:r>
             <w:proofErr w:type="spellEnd"/>
             <w:r>
@@ -2287,10 +2234,7 @@
               <w:t>{</w:t>
             </w:r>
             <w:r>
-              <w:t>ca_</w:t>
-            </w:r>
-            <w:r>
-              <w:t>3S1</w:t>
+              <w:t>ca_3S1</w:t>
             </w:r>
             <w:r>
               <w:t>}</w:t>
@@ -2503,10 +2447,7 @@
               <w:t>_</w:t>
             </w:r>
             <w:r>
-              <w:t>3S</w:t>
-            </w:r>
-            <w:r>
-              <w:t>5</w:t>
+              <w:t>3S5</w:t>
             </w:r>
             <w:r>
               <w:t>}</w:t>
@@ -2531,10 +2472,7 @@
               <w:t>_</w:t>
             </w:r>
             <w:r>
-              <w:t>3S</w:t>
-            </w:r>
-            <w:r>
-              <w:t>5</w:t>
+              <w:t>3S5</w:t>
             </w:r>
             <w:r>
               <w:t>}</w:t>
@@ -2590,8 +2528,16 @@
           <w:p>
             <w:pPr>
               <w:pStyle w:val="BodytextBGI"/>
-            </w:pPr>
-            <w:r>
+              <w:rPr>
+                <w:b/>
+                <w:bCs/>
+              </w:rPr>
+            </w:pPr>
+            <w:r>
+              <w:rPr>
+                <w:b/>
+                <w:bCs/>
+              </w:rPr>
               <w:t>Messwert</w:t>
             </w:r>
           </w:p>
@@ -2603,8 +2549,16 @@
           <w:p>
             <w:pPr>
               <w:pStyle w:val="BodytextBGI"/>
-            </w:pPr>
-            <w:r>
+              <w:rPr>
+                <w:b/>
+                <w:bCs/>
+              </w:rPr>
+            </w:pPr>
+            <w:r>
+              <w:rPr>
+                <w:b/>
+                <w:bCs/>
+              </w:rPr>
               <w:t>Ist-Zustand</w:t>
             </w:r>
           </w:p>
@@ -2616,8 +2570,16 @@
           <w:p>
             <w:pPr>
               <w:pStyle w:val="BodytextBGI"/>
-            </w:pPr>
-            <w:r>
+              <w:rPr>
+                <w:b/>
+                <w:bCs/>
+              </w:rPr>
+            </w:pPr>
+            <w:r>
+              <w:rPr>
+                <w:b/>
+                <w:bCs/>
+              </w:rPr>
               <w:t>Geplant</w:t>
             </w:r>
           </w:p>
@@ -2646,7 +2608,15 @@
               <w:pStyle w:val="BodytextBGI"/>
             </w:pPr>
             <w:r>
-              <w:t>35</w:t>
+              <w:t>{</w:t>
+            </w:r>
+            <w:proofErr w:type="spellStart"/>
+            <w:r>
+              <w:t>delta_w_status_quo</w:t>
+            </w:r>
+            <w:proofErr w:type="spellEnd"/>
+            <w:r>
+              <w:t>}</w:t>
             </w:r>
           </w:p>
         </w:tc>
@@ -2659,7 +2629,18 @@
               <w:pStyle w:val="BodytextBGI"/>
             </w:pPr>
             <w:r>
-              <w:t>12</w:t>
+              <w:t>{</w:t>
+            </w:r>
+            <w:proofErr w:type="spellStart"/>
+            <w:r>
+              <w:t>delta_w_</w:t>
+            </w:r>
+            <w:r>
+              <w:t>with_measures</w:t>
+            </w:r>
+            <w:proofErr w:type="spellEnd"/>
+            <w:r>
+              <w:t>}</w:t>
             </w:r>
           </w:p>
         </w:tc>
@@ -2687,7 +2668,18 @@
               <w:pStyle w:val="BodytextBGI"/>
             </w:pPr>
             <w:r>
-              <w:t>400</w:t>
+              <w:t>{</w:t>
+            </w:r>
+            <w:proofErr w:type="spellStart"/>
+            <w:r>
+              <w:t>runoff</w:t>
+            </w:r>
+            <w:r>
+              <w:t>_status_quo</w:t>
+            </w:r>
+            <w:proofErr w:type="spellEnd"/>
+            <w:r>
+              <w:t>}</w:t>
             </w:r>
           </w:p>
         </w:tc>
@@ -2700,7 +2692,21 @@
               <w:pStyle w:val="BodytextBGI"/>
             </w:pPr>
             <w:r>
-              <w:t>200</w:t>
+              <w:t>{</w:t>
+            </w:r>
+            <w:proofErr w:type="spellStart"/>
+            <w:r>
+              <w:t>runoff</w:t>
+            </w:r>
+            <w:r>
+              <w:t>_</w:t>
+            </w:r>
+            <w:r>
+              <w:t>with_measures</w:t>
+            </w:r>
+            <w:proofErr w:type="spellEnd"/>
+            <w:r>
+              <w:t>}</w:t>
             </w:r>
           </w:p>
         </w:tc>
@@ -2728,7 +2734,18 @@
               <w:pStyle w:val="BodytextBGI"/>
             </w:pPr>
             <w:r>
-              <w:t>56</w:t>
+              <w:t>{</w:t>
+            </w:r>
+            <w:proofErr w:type="spellStart"/>
+            <w:r>
+              <w:t>infiltr</w:t>
+            </w:r>
+            <w:r>
+              <w:t>_status_quo</w:t>
+            </w:r>
+            <w:proofErr w:type="spellEnd"/>
+            <w:r>
+              <w:t>}</w:t>
             </w:r>
           </w:p>
         </w:tc>
@@ -2741,7 +2758,18 @@
               <w:pStyle w:val="BodytextBGI"/>
             </w:pPr>
             <w:r>
-              <w:t>65</w:t>
+              <w:t>{</w:t>
+            </w:r>
+            <w:proofErr w:type="spellStart"/>
+            <w:r>
+              <w:t>infiltr</w:t>
+            </w:r>
+            <w:r>
+              <w:t>_with_measures</w:t>
+            </w:r>
+            <w:proofErr w:type="spellEnd"/>
+            <w:r>
+              <w:t>}</w:t>
             </w:r>
           </w:p>
         </w:tc>
@@ -2769,7 +2797,18 @@
               <w:pStyle w:val="BodytextBGI"/>
             </w:pPr>
             <w:r>
-              <w:t>123</w:t>
+              <w:t>{</w:t>
+            </w:r>
+            <w:proofErr w:type="spellStart"/>
+            <w:r>
+              <w:t>evapor</w:t>
+            </w:r>
+            <w:r>
+              <w:t>_status_quo</w:t>
+            </w:r>
+            <w:proofErr w:type="spellEnd"/>
+            <w:r>
+              <w:t>}</w:t>
             </w:r>
           </w:p>
         </w:tc>
@@ -2782,7 +2821,18 @@
               <w:pStyle w:val="BodytextBGI"/>
             </w:pPr>
             <w:r>
-              <w:t>321</w:t>
+              <w:t>{</w:t>
+            </w:r>
+            <w:proofErr w:type="spellStart"/>
+            <w:r>
+              <w:t>evapor</w:t>
+            </w:r>
+            <w:r>
+              <w:t>_with_measures</w:t>
+            </w:r>
+            <w:proofErr w:type="spellEnd"/>
+            <w:r>
+              <w:t>}</w:t>
             </w:r>
           </w:p>
         </w:tc>
@@ -2924,46 +2974,70 @@
         <w:tblLook w:val="04A0" w:firstRow="1" w:lastRow="0" w:firstColumn="1" w:lastColumn="0" w:noHBand="0" w:noVBand="1"/>
       </w:tblPr>
       <w:tblGrid>
-        <w:gridCol w:w="4390"/>
-        <w:gridCol w:w="3118"/>
-        <w:gridCol w:w="2977"/>
+        <w:gridCol w:w="3680"/>
+        <w:gridCol w:w="3444"/>
+        <w:gridCol w:w="3361"/>
       </w:tblGrid>
       <w:tr>
         <w:tc>
           <w:tcPr>
-            <w:tcW w:w="4390" w:type="dxa"/>
-          </w:tcPr>
-          <w:p>
-            <w:pPr>
-              <w:pStyle w:val="BodytextBGI"/>
-            </w:pPr>
-            <w:r>
+            <w:tcW w:w="4045" w:type="dxa"/>
+          </w:tcPr>
+          <w:p>
+            <w:pPr>
+              <w:pStyle w:val="BodytextBGI"/>
+              <w:rPr>
+                <w:b/>
+                <w:bCs/>
+              </w:rPr>
+            </w:pPr>
+            <w:r>
+              <w:rPr>
+                <w:b/>
+                <w:bCs/>
+              </w:rPr>
               <w:t>Messwert</w:t>
             </w:r>
           </w:p>
         </w:tc>
         <w:tc>
           <w:tcPr>
-            <w:tcW w:w="3118" w:type="dxa"/>
-          </w:tcPr>
-          <w:p>
-            <w:pPr>
-              <w:pStyle w:val="BodytextBGI"/>
-            </w:pPr>
-            <w:r>
+            <w:tcW w:w="3079" w:type="dxa"/>
+          </w:tcPr>
+          <w:p>
+            <w:pPr>
+              <w:pStyle w:val="BodytextBGI"/>
+              <w:rPr>
+                <w:b/>
+                <w:bCs/>
+              </w:rPr>
+            </w:pPr>
+            <w:r>
+              <w:rPr>
+                <w:b/>
+                <w:bCs/>
+              </w:rPr>
               <w:t>Ist-Zustand</w:t>
             </w:r>
           </w:p>
         </w:tc>
         <w:tc>
           <w:tcPr>
-            <w:tcW w:w="2977" w:type="dxa"/>
-          </w:tcPr>
-          <w:p>
-            <w:pPr>
-              <w:pStyle w:val="BodytextBGI"/>
-            </w:pPr>
-            <w:r>
+            <w:tcW w:w="3361" w:type="dxa"/>
+          </w:tcPr>
+          <w:p>
+            <w:pPr>
+              <w:pStyle w:val="BodytextBGI"/>
+              <w:rPr>
+                <w:b/>
+                <w:bCs/>
+              </w:rPr>
+            </w:pPr>
+            <w:r>
+              <w:rPr>
+                <w:b/>
+                <w:bCs/>
+              </w:rPr>
               <w:t>Geplant</w:t>
             </w:r>
           </w:p>
@@ -2972,7 +3046,7 @@
       <w:tr>
         <w:tc>
           <w:tcPr>
-            <w:tcW w:w="4390" w:type="dxa"/>
+            <w:tcW w:w="4045" w:type="dxa"/>
           </w:tcPr>
           <w:p>
             <w:pPr>
@@ -2988,7 +3062,7 @@
         </w:tc>
         <w:tc>
           <w:tcPr>
-            <w:tcW w:w="3118" w:type="dxa"/>
+            <w:tcW w:w="3079" w:type="dxa"/>
           </w:tcPr>
           <w:p>
             <w:pPr>
@@ -3001,14 +3075,22 @@
         </w:tc>
         <w:tc>
           <w:tcPr>
-            <w:tcW w:w="2977" w:type="dxa"/>
-          </w:tcPr>
-          <w:p>
-            <w:pPr>
-              <w:pStyle w:val="BodytextBGI"/>
-            </w:pPr>
-            <w:r>
-              <w:t>10,5</w:t>
+            <w:tcW w:w="3361" w:type="dxa"/>
+          </w:tcPr>
+          <w:p>
+            <w:pPr>
+              <w:pStyle w:val="BodytextBGI"/>
+            </w:pPr>
+            <w:r>
+              <w:t>{</w:t>
+            </w:r>
+            <w:proofErr w:type="spellStart"/>
+            <w:r>
+              <w:t>runoffReduction</w:t>
+            </w:r>
+            <w:proofErr w:type="spellEnd"/>
+            <w:r>
+              <w:t>}</w:t>
             </w:r>
           </w:p>
         </w:tc>
@@ -3016,7 +3098,7 @@
       <w:tr>
         <w:tc>
           <w:tcPr>
-            <w:tcW w:w="4390" w:type="dxa"/>
+            <w:tcW w:w="4045" w:type="dxa"/>
           </w:tcPr>
           <w:p>
             <w:pPr>
@@ -3032,27 +3114,46 @@
         </w:tc>
         <w:tc>
           <w:tcPr>
-            <w:tcW w:w="3118" w:type="dxa"/>
-          </w:tcPr>
-          <w:p>
-            <w:pPr>
-              <w:pStyle w:val="BodytextBGI"/>
-            </w:pPr>
-            <w:r>
-              <w:t>35</w:t>
-            </w:r>
-          </w:p>
-        </w:tc>
-        <w:tc>
-          <w:tcPr>
-            <w:tcW w:w="2977" w:type="dxa"/>
-          </w:tcPr>
-          <w:p>
-            <w:pPr>
-              <w:pStyle w:val="BodytextBGI"/>
-            </w:pPr>
-            <w:r>
-              <w:t>12</w:t>
+            <w:tcW w:w="3079" w:type="dxa"/>
+          </w:tcPr>
+          <w:p>
+            <w:pPr>
+              <w:pStyle w:val="BodytextBGI"/>
+            </w:pPr>
+            <w:r>
+              <w:t>{</w:t>
+            </w:r>
+            <w:proofErr w:type="spellStart"/>
+            <w:r>
+              <w:t>overflow_volume_status_quo</w:t>
+            </w:r>
+            <w:proofErr w:type="spellEnd"/>
+            <w:r>
+              <w:t>}</w:t>
+            </w:r>
+          </w:p>
+        </w:tc>
+        <w:tc>
+          <w:tcPr>
+            <w:tcW w:w="3361" w:type="dxa"/>
+          </w:tcPr>
+          <w:p>
+            <w:pPr>
+              <w:pStyle w:val="BodytextBGI"/>
+            </w:pPr>
+            <w:r>
+              <w:t>{</w:t>
+            </w:r>
+            <w:proofErr w:type="spellStart"/>
+            <w:r>
+              <w:t>overflow_volume_s</w:t>
+            </w:r>
+            <w:r>
+              <w:t>imulation</w:t>
+            </w:r>
+            <w:proofErr w:type="spellEnd"/>
+            <w:r>
+              <w:t>}</w:t>
             </w:r>
           </w:p>
         </w:tc>
@@ -3060,7 +3161,7 @@
       <w:tr>
         <w:tc>
           <w:tcPr>
-            <w:tcW w:w="4390" w:type="dxa"/>
+            <w:tcW w:w="4045" w:type="dxa"/>
           </w:tcPr>
           <w:p>
             <w:pPr>
@@ -3076,27 +3177,43 @@
         </w:tc>
         <w:tc>
           <w:tcPr>
-            <w:tcW w:w="3118" w:type="dxa"/>
-          </w:tcPr>
-          <w:p>
-            <w:pPr>
-              <w:pStyle w:val="BodytextBGI"/>
-            </w:pPr>
-            <w:r>
-              <w:t>400</w:t>
-            </w:r>
-          </w:p>
-        </w:tc>
-        <w:tc>
-          <w:tcPr>
-            <w:tcW w:w="2977" w:type="dxa"/>
-          </w:tcPr>
-          <w:p>
-            <w:pPr>
-              <w:pStyle w:val="BodytextBGI"/>
-            </w:pPr>
-            <w:r>
-              <w:t>200</w:t>
+            <w:tcW w:w="3079" w:type="dxa"/>
+          </w:tcPr>
+          <w:p>
+            <w:pPr>
+              <w:pStyle w:val="BodytextBGI"/>
+            </w:pPr>
+            <w:r>
+              <w:t>{</w:t>
+            </w:r>
+            <w:proofErr w:type="spellStart"/>
+            <w:r>
+              <w:t>critical_hours_status_quo</w:t>
+            </w:r>
+            <w:proofErr w:type="spellEnd"/>
+            <w:r>
+              <w:t>}</w:t>
+            </w:r>
+          </w:p>
+        </w:tc>
+        <w:tc>
+          <w:tcPr>
+            <w:tcW w:w="3361" w:type="dxa"/>
+          </w:tcPr>
+          <w:p>
+            <w:pPr>
+              <w:pStyle w:val="BodytextBGI"/>
+            </w:pPr>
+            <w:r>
+              <w:t>{</w:t>
+            </w:r>
+            <w:proofErr w:type="spellStart"/>
+            <w:r>
+              <w:t>critical_hours_simulation</w:t>
+            </w:r>
+            <w:proofErr w:type="spellEnd"/>
+            <w:r>
+              <w:t>}</w:t>
             </w:r>
           </w:p>
         </w:tc>
@@ -3104,7 +3221,7 @@
       <w:tr>
         <w:tc>
           <w:tcPr>
-            <w:tcW w:w="4390" w:type="dxa"/>
+            <w:tcW w:w="4045" w:type="dxa"/>
           </w:tcPr>
           <w:p>
             <w:pPr>
@@ -3129,27 +3246,43 @@
         </w:tc>
         <w:tc>
           <w:tcPr>
-            <w:tcW w:w="3118" w:type="dxa"/>
-          </w:tcPr>
-          <w:p>
-            <w:pPr>
-              <w:pStyle w:val="BodytextBGI"/>
-            </w:pPr>
-            <w:r>
-              <w:t>56</w:t>
-            </w:r>
-          </w:p>
-        </w:tc>
-        <w:tc>
-          <w:tcPr>
-            <w:tcW w:w="2977" w:type="dxa"/>
-          </w:tcPr>
-          <w:p>
-            <w:pPr>
-              <w:pStyle w:val="BodytextBGI"/>
-            </w:pPr>
-            <w:r>
-              <w:t>65</w:t>
+            <w:tcW w:w="3079" w:type="dxa"/>
+          </w:tcPr>
+          <w:p>
+            <w:pPr>
+              <w:pStyle w:val="BodytextBGI"/>
+            </w:pPr>
+            <w:r>
+              <w:t>{</w:t>
+            </w:r>
+            <w:proofErr w:type="spellStart"/>
+            <w:r>
+              <w:t>critical_events_status_quo</w:t>
+            </w:r>
+            <w:proofErr w:type="spellEnd"/>
+            <w:r>
+              <w:t>}</w:t>
+            </w:r>
+          </w:p>
+        </w:tc>
+        <w:tc>
+          <w:tcPr>
+            <w:tcW w:w="3361" w:type="dxa"/>
+          </w:tcPr>
+          <w:p>
+            <w:pPr>
+              <w:pStyle w:val="BodytextBGI"/>
+            </w:pPr>
+            <w:r>
+              <w:t>{</w:t>
+            </w:r>
+            <w:proofErr w:type="spellStart"/>
+            <w:r>
+              <w:t>critical_events_simulation</w:t>
+            </w:r>
+            <w:proofErr w:type="spellEnd"/>
+            <w:r>
+              <w:t>}</w:t>
             </w:r>
           </w:p>
         </w:tc>
@@ -3324,30 +3457,93 @@
     </w:p>
     <w:p>
       <w:pPr>
+        <w:rPr>
+          <w:rFonts w:ascii="Arthouse Owned Medium" w:hAnsi="Arthouse Owned Medium"/>
+        </w:rPr>
+      </w:pPr>
+      <w:r>
+        <w:rPr>
+          <w:rFonts w:ascii="Arthouse Owned Medium" w:hAnsi="Arthouse Owned Medium"/>
+        </w:rPr>
+        <w:br w:type="page"/>
+      </w:r>
+    </w:p>
+    <w:p>
+      <w:pPr>
         <w:spacing w:line="240" w:lineRule="auto"/>
         <w:rPr>
           <w:rFonts w:ascii="Arthouse Owned Medium" w:hAnsi="Arthouse Owned Medium"/>
-        </w:rPr>
-      </w:pPr>
-    </w:p>
-    <w:p>
-      <w:pPr>
+          <w:sz w:val="48"/>
+          <w:szCs w:val="48"/>
+        </w:rPr>
+      </w:pPr>
+      <w:r>
         <w:rPr>
           <w:rFonts w:ascii="Arthouse Owned Medium" w:hAnsi="Arthouse Owned Medium"/>
-        </w:rPr>
-      </w:pPr>
-      <w:r>
+          <w:sz w:val="48"/>
+          <w:szCs w:val="48"/>
+        </w:rPr>
+        <w:lastRenderedPageBreak/>
+        <w:t>Effektbewertung Gewässerschutz</w:t>
+      </w:r>
+    </w:p>
+    <w:p>
+      <w:pPr>
         <w:rPr>
           <w:rFonts w:ascii="Arthouse Owned Medium" w:hAnsi="Arthouse Owned Medium"/>
         </w:rPr>
+      </w:pPr>
+      <w:r>
+        <w:rPr>
+          <w:rFonts w:ascii="Arthouse Owned Medium" w:hAnsi="Arthouse Owned Medium"/>
+        </w:rPr>
+        <w:t>{%plot_1}</w:t>
+      </w:r>
+    </w:p>
+    <w:p>
+      <w:pPr>
+        <w:rPr>
+          <w:rFonts w:ascii="Arthouse Owned Medium" w:hAnsi="Arthouse Owned Medium"/>
+        </w:rPr>
+      </w:pPr>
+      <w:r>
+        <w:rPr>
+          <w:rFonts w:ascii="Arthouse Owned Medium" w:hAnsi="Arthouse Owned Medium"/>
+        </w:rPr>
+        <w:t>{%plot_</w:t>
+      </w:r>
+      <w:r>
+        <w:rPr>
+          <w:rFonts w:ascii="Arthouse Owned Medium" w:hAnsi="Arthouse Owned Medium"/>
+        </w:rPr>
+        <w:t>2</w:t>
+      </w:r>
+      <w:r>
+        <w:rPr>
+          <w:rFonts w:ascii="Arthouse Owned Medium" w:hAnsi="Arthouse Owned Medium"/>
+        </w:rPr>
+        <w:t>}</w:t>
+      </w:r>
+    </w:p>
+    <w:p>
+      <w:pPr>
+        <w:rPr>
+          <w:rFonts w:ascii="Arthouse Owned Medium" w:hAnsi="Arthouse Owned Medium"/>
+          <w:sz w:val="48"/>
+          <w:szCs w:val="48"/>
+        </w:rPr>
+      </w:pPr>
+      <w:r>
+        <w:rPr>
+          <w:rFonts w:ascii="Arthouse Owned Medium" w:hAnsi="Arthouse Owned Medium"/>
+        </w:rPr>
         <w:br w:type="page"/>
       </w:r>
-    </w:p>
-    <w:p>
-      <w:pPr>
-        <w:pStyle w:val="berschrift1BGI"/>
-      </w:pPr>
-      <w:r>
+      <w:r>
+        <w:rPr>
+          <w:sz w:val="48"/>
+          <w:szCs w:val="48"/>
+        </w:rPr>
         <w:lastRenderedPageBreak/>
         <w:t>Notizen</w:t>
       </w:r>
@@ -3398,13 +3594,7 @@
         <w:rPr>
           <w:rFonts w:ascii="Arthouse Owned Medium" w:hAnsi="Arthouse Owned Medium"/>
         </w:rPr>
-        <w:t>{</w:t>
-      </w:r>
-      <w:r>
-        <w:rPr>
-          <w:rFonts w:ascii="Arthouse Owned Medium" w:hAnsi="Arthouse Owned Medium"/>
-        </w:rPr>
-        <w:t>/</w:t>
+        <w:t>{/</w:t>
       </w:r>
       <w:proofErr w:type="spellStart"/>
       <w:r>

</xml_diff>

<commit_message>
fix: change keys for report
</commit_message>
<xml_diff>
--- a/src/templates/report.docx
+++ b/src/templates/report.docx
@@ -1,6 +1,6 @@
 
 <file path=word/document.xml><?xml version="1.0" encoding="utf-8"?>
-<w:document xmlns:wpc="http://schemas.microsoft.com/office/word/2010/wordprocessingCanvas" xmlns:cx="http://schemas.microsoft.com/office/drawing/2014/chartex" xmlns:cx1="http://schemas.microsoft.com/office/drawing/2015/9/8/chartex" xmlns:cx2="http://schemas.microsoft.com/office/drawing/2015/10/21/chartex" xmlns:cx3="http://schemas.microsoft.com/office/drawing/2016/5/9/chartex" xmlns:cx4="http://schemas.microsoft.com/office/drawing/2016/5/10/chartex" xmlns:cx5="http://schemas.microsoft.com/office/drawing/2016/5/11/chartex" xmlns:cx6="http://schemas.microsoft.com/office/drawing/2016/5/12/chartex" xmlns:cx7="http://schemas.microsoft.com/office/drawing/2016/5/13/chartex" xmlns:cx8="http://schemas.microsoft.com/office/drawing/2016/5/14/chartex" xmlns:mc="http://schemas.openxmlformats.org/markup-compatibility/2006" xmlns:m="http://schemas.openxmlformats.org/officeDocument/2006/math" xmlns:aink="http://schemas.microsoft.com/office/drawing/2016/ink" xmlns:am3d="http://schemas.microsoft.com/office/drawing/2017/model3d" xmlns:oel="http://schemas.microsoft.com/office/2019/extlst" xmlns:r="http://schemas.openxmlformats.org/officeDocument/2006/relationships" xmlns:wp14="http://schemas.microsoft.com/office/word/2010/wordprocessingDrawing" xmlns:wp="http://schemas.openxmlformats.org/drawingml/2006/wordprocessingDrawing" xmlns:wpg="http://schemas.microsoft.com/office/word/2010/wordprocessingGroup" xmlns:wpi="http://schemas.microsoft.com/office/word/2010/wordprocessingInk" xmlns:wps="http://schemas.microsoft.com/office/word/2010/wordprocessingShape" xmlns:o="urn:schemas-microsoft-com:office:office" xmlns:v="urn:schemas-microsoft-com:vml" xmlns:w10="urn:schemas-microsoft-com:office:word" xmlns:w="http://schemas.openxmlformats.org/wordprocessingml/2006/main" xmlns:w14="http://schemas.microsoft.com/office/word/2010/wordml" xmlns:w15="http://schemas.microsoft.com/office/word/2012/wordml" xmlns:w16cei="http://schemas.microsoft.com/office/word/2026/wordml/cei" xmlns:w16cex="http://schemas.microsoft.com/office/word/2018/wordml/cex" xmlns:w16cid="http://schemas.microsoft.com/office/word/2016/wordml/cid" xmlns:w16="http://schemas.microsoft.com/office/word/2018/wordml" xmlns:w16sdtdh="http://schemas.microsoft.com/office/word/2020/wordml/sdtdatahash" xmlns:w16sdtfl="http://schemas.microsoft.com/office/word/2024/wordml/sdtformatlock" xmlns:w16se="http://schemas.microsoft.com/office/word/2015/wordml/symex" xmlns:w16du="http://schemas.microsoft.com/office/word/2023/wordml/word16du" xmlns:wne="http://schemas.microsoft.com/office/word/2006/wordml" mc:Ignorable="w14 w15 w16se w16cid w16 w16cex w16sdtdh w16sdtfl w16du wp14">
+<w:document xmlns:wpc="http://schemas.microsoft.com/office/word/2010/wordprocessingCanvas" xmlns:cx="http://schemas.microsoft.com/office/drawing/2014/chartex" xmlns:cx1="http://schemas.microsoft.com/office/drawing/2015/9/8/chartex" xmlns:cx2="http://schemas.microsoft.com/office/drawing/2015/10/21/chartex" xmlns:cx3="http://schemas.microsoft.com/office/drawing/2016/5/9/chartex" xmlns:cx4="http://schemas.microsoft.com/office/drawing/2016/5/10/chartex" xmlns:cx5="http://schemas.microsoft.com/office/drawing/2016/5/11/chartex" xmlns:cx6="http://schemas.microsoft.com/office/drawing/2016/5/12/chartex" xmlns:cx7="http://schemas.microsoft.com/office/drawing/2016/5/13/chartex" xmlns:cx8="http://schemas.microsoft.com/office/drawing/2016/5/14/chartex" xmlns:mc="http://schemas.openxmlformats.org/markup-compatibility/2006" xmlns:m="http://schemas.openxmlformats.org/officeDocument/2006/math" xmlns:aink="http://schemas.microsoft.com/office/drawing/2016/ink" xmlns:am3d="http://schemas.microsoft.com/office/drawing/2017/model3d" xmlns:oel="http://schemas.microsoft.com/office/2019/extlst" xmlns:r="http://schemas.openxmlformats.org/officeDocument/2006/relationships" xmlns:wp14="http://schemas.microsoft.com/office/word/2010/wordprocessingDrawing" xmlns:wp="http://schemas.openxmlformats.org/drawingml/2006/wordprocessingDrawing" xmlns:wpg="http://schemas.microsoft.com/office/word/2010/wordprocessingGroup" xmlns:wpi="http://schemas.microsoft.com/office/word/2010/wordprocessingInk" xmlns:wps="http://schemas.microsoft.com/office/word/2010/wordprocessingShape" xmlns:o="urn:schemas-microsoft-com:office:office" xmlns:v="urn:schemas-microsoft-com:vml" xmlns:w10="urn:schemas-microsoft-com:office:word" xmlns:w="http://schemas.openxmlformats.org/wordprocessingml/2006/main" xmlns:w14="http://schemas.microsoft.com/office/word/2010/wordml" xmlns:w15="http://schemas.microsoft.com/office/word/2012/wordml" xmlns:w16cex="http://schemas.microsoft.com/office/word/2018/wordml/cex" xmlns:w16cid="http://schemas.microsoft.com/office/word/2016/wordml/cid" xmlns:w16="http://schemas.microsoft.com/office/word/2018/wordml" xmlns:w16sdtdh="http://schemas.microsoft.com/office/word/2020/wordml/sdtdatahash" xmlns:w16sdtfl="http://schemas.microsoft.com/office/word/2024/wordml/sdtformatlock" xmlns:w16se="http://schemas.microsoft.com/office/word/2015/wordml/symex" xmlns:w16du="http://schemas.microsoft.com/office/word/2023/wordml/word16du" xmlns:wne="http://schemas.microsoft.com/office/word/2006/wordml" mc:Ignorable="w14 w15 w16se w16cid w16 w16cex w16sdtdh w16sdtfl w16du wp14">
   <w:body>
     <w:p>
       <w:pPr>
@@ -338,6 +338,77 @@
     <w:p>
       <w:pPr>
         <w:pStyle w:val="BodytextBGI"/>
+        <w:ind w:left="1440"/>
+        <w:rPr>
+          <w:lang w:val="en-US"/>
+        </w:rPr>
+      </w:pPr>
+      <w:r>
+        <w:rPr>
+          <w:lang w:val="en-US"/>
+        </w:rPr>
+        <w:t>{#heavy_rain_flow_velocit</w:t>
+      </w:r>
+      <w:r>
+        <w:rPr>
+          <w:lang w:val="en-US"/>
+        </w:rPr>
+        <w:t>y_</w:t>
+      </w:r>
+      <w:r>
+        <w:rPr>
+          <w:lang w:val="en-US"/>
+        </w:rPr>
+        <w:t>notes}</w:t>
+      </w:r>
+    </w:p>
+    <w:p>
+      <w:pPr>
+        <w:pStyle w:val="BodytextBGI"/>
+        <w:numPr>
+          <w:ilvl w:val="1"/>
+          <w:numId w:val="3"/>
+        </w:numPr>
+      </w:pPr>
+      <w:r>
+        <w:t>{.</w:t>
+      </w:r>
+      <w:r>
+        <w:t>}</w:t>
+      </w:r>
+    </w:p>
+    <w:p>
+      <w:pPr>
+        <w:pStyle w:val="BodytextBGI"/>
+        <w:ind w:left="1440"/>
+        <w:rPr>
+          <w:lang w:val="en-US"/>
+        </w:rPr>
+      </w:pPr>
+      <w:r>
+        <w:rPr>
+          <w:lang w:val="en-US"/>
+        </w:rPr>
+        <w:t>{/</w:t>
+      </w:r>
+      <w:proofErr w:type="spellStart"/>
+      <w:r>
+        <w:rPr>
+          <w:lang w:val="en-US"/>
+        </w:rPr>
+        <w:t>heavy_rain_flow_velocity_notes</w:t>
+      </w:r>
+      <w:proofErr w:type="spellEnd"/>
+      <w:r>
+        <w:rPr>
+          <w:lang w:val="en-US"/>
+        </w:rPr>
+        <w:t>}</w:t>
+      </w:r>
+    </w:p>
+    <w:p>
+      <w:pPr>
+        <w:pStyle w:val="BodytextBGI"/>
         <w:numPr>
           <w:ilvl w:val="0"/>
           <w:numId w:val="3"/>
@@ -382,6 +453,83 @@
         <w:rPr>
           <w:b/>
           <w:bCs/>
+          <w:lang w:val="en-US"/>
+        </w:rPr>
+        <w:t>}</w:t>
+      </w:r>
+    </w:p>
+    <w:p>
+      <w:pPr>
+        <w:pStyle w:val="BodytextBGI"/>
+        <w:ind w:left="1440"/>
+        <w:rPr>
+          <w:lang w:val="en-US"/>
+        </w:rPr>
+      </w:pPr>
+      <w:r>
+        <w:rPr>
+          <w:lang w:val="en-US"/>
+        </w:rPr>
+        <w:t>{#</w:t>
+      </w:r>
+      <w:r>
+        <w:rPr>
+          <w:lang w:val="en-US"/>
+        </w:rPr>
+        <w:t>heavy_rain_fire_department_incidents</w:t>
+      </w:r>
+      <w:r>
+        <w:rPr>
+          <w:lang w:val="en-US"/>
+        </w:rPr>
+        <w:t>_notes}</w:t>
+      </w:r>
+    </w:p>
+    <w:p>
+      <w:pPr>
+        <w:pStyle w:val="BodytextBGI"/>
+        <w:numPr>
+          <w:ilvl w:val="1"/>
+          <w:numId w:val="3"/>
+        </w:numPr>
+      </w:pPr>
+      <w:r>
+        <w:t>{.</w:t>
+      </w:r>
+      <w:r>
+        <w:t>}</w:t>
+      </w:r>
+    </w:p>
+    <w:p>
+      <w:pPr>
+        <w:pStyle w:val="BodytextBGI"/>
+        <w:ind w:left="1440"/>
+        <w:rPr>
+          <w:lang w:val="en-US"/>
+        </w:rPr>
+      </w:pPr>
+      <w:r>
+        <w:rPr>
+          <w:lang w:val="en-US"/>
+        </w:rPr>
+        <w:t>{/</w:t>
+      </w:r>
+      <w:proofErr w:type="spellStart"/>
+      <w:r>
+        <w:rPr>
+          <w:lang w:val="en-US"/>
+        </w:rPr>
+        <w:t>heavy_rain_fire_department_incidents</w:t>
+      </w:r>
+      <w:r>
+        <w:rPr>
+          <w:lang w:val="en-US"/>
+        </w:rPr>
+        <w:t>_notes</w:t>
+      </w:r>
+      <w:proofErr w:type="spellEnd"/>
+      <w:r>
+        <w:rPr>
           <w:lang w:val="en-US"/>
         </w:rPr>
         <w:t>}</w:t>
@@ -2633,10 +2781,7 @@
             </w:r>
             <w:proofErr w:type="spellStart"/>
             <w:r>
-              <w:t>delta_w_</w:t>
-            </w:r>
-            <w:r>
-              <w:t>with_measures</w:t>
+              <w:t>delta_w_with_measures</w:t>
             </w:r>
             <w:proofErr w:type="spellEnd"/>
             <w:r>
@@ -2672,10 +2817,7 @@
             </w:r>
             <w:proofErr w:type="spellStart"/>
             <w:r>
-              <w:t>runoff</w:t>
-            </w:r>
-            <w:r>
-              <w:t>_status_quo</w:t>
+              <w:t>runoff_status_quo</w:t>
             </w:r>
             <w:proofErr w:type="spellEnd"/>
             <w:r>
@@ -2696,13 +2838,7 @@
             </w:r>
             <w:proofErr w:type="spellStart"/>
             <w:r>
-              <w:t>runoff</w:t>
-            </w:r>
-            <w:r>
-              <w:t>_</w:t>
-            </w:r>
-            <w:r>
-              <w:t>with_measures</w:t>
+              <w:t>runoff_with_measures</w:t>
             </w:r>
             <w:proofErr w:type="spellEnd"/>
             <w:r>
@@ -3475,81 +3611,116 @@
           <w:rFonts w:ascii="Arthouse Owned Medium" w:hAnsi="Arthouse Owned Medium"/>
           <w:sz w:val="48"/>
           <w:szCs w:val="48"/>
-        </w:rPr>
-      </w:pPr>
+          <w:lang w:val="en-US"/>
+        </w:rPr>
+      </w:pPr>
+      <w:proofErr w:type="spellStart"/>
       <w:r>
         <w:rPr>
           <w:rFonts w:ascii="Arthouse Owned Medium" w:hAnsi="Arthouse Owned Medium"/>
           <w:sz w:val="48"/>
           <w:szCs w:val="48"/>
+          <w:lang w:val="en-US"/>
         </w:rPr>
         <w:lastRenderedPageBreak/>
-        <w:t>Effektbewertung Gewässerschutz</w:t>
-      </w:r>
-    </w:p>
-    <w:p>
-      <w:pPr>
-        <w:rPr>
-          <w:rFonts w:ascii="Arthouse Owned Medium" w:hAnsi="Arthouse Owned Medium"/>
-        </w:rPr>
-      </w:pPr>
-      <w:r>
-        <w:rPr>
-          <w:rFonts w:ascii="Arthouse Owned Medium" w:hAnsi="Arthouse Owned Medium"/>
-        </w:rPr>
-        <w:t>{%</w:t>
-      </w:r>
-      <w:proofErr w:type="spellStart"/>
-      <w:r>
-        <w:rPr>
-          <w:rFonts w:ascii="Arthouse Owned Medium" w:hAnsi="Arthouse Owned Medium"/>
-        </w:rPr>
-        <w:t>plot_critical_hours</w:t>
+        <w:t>Effektbewertung</w:t>
       </w:r>
       <w:proofErr w:type="spellEnd"/>
       <w:r>
-        <w:rPr>
-          <w:rFonts w:ascii="Arthouse Owned Medium" w:hAnsi="Arthouse Owned Medium"/>
-        </w:rPr>
-        <w:t>}</w:t>
-      </w:r>
-    </w:p>
-    <w:p>
-      <w:pPr>
-        <w:rPr>
-          <w:rFonts w:ascii="Arthouse Owned Medium" w:hAnsi="Arthouse Owned Medium"/>
-        </w:rPr>
-      </w:pPr>
-      <w:r>
-        <w:rPr>
-          <w:rFonts w:ascii="Arthouse Owned Medium" w:hAnsi="Arthouse Owned Medium"/>
-        </w:rPr>
-        <w:t>{%</w:t>
-      </w:r>
-      <w:r>
-        <w:rPr>
-          <w:rFonts w:ascii="Arthouse Owned Medium" w:hAnsi="Arthouse Owned Medium"/>
-        </w:rPr>
-        <w:t>plot_critical_events</w:t>
-      </w:r>
-      <w:r>
-        <w:rPr>
-          <w:rFonts w:ascii="Arthouse Owned Medium" w:hAnsi="Arthouse Owned Medium"/>
-        </w:rPr>
-        <w:t>}</w:t>
-      </w:r>
-    </w:p>
-    <w:p>
-      <w:pPr>
         <w:rPr>
           <w:rFonts w:ascii="Arthouse Owned Medium" w:hAnsi="Arthouse Owned Medium"/>
           <w:sz w:val="48"/>
           <w:szCs w:val="48"/>
-        </w:rPr>
-      </w:pPr>
+          <w:lang w:val="en-US"/>
+        </w:rPr>
+        <w:t xml:space="preserve"> </w:t>
+      </w:r>
+      <w:proofErr w:type="spellStart"/>
       <w:r>
         <w:rPr>
           <w:rFonts w:ascii="Arthouse Owned Medium" w:hAnsi="Arthouse Owned Medium"/>
+          <w:sz w:val="48"/>
+          <w:szCs w:val="48"/>
+          <w:lang w:val="en-US"/>
+        </w:rPr>
+        <w:t>Gewässerschutz</w:t>
+      </w:r>
+      <w:proofErr w:type="spellEnd"/>
+    </w:p>
+    <w:p>
+      <w:pPr>
+        <w:rPr>
+          <w:rFonts w:ascii="Arthouse Owned Medium" w:hAnsi="Arthouse Owned Medium"/>
+          <w:lang w:val="en-US"/>
+        </w:rPr>
+      </w:pPr>
+      <w:r>
+        <w:rPr>
+          <w:rFonts w:ascii="Arthouse Owned Medium" w:hAnsi="Arthouse Owned Medium"/>
+          <w:lang w:val="en-US"/>
+        </w:rPr>
+        <w:t>{%</w:t>
+      </w:r>
+      <w:proofErr w:type="spellStart"/>
+      <w:r>
+        <w:rPr>
+          <w:rFonts w:ascii="Arthouse Owned Medium" w:hAnsi="Arthouse Owned Medium"/>
+          <w:lang w:val="en-US"/>
+        </w:rPr>
+        <w:t>plot_critical_hours</w:t>
+      </w:r>
+      <w:proofErr w:type="spellEnd"/>
+      <w:r>
+        <w:rPr>
+          <w:rFonts w:ascii="Arthouse Owned Medium" w:hAnsi="Arthouse Owned Medium"/>
+          <w:lang w:val="en-US"/>
+        </w:rPr>
+        <w:t>}</w:t>
+      </w:r>
+    </w:p>
+    <w:p>
+      <w:pPr>
+        <w:rPr>
+          <w:rFonts w:ascii="Arthouse Owned Medium" w:hAnsi="Arthouse Owned Medium"/>
+          <w:lang w:val="en-US"/>
+        </w:rPr>
+      </w:pPr>
+      <w:r>
+        <w:rPr>
+          <w:rFonts w:ascii="Arthouse Owned Medium" w:hAnsi="Arthouse Owned Medium"/>
+          <w:lang w:val="en-US"/>
+        </w:rPr>
+        <w:t>{%</w:t>
+      </w:r>
+      <w:proofErr w:type="spellStart"/>
+      <w:r>
+        <w:rPr>
+          <w:rFonts w:ascii="Arthouse Owned Medium" w:hAnsi="Arthouse Owned Medium"/>
+          <w:lang w:val="en-US"/>
+        </w:rPr>
+        <w:t>plot_critical_events</w:t>
+      </w:r>
+      <w:proofErr w:type="spellEnd"/>
+      <w:r>
+        <w:rPr>
+          <w:rFonts w:ascii="Arthouse Owned Medium" w:hAnsi="Arthouse Owned Medium"/>
+          <w:lang w:val="en-US"/>
+        </w:rPr>
+        <w:t>}</w:t>
+      </w:r>
+    </w:p>
+    <w:p>
+      <w:pPr>
+        <w:rPr>
+          <w:rFonts w:ascii="Arthouse Owned Medium" w:hAnsi="Arthouse Owned Medium"/>
+          <w:sz w:val="48"/>
+          <w:szCs w:val="48"/>
+        </w:rPr>
+      </w:pPr>
+      <w:r>
+        <w:rPr>
+          <w:rFonts w:ascii="Arthouse Owned Medium" w:hAnsi="Arthouse Owned Medium"/>
+          <w:lang w:val="en-US"/>
         </w:rPr>
         <w:br w:type="page"/>
       </w:r>
@@ -3638,7 +3809,7 @@
 </file>
 
 <file path=word/endnotes.xml><?xml version="1.0" encoding="utf-8"?>
-<w:endnotes xmlns:wpc="http://schemas.microsoft.com/office/word/2010/wordprocessingCanvas" xmlns:cx="http://schemas.microsoft.com/office/drawing/2014/chartex" xmlns:cx1="http://schemas.microsoft.com/office/drawing/2015/9/8/chartex" xmlns:cx2="http://schemas.microsoft.com/office/drawing/2015/10/21/chartex" xmlns:cx3="http://schemas.microsoft.com/office/drawing/2016/5/9/chartex" xmlns:cx4="http://schemas.microsoft.com/office/drawing/2016/5/10/chartex" xmlns:cx5="http://schemas.microsoft.com/office/drawing/2016/5/11/chartex" xmlns:cx6="http://schemas.microsoft.com/office/drawing/2016/5/12/chartex" xmlns:cx7="http://schemas.microsoft.com/office/drawing/2016/5/13/chartex" xmlns:cx8="http://schemas.microsoft.com/office/drawing/2016/5/14/chartex" xmlns:mc="http://schemas.openxmlformats.org/markup-compatibility/2006" xmlns:m="http://schemas.openxmlformats.org/officeDocument/2006/math" xmlns:aink="http://schemas.microsoft.com/office/drawing/2016/ink" xmlns:am3d="http://schemas.microsoft.com/office/drawing/2017/model3d" xmlns:oel="http://schemas.microsoft.com/office/2019/extlst" xmlns:r="http://schemas.openxmlformats.org/officeDocument/2006/relationships" xmlns:wp14="http://schemas.microsoft.com/office/word/2010/wordprocessingDrawing" xmlns:wp="http://schemas.openxmlformats.org/drawingml/2006/wordprocessingDrawing" xmlns:wpg="http://schemas.microsoft.com/office/word/2010/wordprocessingGroup" xmlns:wpi="http://schemas.microsoft.com/office/word/2010/wordprocessingInk" xmlns:wps="http://schemas.microsoft.com/office/word/2010/wordprocessingShape" xmlns:o="urn:schemas-microsoft-com:office:office" xmlns:v="urn:schemas-microsoft-com:vml" xmlns:w10="urn:schemas-microsoft-com:office:word" xmlns:w="http://schemas.openxmlformats.org/wordprocessingml/2006/main" xmlns:w14="http://schemas.microsoft.com/office/word/2010/wordml" xmlns:w15="http://schemas.microsoft.com/office/word/2012/wordml" xmlns:w16cei="http://schemas.microsoft.com/office/word/2026/wordml/cei" xmlns:w16cex="http://schemas.microsoft.com/office/word/2018/wordml/cex" xmlns:w16cid="http://schemas.microsoft.com/office/word/2016/wordml/cid" xmlns:w16="http://schemas.microsoft.com/office/word/2018/wordml" xmlns:w16sdtdh="http://schemas.microsoft.com/office/word/2020/wordml/sdtdatahash" xmlns:w16sdtfl="http://schemas.microsoft.com/office/word/2024/wordml/sdtformatlock" xmlns:w16se="http://schemas.microsoft.com/office/word/2015/wordml/symex" xmlns:w16du="http://schemas.microsoft.com/office/word/2023/wordml/word16du" xmlns:wne="http://schemas.microsoft.com/office/word/2006/wordml" mc:Ignorable="w14 w15 w16se w16cid w16 w16cex w16sdtdh w16sdtfl w16du wp14">
+<w:endnotes xmlns:wpc="http://schemas.microsoft.com/office/word/2010/wordprocessingCanvas" xmlns:cx="http://schemas.microsoft.com/office/drawing/2014/chartex" xmlns:cx1="http://schemas.microsoft.com/office/drawing/2015/9/8/chartex" xmlns:cx2="http://schemas.microsoft.com/office/drawing/2015/10/21/chartex" xmlns:cx3="http://schemas.microsoft.com/office/drawing/2016/5/9/chartex" xmlns:cx4="http://schemas.microsoft.com/office/drawing/2016/5/10/chartex" xmlns:cx5="http://schemas.microsoft.com/office/drawing/2016/5/11/chartex" xmlns:cx6="http://schemas.microsoft.com/office/drawing/2016/5/12/chartex" xmlns:cx7="http://schemas.microsoft.com/office/drawing/2016/5/13/chartex" xmlns:cx8="http://schemas.microsoft.com/office/drawing/2016/5/14/chartex" xmlns:mc="http://schemas.openxmlformats.org/markup-compatibility/2006" xmlns:m="http://schemas.openxmlformats.org/officeDocument/2006/math" xmlns:aink="http://schemas.microsoft.com/office/drawing/2016/ink" xmlns:am3d="http://schemas.microsoft.com/office/drawing/2017/model3d" xmlns:oel="http://schemas.microsoft.com/office/2019/extlst" xmlns:r="http://schemas.openxmlformats.org/officeDocument/2006/relationships" xmlns:wp14="http://schemas.microsoft.com/office/word/2010/wordprocessingDrawing" xmlns:wp="http://schemas.openxmlformats.org/drawingml/2006/wordprocessingDrawing" xmlns:wpg="http://schemas.microsoft.com/office/word/2010/wordprocessingGroup" xmlns:wpi="http://schemas.microsoft.com/office/word/2010/wordprocessingInk" xmlns:wps="http://schemas.microsoft.com/office/word/2010/wordprocessingShape" xmlns:o="urn:schemas-microsoft-com:office:office" xmlns:v="urn:schemas-microsoft-com:vml" xmlns:w10="urn:schemas-microsoft-com:office:word" xmlns:w="http://schemas.openxmlformats.org/wordprocessingml/2006/main" xmlns:w14="http://schemas.microsoft.com/office/word/2010/wordml" xmlns:w15="http://schemas.microsoft.com/office/word/2012/wordml" xmlns:w16cex="http://schemas.microsoft.com/office/word/2018/wordml/cex" xmlns:w16cid="http://schemas.microsoft.com/office/word/2016/wordml/cid" xmlns:w16="http://schemas.microsoft.com/office/word/2018/wordml" xmlns:w16sdtdh="http://schemas.microsoft.com/office/word/2020/wordml/sdtdatahash" xmlns:w16sdtfl="http://schemas.microsoft.com/office/word/2024/wordml/sdtformatlock" xmlns:w16se="http://schemas.microsoft.com/office/word/2015/wordml/symex" xmlns:w16du="http://schemas.microsoft.com/office/word/2023/wordml/word16du" xmlns:wne="http://schemas.microsoft.com/office/word/2006/wordml" mc:Ignorable="w14 w15 w16se w16cid w16 w16cex w16sdtdh w16sdtfl w16du wp14">
   <w:endnote w:type="separator" w:id="-1">
     <w:p>
       <w:pPr>
@@ -3663,7 +3834,7 @@
 </file>
 
 <file path=word/footer1.xml><?xml version="1.0" encoding="utf-8"?>
-<w:ftr xmlns:wpc="http://schemas.microsoft.com/office/word/2010/wordprocessingCanvas" xmlns:cx="http://schemas.microsoft.com/office/drawing/2014/chartex" xmlns:cx1="http://schemas.microsoft.com/office/drawing/2015/9/8/chartex" xmlns:cx2="http://schemas.microsoft.com/office/drawing/2015/10/21/chartex" xmlns:cx3="http://schemas.microsoft.com/office/drawing/2016/5/9/chartex" xmlns:cx4="http://schemas.microsoft.com/office/drawing/2016/5/10/chartex" xmlns:cx5="http://schemas.microsoft.com/office/drawing/2016/5/11/chartex" xmlns:cx6="http://schemas.microsoft.com/office/drawing/2016/5/12/chartex" xmlns:cx7="http://schemas.microsoft.com/office/drawing/2016/5/13/chartex" xmlns:cx8="http://schemas.microsoft.com/office/drawing/2016/5/14/chartex" xmlns:mc="http://schemas.openxmlformats.org/markup-compatibility/2006" xmlns:m="http://schemas.openxmlformats.org/officeDocument/2006/math" xmlns:aink="http://schemas.microsoft.com/office/drawing/2016/ink" xmlns:am3d="http://schemas.microsoft.com/office/drawing/2017/model3d" xmlns:oel="http://schemas.microsoft.com/office/2019/extlst" xmlns:r="http://schemas.openxmlformats.org/officeDocument/2006/relationships" xmlns:wp14="http://schemas.microsoft.com/office/word/2010/wordprocessingDrawing" xmlns:wp="http://schemas.openxmlformats.org/drawingml/2006/wordprocessingDrawing" xmlns:wpg="http://schemas.microsoft.com/office/word/2010/wordprocessingGroup" xmlns:wpi="http://schemas.microsoft.com/office/word/2010/wordprocessingInk" xmlns:wps="http://schemas.microsoft.com/office/word/2010/wordprocessingShape" xmlns:o="urn:schemas-microsoft-com:office:office" xmlns:v="urn:schemas-microsoft-com:vml" xmlns:w10="urn:schemas-microsoft-com:office:word" xmlns:w="http://schemas.openxmlformats.org/wordprocessingml/2006/main" xmlns:w14="http://schemas.microsoft.com/office/word/2010/wordml" xmlns:w15="http://schemas.microsoft.com/office/word/2012/wordml" xmlns:w16cei="http://schemas.microsoft.com/office/word/2026/wordml/cei" xmlns:w16cex="http://schemas.microsoft.com/office/word/2018/wordml/cex" xmlns:w16cid="http://schemas.microsoft.com/office/word/2016/wordml/cid" xmlns:w16="http://schemas.microsoft.com/office/word/2018/wordml" xmlns:w16sdtdh="http://schemas.microsoft.com/office/word/2020/wordml/sdtdatahash" xmlns:w16sdtfl="http://schemas.microsoft.com/office/word/2024/wordml/sdtformatlock" xmlns:w16se="http://schemas.microsoft.com/office/word/2015/wordml/symex" xmlns:w16du="http://schemas.microsoft.com/office/word/2023/wordml/word16du" xmlns:wne="http://schemas.microsoft.com/office/word/2006/wordml" mc:Ignorable="w14 w15 w16se w16cid w16 w16cex w16sdtdh w16sdtfl w16du wp14">
+<w:ftr xmlns:wpc="http://schemas.microsoft.com/office/word/2010/wordprocessingCanvas" xmlns:cx="http://schemas.microsoft.com/office/drawing/2014/chartex" xmlns:cx1="http://schemas.microsoft.com/office/drawing/2015/9/8/chartex" xmlns:cx2="http://schemas.microsoft.com/office/drawing/2015/10/21/chartex" xmlns:cx3="http://schemas.microsoft.com/office/drawing/2016/5/9/chartex" xmlns:cx4="http://schemas.microsoft.com/office/drawing/2016/5/10/chartex" xmlns:cx5="http://schemas.microsoft.com/office/drawing/2016/5/11/chartex" xmlns:cx6="http://schemas.microsoft.com/office/drawing/2016/5/12/chartex" xmlns:cx7="http://schemas.microsoft.com/office/drawing/2016/5/13/chartex" xmlns:cx8="http://schemas.microsoft.com/office/drawing/2016/5/14/chartex" xmlns:mc="http://schemas.openxmlformats.org/markup-compatibility/2006" xmlns:m="http://schemas.openxmlformats.org/officeDocument/2006/math" xmlns:aink="http://schemas.microsoft.com/office/drawing/2016/ink" xmlns:am3d="http://schemas.microsoft.com/office/drawing/2017/model3d" xmlns:oel="http://schemas.microsoft.com/office/2019/extlst" xmlns:r="http://schemas.openxmlformats.org/officeDocument/2006/relationships" xmlns:wp14="http://schemas.microsoft.com/office/word/2010/wordprocessingDrawing" xmlns:wp="http://schemas.openxmlformats.org/drawingml/2006/wordprocessingDrawing" xmlns:wpg="http://schemas.microsoft.com/office/word/2010/wordprocessingGroup" xmlns:wpi="http://schemas.microsoft.com/office/word/2010/wordprocessingInk" xmlns:wps="http://schemas.microsoft.com/office/word/2010/wordprocessingShape" xmlns:o="urn:schemas-microsoft-com:office:office" xmlns:v="urn:schemas-microsoft-com:vml" xmlns:w10="urn:schemas-microsoft-com:office:word" xmlns:w="http://schemas.openxmlformats.org/wordprocessingml/2006/main" xmlns:w14="http://schemas.microsoft.com/office/word/2010/wordml" xmlns:w15="http://schemas.microsoft.com/office/word/2012/wordml" xmlns:w16cex="http://schemas.microsoft.com/office/word/2018/wordml/cex" xmlns:w16cid="http://schemas.microsoft.com/office/word/2016/wordml/cid" xmlns:w16="http://schemas.microsoft.com/office/word/2018/wordml" xmlns:w16sdtdh="http://schemas.microsoft.com/office/word/2020/wordml/sdtdatahash" xmlns:w16sdtfl="http://schemas.microsoft.com/office/word/2024/wordml/sdtformatlock" xmlns:w16se="http://schemas.microsoft.com/office/word/2015/wordml/symex" xmlns:w16du="http://schemas.microsoft.com/office/word/2023/wordml/word16du" xmlns:wne="http://schemas.microsoft.com/office/word/2006/wordml" mc:Ignorable="w14 w15 w16se w16cid w16 w16cex w16sdtdh w16sdtfl w16du wp14">
   <w:sdt>
     <w:sdtPr>
       <w:id w:val="-537892434"/>
@@ -3705,7 +3876,7 @@
 </file>
 
 <file path=word/footnotes.xml><?xml version="1.0" encoding="utf-8"?>
-<w:footnotes xmlns:wpc="http://schemas.microsoft.com/office/word/2010/wordprocessingCanvas" xmlns:cx="http://schemas.microsoft.com/office/drawing/2014/chartex" xmlns:cx1="http://schemas.microsoft.com/office/drawing/2015/9/8/chartex" xmlns:cx2="http://schemas.microsoft.com/office/drawing/2015/10/21/chartex" xmlns:cx3="http://schemas.microsoft.com/office/drawing/2016/5/9/chartex" xmlns:cx4="http://schemas.microsoft.com/office/drawing/2016/5/10/chartex" xmlns:cx5="http://schemas.microsoft.com/office/drawing/2016/5/11/chartex" xmlns:cx6="http://schemas.microsoft.com/office/drawing/2016/5/12/chartex" xmlns:cx7="http://schemas.microsoft.com/office/drawing/2016/5/13/chartex" xmlns:cx8="http://schemas.microsoft.com/office/drawing/2016/5/14/chartex" xmlns:mc="http://schemas.openxmlformats.org/markup-compatibility/2006" xmlns:m="http://schemas.openxmlformats.org/officeDocument/2006/math" xmlns:aink="http://schemas.microsoft.com/office/drawing/2016/ink" xmlns:am3d="http://schemas.microsoft.com/office/drawing/2017/model3d" xmlns:oel="http://schemas.microsoft.com/office/2019/extlst" xmlns:r="http://schemas.openxmlformats.org/officeDocument/2006/relationships" xmlns:wp14="http://schemas.microsoft.com/office/word/2010/wordprocessingDrawing" xmlns:wp="http://schemas.openxmlformats.org/drawingml/2006/wordprocessingDrawing" xmlns:wpg="http://schemas.microsoft.com/office/word/2010/wordprocessingGroup" xmlns:wpi="http://schemas.microsoft.com/office/word/2010/wordprocessingInk" xmlns:wps="http://schemas.microsoft.com/office/word/2010/wordprocessingShape" xmlns:o="urn:schemas-microsoft-com:office:office" xmlns:v="urn:schemas-microsoft-com:vml" xmlns:w10="urn:schemas-microsoft-com:office:word" xmlns:w="http://schemas.openxmlformats.org/wordprocessingml/2006/main" xmlns:w14="http://schemas.microsoft.com/office/word/2010/wordml" xmlns:w15="http://schemas.microsoft.com/office/word/2012/wordml" xmlns:w16cei="http://schemas.microsoft.com/office/word/2026/wordml/cei" xmlns:w16cex="http://schemas.microsoft.com/office/word/2018/wordml/cex" xmlns:w16cid="http://schemas.microsoft.com/office/word/2016/wordml/cid" xmlns:w16="http://schemas.microsoft.com/office/word/2018/wordml" xmlns:w16sdtdh="http://schemas.microsoft.com/office/word/2020/wordml/sdtdatahash" xmlns:w16sdtfl="http://schemas.microsoft.com/office/word/2024/wordml/sdtformatlock" xmlns:w16se="http://schemas.microsoft.com/office/word/2015/wordml/symex" xmlns:w16du="http://schemas.microsoft.com/office/word/2023/wordml/word16du" xmlns:wne="http://schemas.microsoft.com/office/word/2006/wordml" mc:Ignorable="w14 w15 w16se w16cid w16 w16cex w16sdtdh w16sdtfl w16du wp14">
+<w:footnotes xmlns:wpc="http://schemas.microsoft.com/office/word/2010/wordprocessingCanvas" xmlns:cx="http://schemas.microsoft.com/office/drawing/2014/chartex" xmlns:cx1="http://schemas.microsoft.com/office/drawing/2015/9/8/chartex" xmlns:cx2="http://schemas.microsoft.com/office/drawing/2015/10/21/chartex" xmlns:cx3="http://schemas.microsoft.com/office/drawing/2016/5/9/chartex" xmlns:cx4="http://schemas.microsoft.com/office/drawing/2016/5/10/chartex" xmlns:cx5="http://schemas.microsoft.com/office/drawing/2016/5/11/chartex" xmlns:cx6="http://schemas.microsoft.com/office/drawing/2016/5/12/chartex" xmlns:cx7="http://schemas.microsoft.com/office/drawing/2016/5/13/chartex" xmlns:cx8="http://schemas.microsoft.com/office/drawing/2016/5/14/chartex" xmlns:mc="http://schemas.openxmlformats.org/markup-compatibility/2006" xmlns:m="http://schemas.openxmlformats.org/officeDocument/2006/math" xmlns:aink="http://schemas.microsoft.com/office/drawing/2016/ink" xmlns:am3d="http://schemas.microsoft.com/office/drawing/2017/model3d" xmlns:oel="http://schemas.microsoft.com/office/2019/extlst" xmlns:r="http://schemas.openxmlformats.org/officeDocument/2006/relationships" xmlns:wp14="http://schemas.microsoft.com/office/word/2010/wordprocessingDrawing" xmlns:wp="http://schemas.openxmlformats.org/drawingml/2006/wordprocessingDrawing" xmlns:wpg="http://schemas.microsoft.com/office/word/2010/wordprocessingGroup" xmlns:wpi="http://schemas.microsoft.com/office/word/2010/wordprocessingInk" xmlns:wps="http://schemas.microsoft.com/office/word/2010/wordprocessingShape" xmlns:o="urn:schemas-microsoft-com:office:office" xmlns:v="urn:schemas-microsoft-com:vml" xmlns:w10="urn:schemas-microsoft-com:office:word" xmlns:w="http://schemas.openxmlformats.org/wordprocessingml/2006/main" xmlns:w14="http://schemas.microsoft.com/office/word/2010/wordml" xmlns:w15="http://schemas.microsoft.com/office/word/2012/wordml" xmlns:w16cex="http://schemas.microsoft.com/office/word/2018/wordml/cex" xmlns:w16cid="http://schemas.microsoft.com/office/word/2016/wordml/cid" xmlns:w16="http://schemas.microsoft.com/office/word/2018/wordml" xmlns:w16sdtdh="http://schemas.microsoft.com/office/word/2020/wordml/sdtdatahash" xmlns:w16sdtfl="http://schemas.microsoft.com/office/word/2024/wordml/sdtformatlock" xmlns:w16se="http://schemas.microsoft.com/office/word/2015/wordml/symex" xmlns:w16du="http://schemas.microsoft.com/office/word/2023/wordml/word16du" xmlns:wne="http://schemas.microsoft.com/office/word/2006/wordml" mc:Ignorable="w14 w15 w16se w16cid w16 w16cex w16sdtdh w16sdtfl w16du wp14">
   <w:footnote w:type="separator" w:id="-1">
     <w:p>
       <w:pPr>
@@ -3730,7 +3901,7 @@
 </file>
 
 <file path=word/header1.xml><?xml version="1.0" encoding="utf-8"?>
-<w:hdr xmlns:wpc="http://schemas.microsoft.com/office/word/2010/wordprocessingCanvas" xmlns:cx="http://schemas.microsoft.com/office/drawing/2014/chartex" xmlns:cx1="http://schemas.microsoft.com/office/drawing/2015/9/8/chartex" xmlns:cx2="http://schemas.microsoft.com/office/drawing/2015/10/21/chartex" xmlns:cx3="http://schemas.microsoft.com/office/drawing/2016/5/9/chartex" xmlns:cx4="http://schemas.microsoft.com/office/drawing/2016/5/10/chartex" xmlns:cx5="http://schemas.microsoft.com/office/drawing/2016/5/11/chartex" xmlns:cx6="http://schemas.microsoft.com/office/drawing/2016/5/12/chartex" xmlns:cx7="http://schemas.microsoft.com/office/drawing/2016/5/13/chartex" xmlns:cx8="http://schemas.microsoft.com/office/drawing/2016/5/14/chartex" xmlns:mc="http://schemas.openxmlformats.org/markup-compatibility/2006" xmlns:m="http://schemas.openxmlformats.org/officeDocument/2006/math" xmlns:aink="http://schemas.microsoft.com/office/drawing/2016/ink" xmlns:am3d="http://schemas.microsoft.com/office/drawing/2017/model3d" xmlns:oel="http://schemas.microsoft.com/office/2019/extlst" xmlns:r="http://schemas.openxmlformats.org/officeDocument/2006/relationships" xmlns:wp14="http://schemas.microsoft.com/office/word/2010/wordprocessingDrawing" xmlns:wp="http://schemas.openxmlformats.org/drawingml/2006/wordprocessingDrawing" xmlns:wpg="http://schemas.microsoft.com/office/word/2010/wordprocessingGroup" xmlns:wpi="http://schemas.microsoft.com/office/word/2010/wordprocessingInk" xmlns:wps="http://schemas.microsoft.com/office/word/2010/wordprocessingShape" xmlns:o="urn:schemas-microsoft-com:office:office" xmlns:v="urn:schemas-microsoft-com:vml" xmlns:w10="urn:schemas-microsoft-com:office:word" xmlns:w="http://schemas.openxmlformats.org/wordprocessingml/2006/main" xmlns:w14="http://schemas.microsoft.com/office/word/2010/wordml" xmlns:w15="http://schemas.microsoft.com/office/word/2012/wordml" xmlns:w16cei="http://schemas.microsoft.com/office/word/2026/wordml/cei" xmlns:w16cex="http://schemas.microsoft.com/office/word/2018/wordml/cex" xmlns:w16cid="http://schemas.microsoft.com/office/word/2016/wordml/cid" xmlns:w16="http://schemas.microsoft.com/office/word/2018/wordml" xmlns:w16sdtdh="http://schemas.microsoft.com/office/word/2020/wordml/sdtdatahash" xmlns:w16sdtfl="http://schemas.microsoft.com/office/word/2024/wordml/sdtformatlock" xmlns:w16se="http://schemas.microsoft.com/office/word/2015/wordml/symex" xmlns:w16du="http://schemas.microsoft.com/office/word/2023/wordml/word16du" xmlns:wne="http://schemas.microsoft.com/office/word/2006/wordml" mc:Ignorable="w14 w15 w16se w16cid w16 w16cex w16sdtdh w16sdtfl w16du wp14">
+<w:hdr xmlns:wpc="http://schemas.microsoft.com/office/word/2010/wordprocessingCanvas" xmlns:cx="http://schemas.microsoft.com/office/drawing/2014/chartex" xmlns:cx1="http://schemas.microsoft.com/office/drawing/2015/9/8/chartex" xmlns:cx2="http://schemas.microsoft.com/office/drawing/2015/10/21/chartex" xmlns:cx3="http://schemas.microsoft.com/office/drawing/2016/5/9/chartex" xmlns:cx4="http://schemas.microsoft.com/office/drawing/2016/5/10/chartex" xmlns:cx5="http://schemas.microsoft.com/office/drawing/2016/5/11/chartex" xmlns:cx6="http://schemas.microsoft.com/office/drawing/2016/5/12/chartex" xmlns:cx7="http://schemas.microsoft.com/office/drawing/2016/5/13/chartex" xmlns:cx8="http://schemas.microsoft.com/office/drawing/2016/5/14/chartex" xmlns:mc="http://schemas.openxmlformats.org/markup-compatibility/2006" xmlns:m="http://schemas.openxmlformats.org/officeDocument/2006/math" xmlns:aink="http://schemas.microsoft.com/office/drawing/2016/ink" xmlns:am3d="http://schemas.microsoft.com/office/drawing/2017/model3d" xmlns:oel="http://schemas.microsoft.com/office/2019/extlst" xmlns:r="http://schemas.openxmlformats.org/officeDocument/2006/relationships" xmlns:wp14="http://schemas.microsoft.com/office/word/2010/wordprocessingDrawing" xmlns:wp="http://schemas.openxmlformats.org/drawingml/2006/wordprocessingDrawing" xmlns:wpg="http://schemas.microsoft.com/office/word/2010/wordprocessingGroup" xmlns:wpi="http://schemas.microsoft.com/office/word/2010/wordprocessingInk" xmlns:wps="http://schemas.microsoft.com/office/word/2010/wordprocessingShape" xmlns:o="urn:schemas-microsoft-com:office:office" xmlns:v="urn:schemas-microsoft-com:vml" xmlns:w10="urn:schemas-microsoft-com:office:word" xmlns:w="http://schemas.openxmlformats.org/wordprocessingml/2006/main" xmlns:w14="http://schemas.microsoft.com/office/word/2010/wordml" xmlns:w15="http://schemas.microsoft.com/office/word/2012/wordml" xmlns:w16cex="http://schemas.microsoft.com/office/word/2018/wordml/cex" xmlns:w16cid="http://schemas.microsoft.com/office/word/2016/wordml/cid" xmlns:w16="http://schemas.microsoft.com/office/word/2018/wordml" xmlns:w16sdtdh="http://schemas.microsoft.com/office/word/2020/wordml/sdtdatahash" xmlns:w16sdtfl="http://schemas.microsoft.com/office/word/2024/wordml/sdtformatlock" xmlns:w16se="http://schemas.microsoft.com/office/word/2015/wordml/symex" xmlns:w16du="http://schemas.microsoft.com/office/word/2023/wordml/word16du" xmlns:wne="http://schemas.microsoft.com/office/word/2006/wordml" mc:Ignorable="w14 w15 w16se w16cid w16 w16cex w16sdtdh w16sdtfl w16du wp14">
   <w:p>
     <w:pPr>
       <w:pStyle w:val="berschrift1BGI"/>
@@ -3830,7 +4001,7 @@
             </wp:anchor>
           </w:drawing>
         </mc:Choice>
-        <mc:Fallback>
+        <mc:Fallback xmlns:w16cei="http://schemas.microsoft.com/office/word/2026/wordml/cei">
           <w:pict>
             <v:shapetype w14:anchorId="56368F1E" id="_x0000_t202" coordsize="21600,21600" o:spt="202" path="m,l,21600r21600,l21600,xe">
               <v:stroke joinstyle="miter"/>
@@ -3908,7 +4079,7 @@
 </file>
 
 <file path=word/numbering.xml><?xml version="1.0" encoding="utf-8"?>
-<w:numbering xmlns:wpc="http://schemas.microsoft.com/office/word/2010/wordprocessingCanvas" xmlns:cx="http://schemas.microsoft.com/office/drawing/2014/chartex" xmlns:cx1="http://schemas.microsoft.com/office/drawing/2015/9/8/chartex" xmlns:cx2="http://schemas.microsoft.com/office/drawing/2015/10/21/chartex" xmlns:cx3="http://schemas.microsoft.com/office/drawing/2016/5/9/chartex" xmlns:cx4="http://schemas.microsoft.com/office/drawing/2016/5/10/chartex" xmlns:cx5="http://schemas.microsoft.com/office/drawing/2016/5/11/chartex" xmlns:cx6="http://schemas.microsoft.com/office/drawing/2016/5/12/chartex" xmlns:cx7="http://schemas.microsoft.com/office/drawing/2016/5/13/chartex" xmlns:cx8="http://schemas.microsoft.com/office/drawing/2016/5/14/chartex" xmlns:mc="http://schemas.openxmlformats.org/markup-compatibility/2006" xmlns:m="http://schemas.openxmlformats.org/officeDocument/2006/math" xmlns:aink="http://schemas.microsoft.com/office/drawing/2016/ink" xmlns:am3d="http://schemas.microsoft.com/office/drawing/2017/model3d" xmlns:oel="http://schemas.microsoft.com/office/2019/extlst" xmlns:r="http://schemas.openxmlformats.org/officeDocument/2006/relationships" xmlns:wp14="http://schemas.microsoft.com/office/word/2010/wordprocessingDrawing" xmlns:wp="http://schemas.openxmlformats.org/drawingml/2006/wordprocessingDrawing" xmlns:wpg="http://schemas.microsoft.com/office/word/2010/wordprocessingGroup" xmlns:wpi="http://schemas.microsoft.com/office/word/2010/wordprocessingInk" xmlns:wps="http://schemas.microsoft.com/office/word/2010/wordprocessingShape" xmlns:o="urn:schemas-microsoft-com:office:office" xmlns:v="urn:schemas-microsoft-com:vml" xmlns:w10="urn:schemas-microsoft-com:office:word" xmlns:w="http://schemas.openxmlformats.org/wordprocessingml/2006/main" xmlns:w14="http://schemas.microsoft.com/office/word/2010/wordml" xmlns:w15="http://schemas.microsoft.com/office/word/2012/wordml" xmlns:w16cei="http://schemas.microsoft.com/office/word/2026/wordml/cei" xmlns:w16cex="http://schemas.microsoft.com/office/word/2018/wordml/cex" xmlns:w16cid="http://schemas.microsoft.com/office/word/2016/wordml/cid" xmlns:w16="http://schemas.microsoft.com/office/word/2018/wordml" xmlns:w16sdtdh="http://schemas.microsoft.com/office/word/2020/wordml/sdtdatahash" xmlns:w16sdtfl="http://schemas.microsoft.com/office/word/2024/wordml/sdtformatlock" xmlns:w16se="http://schemas.microsoft.com/office/word/2015/wordml/symex" xmlns:w16du="http://schemas.microsoft.com/office/word/2023/wordml/word16du" xmlns:wne="http://schemas.microsoft.com/office/word/2006/wordml" mc:Ignorable="w14 w15 w16se w16cid w16 w16cex w16sdtdh w16sdtfl w16du wp14">
+<w:numbering xmlns:wpc="http://schemas.microsoft.com/office/word/2010/wordprocessingCanvas" xmlns:cx="http://schemas.microsoft.com/office/drawing/2014/chartex" xmlns:cx1="http://schemas.microsoft.com/office/drawing/2015/9/8/chartex" xmlns:cx2="http://schemas.microsoft.com/office/drawing/2015/10/21/chartex" xmlns:cx3="http://schemas.microsoft.com/office/drawing/2016/5/9/chartex" xmlns:cx4="http://schemas.microsoft.com/office/drawing/2016/5/10/chartex" xmlns:cx5="http://schemas.microsoft.com/office/drawing/2016/5/11/chartex" xmlns:cx6="http://schemas.microsoft.com/office/drawing/2016/5/12/chartex" xmlns:cx7="http://schemas.microsoft.com/office/drawing/2016/5/13/chartex" xmlns:cx8="http://schemas.microsoft.com/office/drawing/2016/5/14/chartex" xmlns:mc="http://schemas.openxmlformats.org/markup-compatibility/2006" xmlns:m="http://schemas.openxmlformats.org/officeDocument/2006/math" xmlns:aink="http://schemas.microsoft.com/office/drawing/2016/ink" xmlns:am3d="http://schemas.microsoft.com/office/drawing/2017/model3d" xmlns:oel="http://schemas.microsoft.com/office/2019/extlst" xmlns:r="http://schemas.openxmlformats.org/officeDocument/2006/relationships" xmlns:wp14="http://schemas.microsoft.com/office/word/2010/wordprocessingDrawing" xmlns:wp="http://schemas.openxmlformats.org/drawingml/2006/wordprocessingDrawing" xmlns:wpg="http://schemas.microsoft.com/office/word/2010/wordprocessingGroup" xmlns:wpi="http://schemas.microsoft.com/office/word/2010/wordprocessingInk" xmlns:wps="http://schemas.microsoft.com/office/word/2010/wordprocessingShape" xmlns:o="urn:schemas-microsoft-com:office:office" xmlns:v="urn:schemas-microsoft-com:vml" xmlns:w10="urn:schemas-microsoft-com:office:word" xmlns:w="http://schemas.openxmlformats.org/wordprocessingml/2006/main" xmlns:w14="http://schemas.microsoft.com/office/word/2010/wordml" xmlns:w15="http://schemas.microsoft.com/office/word/2012/wordml" xmlns:w16cex="http://schemas.microsoft.com/office/word/2018/wordml/cex" xmlns:w16cid="http://schemas.microsoft.com/office/word/2016/wordml/cid" xmlns:w16="http://schemas.microsoft.com/office/word/2018/wordml" xmlns:w16sdtdh="http://schemas.microsoft.com/office/word/2020/wordml/sdtdatahash" xmlns:w16sdtfl="http://schemas.microsoft.com/office/word/2024/wordml/sdtformatlock" xmlns:w16se="http://schemas.microsoft.com/office/word/2015/wordml/symex" xmlns:w16du="http://schemas.microsoft.com/office/word/2023/wordml/word16du" xmlns:wne="http://schemas.microsoft.com/office/word/2006/wordml" mc:Ignorable="w14 w15 w16se w16cid w16 w16cex w16sdtdh w16sdtfl w16du wp14">
   <w:abstractNum w:abstractNumId="0" w15:restartNumberingAfterBreak="0">
     <w:nsid w:val="04F60805"/>
     <w:multiLevelType w:val="hybridMultilevel"/>
@@ -4032,7 +4203,7 @@
       <w:lvlText w:val=""/>
       <w:lvlJc w:val="left"/>
       <w:pPr>
-        <w:ind w:left="720" w:hanging="360"/>
+        <w:ind w:left="360" w:hanging="360"/>
       </w:pPr>
       <w:rPr>
         <w:rFonts w:ascii="Symbol" w:hAnsi="Symbol" w:hint="default"/>
@@ -4044,7 +4215,7 @@
       <w:lvlText w:val="o"/>
       <w:lvlJc w:val="left"/>
       <w:pPr>
-        <w:ind w:left="1440" w:hanging="360"/>
+        <w:ind w:left="1080" w:hanging="360"/>
       </w:pPr>
       <w:rPr>
         <w:rFonts w:ascii="Courier New" w:hAnsi="Courier New" w:cs="Courier New" w:hint="default"/>
@@ -4056,7 +4227,7 @@
       <w:lvlText w:val=""/>
       <w:lvlJc w:val="left"/>
       <w:pPr>
-        <w:ind w:left="2160" w:hanging="360"/>
+        <w:ind w:left="1800" w:hanging="360"/>
       </w:pPr>
       <w:rPr>
         <w:rFonts w:ascii="Wingdings" w:hAnsi="Wingdings" w:hint="default"/>
@@ -4068,7 +4239,7 @@
       <w:lvlText w:val=""/>
       <w:lvlJc w:val="left"/>
       <w:pPr>
-        <w:ind w:left="2880" w:hanging="360"/>
+        <w:ind w:left="2520" w:hanging="360"/>
       </w:pPr>
       <w:rPr>
         <w:rFonts w:ascii="Symbol" w:hAnsi="Symbol" w:hint="default"/>
@@ -4080,7 +4251,7 @@
       <w:lvlText w:val="o"/>
       <w:lvlJc w:val="left"/>
       <w:pPr>
-        <w:ind w:left="3600" w:hanging="360"/>
+        <w:ind w:left="3240" w:hanging="360"/>
       </w:pPr>
       <w:rPr>
         <w:rFonts w:ascii="Courier New" w:hAnsi="Courier New" w:cs="Courier New" w:hint="default"/>
@@ -4092,7 +4263,7 @@
       <w:lvlText w:val=""/>
       <w:lvlJc w:val="left"/>
       <w:pPr>
-        <w:ind w:left="4320" w:hanging="360"/>
+        <w:ind w:left="3960" w:hanging="360"/>
       </w:pPr>
       <w:rPr>
         <w:rFonts w:ascii="Wingdings" w:hAnsi="Wingdings" w:hint="default"/>
@@ -4104,7 +4275,7 @@
       <w:lvlText w:val=""/>
       <w:lvlJc w:val="left"/>
       <w:pPr>
-        <w:ind w:left="5040" w:hanging="360"/>
+        <w:ind w:left="4680" w:hanging="360"/>
       </w:pPr>
       <w:rPr>
         <w:rFonts w:ascii="Symbol" w:hAnsi="Symbol" w:hint="default"/>
@@ -4116,7 +4287,7 @@
       <w:lvlText w:val="o"/>
       <w:lvlJc w:val="left"/>
       <w:pPr>
-        <w:ind w:left="5760" w:hanging="360"/>
+        <w:ind w:left="5400" w:hanging="360"/>
       </w:pPr>
       <w:rPr>
         <w:rFonts w:ascii="Courier New" w:hAnsi="Courier New" w:cs="Courier New" w:hint="default"/>
@@ -4128,7 +4299,7 @@
       <w:lvlText w:val=""/>
       <w:lvlJc w:val="left"/>
       <w:pPr>
-        <w:ind w:left="6480" w:hanging="360"/>
+        <w:ind w:left="6120" w:hanging="360"/>
       </w:pPr>
       <w:rPr>
         <w:rFonts w:ascii="Wingdings" w:hAnsi="Wingdings" w:hint="default"/>

</xml_diff>

<commit_message>
feat: add all notes into report template
</commit_message>
<xml_diff>
--- a/src/templates/report.docx
+++ b/src/templates/report.docx
@@ -347,19 +347,7 @@
         <w:rPr>
           <w:lang w:val="en-US"/>
         </w:rPr>
-        <w:t>{#heavy_rain_flow_velocit</w:t>
-      </w:r>
-      <w:r>
-        <w:rPr>
-          <w:lang w:val="en-US"/>
-        </w:rPr>
-        <w:t>y_</w:t>
-      </w:r>
-      <w:r>
-        <w:rPr>
-          <w:lang w:val="en-US"/>
-        </w:rPr>
-        <w:t>notes}</w:t>
+        <w:t>{#heavy_rain_flow_velocity_notes}</w:t>
       </w:r>
     </w:p>
     <w:p>
@@ -584,37 +572,90 @@
     <w:p>
       <w:pPr>
         <w:pStyle w:val="BodytextBGI"/>
+        <w:ind w:left="1440"/>
+        <w:rPr>
+          <w:lang w:val="en-US"/>
+        </w:rPr>
+      </w:pPr>
+      <w:r>
+        <w:rPr>
+          <w:lang w:val="en-US"/>
+        </w:rPr>
+        <w:t>{#</w:t>
+      </w:r>
+      <w:r>
+        <w:rPr>
+          <w:b/>
+          <w:bCs/>
+          <w:lang w:val="en-US"/>
+        </w:rPr>
+        <w:t>heat_thermal_load_day</w:t>
+      </w:r>
+      <w:r>
+        <w:rPr>
+          <w:b/>
+          <w:bCs/>
+          <w:lang w:val="en-US"/>
+        </w:rPr>
+        <w:t>_notes</w:t>
+      </w:r>
+      <w:r>
+        <w:rPr>
+          <w:lang w:val="en-US"/>
+        </w:rPr>
+        <w:t>}</w:t>
+      </w:r>
+    </w:p>
+    <w:p>
+      <w:pPr>
+        <w:pStyle w:val="BodytextBGI"/>
         <w:numPr>
-          <w:ilvl w:val="0"/>
+          <w:ilvl w:val="1"/>
           <w:numId w:val="3"/>
         </w:numPr>
       </w:pPr>
       <w:r>
-        <w:t>Hitzebelastung in der Nacht</w:t>
-      </w:r>
-      <w:r>
-        <w:t xml:space="preserve">: </w:t>
-      </w:r>
-      <w:r>
-        <w:rPr>
-          <w:b/>
-          <w:bCs/>
-        </w:rPr>
-        <w:t>{</w:t>
+        <w:t>{.</w:t>
+      </w:r>
+      <w:r>
+        <w:t>}</w:t>
+      </w:r>
+    </w:p>
+    <w:p>
+      <w:pPr>
+        <w:pStyle w:val="BodytextBGI"/>
+        <w:ind w:left="1440"/>
+        <w:rPr>
+          <w:lang w:val="en-US"/>
+        </w:rPr>
+      </w:pPr>
+      <w:r>
+        <w:rPr>
+          <w:lang w:val="en-US"/>
+        </w:rPr>
+        <w:t>{/</w:t>
       </w:r>
       <w:proofErr w:type="spellStart"/>
       <w:r>
         <w:rPr>
           <w:b/>
           <w:bCs/>
-        </w:rPr>
-        <w:t>heat_thermal_load_night</w:t>
+          <w:lang w:val="en-US"/>
+        </w:rPr>
+        <w:t>heat_thermal_load_day</w:t>
+      </w:r>
+      <w:r>
+        <w:rPr>
+          <w:b/>
+          <w:bCs/>
+          <w:lang w:val="en-US"/>
+        </w:rPr>
+        <w:t>_notes</w:t>
       </w:r>
       <w:proofErr w:type="spellEnd"/>
       <w:r>
         <w:rPr>
-          <w:b/>
-          <w:bCs/>
+          <w:lang w:val="en-US"/>
         </w:rPr>
         <w:t>}</w:t>
       </w:r>
@@ -628,7 +669,7 @@
         </w:numPr>
       </w:pPr>
       <w:r>
-        <w:t>Vulnerable Bereiche</w:t>
+        <w:t>Hitzebelastung in der Nacht</w:t>
       </w:r>
       <w:r>
         <w:t xml:space="preserve">: </w:t>
@@ -646,13 +687,104 @@
           <w:b/>
           <w:bCs/>
         </w:rPr>
-        <w:t>heat_vulnerable_areas</w:t>
+        <w:t>heat_thermal_load_night</w:t>
       </w:r>
       <w:proofErr w:type="spellEnd"/>
       <w:r>
         <w:rPr>
           <w:b/>
           <w:bCs/>
+        </w:rPr>
+        <w:t>}</w:t>
+      </w:r>
+    </w:p>
+    <w:p>
+      <w:pPr>
+        <w:pStyle w:val="BodytextBGI"/>
+        <w:ind w:left="1440"/>
+        <w:rPr>
+          <w:lang w:val="en-US"/>
+        </w:rPr>
+      </w:pPr>
+      <w:r>
+        <w:rPr>
+          <w:lang w:val="en-US"/>
+        </w:rPr>
+        <w:t>{#</w:t>
+      </w:r>
+      <w:r>
+        <w:rPr>
+          <w:b/>
+          <w:bCs/>
+          <w:lang w:val="en-US"/>
+        </w:rPr>
+        <w:t>heat_thermal_load_</w:t>
+      </w:r>
+      <w:r>
+        <w:rPr>
+          <w:b/>
+          <w:bCs/>
+          <w:lang w:val="en-US"/>
+        </w:rPr>
+        <w:t>night_notes</w:t>
+      </w:r>
+      <w:r>
+        <w:rPr>
+          <w:lang w:val="en-US"/>
+        </w:rPr>
+        <w:t>}</w:t>
+      </w:r>
+    </w:p>
+    <w:p>
+      <w:pPr>
+        <w:pStyle w:val="BodytextBGI"/>
+        <w:numPr>
+          <w:ilvl w:val="1"/>
+          <w:numId w:val="3"/>
+        </w:numPr>
+      </w:pPr>
+      <w:r>
+        <w:t>{.</w:t>
+      </w:r>
+      <w:r>
+        <w:t>}</w:t>
+      </w:r>
+    </w:p>
+    <w:p>
+      <w:pPr>
+        <w:pStyle w:val="BodytextBGI"/>
+        <w:ind w:left="1440"/>
+        <w:rPr>
+          <w:lang w:val="en-US"/>
+        </w:rPr>
+      </w:pPr>
+      <w:r>
+        <w:rPr>
+          <w:lang w:val="en-US"/>
+        </w:rPr>
+        <w:t>{/</w:t>
+      </w:r>
+      <w:proofErr w:type="spellStart"/>
+      <w:r>
+        <w:rPr>
+          <w:b/>
+          <w:bCs/>
+          <w:lang w:val="en-US"/>
+        </w:rPr>
+        <w:t>heat_thermal_load_</w:t>
+      </w:r>
+      <w:r>
+        <w:rPr>
+          <w:b/>
+          <w:bCs/>
+          <w:lang w:val="en-US"/>
+        </w:rPr>
+        <w:t>night_notes</w:t>
+      </w:r>
+      <w:proofErr w:type="spellEnd"/>
+      <w:r>
+        <w:rPr>
+          <w:lang w:val="en-US"/>
         </w:rPr>
         <w:t>}</w:t>
       </w:r>
@@ -666,7 +798,7 @@
         </w:numPr>
       </w:pPr>
       <w:r>
-        <w:t>Luftaustausch: Kaltluftbahnen &amp; Leitbahnkorridore</w:t>
+        <w:t>Vulnerable Bereiche</w:t>
       </w:r>
       <w:r>
         <w:t xml:space="preserve">: </w:t>
@@ -684,13 +816,102 @@
           <w:b/>
           <w:bCs/>
         </w:rPr>
-        <w:t>heat_cold_air_corridors</w:t>
+        <w:t>heat_vulnerable_areas</w:t>
       </w:r>
       <w:proofErr w:type="spellEnd"/>
       <w:r>
         <w:rPr>
           <w:b/>
           <w:bCs/>
+        </w:rPr>
+        <w:t>}</w:t>
+      </w:r>
+    </w:p>
+    <w:p>
+      <w:pPr>
+        <w:pStyle w:val="BodytextBGI"/>
+        <w:ind w:left="1440"/>
+        <w:rPr>
+          <w:lang w:val="en-US"/>
+        </w:rPr>
+      </w:pPr>
+      <w:r>
+        <w:rPr>
+          <w:lang w:val="en-US"/>
+        </w:rPr>
+        <w:t>{#</w:t>
+      </w:r>
+      <w:proofErr w:type="spellStart"/>
+      <w:r>
+        <w:rPr>
+          <w:b/>
+          <w:bCs/>
+        </w:rPr>
+        <w:t>heat_vulnerable_areas</w:t>
+      </w:r>
+      <w:r>
+        <w:rPr>
+          <w:b/>
+          <w:bCs/>
+        </w:rPr>
+        <w:t>_notes</w:t>
+      </w:r>
+      <w:proofErr w:type="spellEnd"/>
+      <w:r>
+        <w:rPr>
+          <w:lang w:val="en-US"/>
+        </w:rPr>
+        <w:t>}</w:t>
+      </w:r>
+    </w:p>
+    <w:p>
+      <w:pPr>
+        <w:pStyle w:val="BodytextBGI"/>
+        <w:numPr>
+          <w:ilvl w:val="1"/>
+          <w:numId w:val="3"/>
+        </w:numPr>
+      </w:pPr>
+      <w:r>
+        <w:t>{.</w:t>
+      </w:r>
+      <w:r>
+        <w:t>}</w:t>
+      </w:r>
+    </w:p>
+    <w:p>
+      <w:pPr>
+        <w:pStyle w:val="BodytextBGI"/>
+        <w:ind w:left="1440"/>
+        <w:rPr>
+          <w:lang w:val="en-US"/>
+        </w:rPr>
+      </w:pPr>
+      <w:r>
+        <w:rPr>
+          <w:lang w:val="en-US"/>
+        </w:rPr>
+        <w:t>{/</w:t>
+      </w:r>
+      <w:proofErr w:type="spellStart"/>
+      <w:r>
+        <w:rPr>
+          <w:b/>
+          <w:bCs/>
+        </w:rPr>
+        <w:t>heat_vulnerable_areas</w:t>
+      </w:r>
+      <w:r>
+        <w:rPr>
+          <w:b/>
+          <w:bCs/>
+        </w:rPr>
+        <w:t>_notes</w:t>
+      </w:r>
+      <w:proofErr w:type="spellEnd"/>
+      <w:r>
+        <w:rPr>
+          <w:lang w:val="en-US"/>
         </w:rPr>
         <w:t>}</w:t>
       </w:r>
@@ -704,7 +925,7 @@
         </w:numPr>
       </w:pPr>
       <w:r>
-        <w:t>Kaltluftentstehung</w:t>
+        <w:t>Luftaustausch: Kaltluftbahnen &amp; Leitbahnkorridore</w:t>
       </w:r>
       <w:r>
         <w:t xml:space="preserve">: </w:t>
@@ -722,7 +943,7 @@
           <w:b/>
           <w:bCs/>
         </w:rPr>
-        <w:t>heat_cold_air_flow</w:t>
+        <w:t>heat_cold_air_corridors</w:t>
       </w:r>
       <w:proofErr w:type="spellEnd"/>
       <w:r>
@@ -735,10 +956,90 @@
     </w:p>
     <w:p>
       <w:pPr>
-        <w:pStyle w:val="BodyboldBGI"/>
-      </w:pPr>
-      <w:r>
-        <w:t>Versiegelung</w:t>
+        <w:pStyle w:val="BodytextBGI"/>
+        <w:ind w:left="1440"/>
+        <w:rPr>
+          <w:lang w:val="en-US"/>
+        </w:rPr>
+      </w:pPr>
+      <w:r>
+        <w:rPr>
+          <w:lang w:val="en-US"/>
+        </w:rPr>
+        <w:t>{#</w:t>
+      </w:r>
+      <w:r>
+        <w:rPr>
+          <w:b/>
+          <w:bCs/>
+          <w:lang w:val="en-US"/>
+        </w:rPr>
+        <w:t>heat_cold_air_corridors</w:t>
+      </w:r>
+      <w:r>
+        <w:rPr>
+          <w:lang w:val="en-US"/>
+        </w:rPr>
+        <w:t>_notes</w:t>
+      </w:r>
+      <w:r>
+        <w:rPr>
+          <w:lang w:val="en-US"/>
+        </w:rPr>
+        <w:t>}</w:t>
+      </w:r>
+    </w:p>
+    <w:p>
+      <w:pPr>
+        <w:pStyle w:val="BodytextBGI"/>
+        <w:numPr>
+          <w:ilvl w:val="1"/>
+          <w:numId w:val="3"/>
+        </w:numPr>
+      </w:pPr>
+      <w:r>
+        <w:t>{.</w:t>
+      </w:r>
+      <w:r>
+        <w:t>}</w:t>
+      </w:r>
+    </w:p>
+    <w:p>
+      <w:pPr>
+        <w:pStyle w:val="BodytextBGI"/>
+        <w:ind w:left="1440"/>
+        <w:rPr>
+          <w:lang w:val="en-US"/>
+        </w:rPr>
+      </w:pPr>
+      <w:r>
+        <w:rPr>
+          <w:lang w:val="en-US"/>
+        </w:rPr>
+        <w:lastRenderedPageBreak/>
+        <w:t>{/</w:t>
+      </w:r>
+      <w:proofErr w:type="spellStart"/>
+      <w:r>
+        <w:rPr>
+          <w:b/>
+          <w:bCs/>
+          <w:lang w:val="en-US"/>
+        </w:rPr>
+        <w:t>heat_cold_air_corridors</w:t>
+      </w:r>
+      <w:r>
+        <w:rPr>
+          <w:lang w:val="en-US"/>
+        </w:rPr>
+        <w:t>_notes</w:t>
+      </w:r>
+      <w:proofErr w:type="spellEnd"/>
+      <w:r>
+        <w:rPr>
+          <w:lang w:val="en-US"/>
+        </w:rPr>
+        <w:t>}</w:t>
       </w:r>
     </w:p>
     <w:p>
@@ -750,33 +1051,128 @@
         </w:numPr>
       </w:pPr>
       <w:r>
+        <w:t>Kaltluftentstehung</w:t>
+      </w:r>
+      <w:r>
+        <w:t xml:space="preserve">: </w:t>
+      </w:r>
+      <w:r>
+        <w:rPr>
+          <w:b/>
+          <w:bCs/>
+        </w:rPr>
+        <w:t>{</w:t>
+      </w:r>
+      <w:proofErr w:type="spellStart"/>
+      <w:r>
+        <w:rPr>
+          <w:b/>
+          <w:bCs/>
+        </w:rPr>
+        <w:t>heat_cold_air_flow</w:t>
+      </w:r>
+      <w:proofErr w:type="spellEnd"/>
+      <w:r>
+        <w:rPr>
+          <w:b/>
+          <w:bCs/>
+        </w:rPr>
+        <w:t>}</w:t>
+      </w:r>
+    </w:p>
+    <w:p>
+      <w:pPr>
+        <w:pStyle w:val="BodytextBGI"/>
+        <w:ind w:left="1440"/>
+        <w:rPr>
+          <w:lang w:val="en-US"/>
+        </w:rPr>
+      </w:pPr>
+      <w:r>
+        <w:rPr>
+          <w:lang w:val="en-US"/>
+        </w:rPr>
+        <w:t>{#</w:t>
+      </w:r>
+      <w:r>
+        <w:rPr>
+          <w:b/>
+          <w:bCs/>
+          <w:lang w:val="en-US"/>
+        </w:rPr>
+        <w:t>heat_cold_air_flow</w:t>
+      </w:r>
+      <w:r>
+        <w:rPr>
+          <w:lang w:val="en-US"/>
+        </w:rPr>
+        <w:t>_notes</w:t>
+      </w:r>
+      <w:r>
+        <w:rPr>
+          <w:lang w:val="en-US"/>
+        </w:rPr>
+        <w:t>}</w:t>
+      </w:r>
+    </w:p>
+    <w:p>
+      <w:pPr>
+        <w:pStyle w:val="BodytextBGI"/>
+        <w:numPr>
+          <w:ilvl w:val="1"/>
+          <w:numId w:val="3"/>
+        </w:numPr>
+      </w:pPr>
+      <w:r>
+        <w:t>{.</w:t>
+      </w:r>
+      <w:r>
+        <w:t>}</w:t>
+      </w:r>
+    </w:p>
+    <w:p>
+      <w:pPr>
+        <w:pStyle w:val="BodytextBGI"/>
+        <w:ind w:left="1440"/>
+        <w:rPr>
+          <w:lang w:val="en-US"/>
+        </w:rPr>
+      </w:pPr>
+      <w:r>
+        <w:rPr>
+          <w:lang w:val="en-US"/>
+        </w:rPr>
+        <w:t>{/</w:t>
+      </w:r>
+      <w:proofErr w:type="spellStart"/>
+      <w:r>
+        <w:rPr>
+          <w:b/>
+          <w:bCs/>
+          <w:lang w:val="en-US"/>
+        </w:rPr>
+        <w:t>heat_cold_air_flow</w:t>
+      </w:r>
+      <w:r>
+        <w:rPr>
+          <w:lang w:val="en-US"/>
+        </w:rPr>
+        <w:t>_notes</w:t>
+      </w:r>
+      <w:proofErr w:type="spellEnd"/>
+      <w:r>
+        <w:rPr>
+          <w:lang w:val="en-US"/>
+        </w:rPr>
+        <w:t>}</w:t>
+      </w:r>
+    </w:p>
+    <w:p>
+      <w:pPr>
+        <w:pStyle w:val="BodyboldBGI"/>
+      </w:pPr>
+      <w:r>
         <w:t>Versiegelung</w:t>
-      </w:r>
-      <w:r>
-        <w:t xml:space="preserve">: </w:t>
-      </w:r>
-      <w:r>
-        <w:rPr>
-          <w:b/>
-          <w:bCs/>
-        </w:rPr>
-        <w:t>{</w:t>
-      </w:r>
-      <w:proofErr w:type="spellStart"/>
-      <w:r>
-        <w:rPr>
-          <w:b/>
-          <w:bCs/>
-        </w:rPr>
-        <w:t>sealing_block_areas_high</w:t>
-      </w:r>
-      <w:proofErr w:type="spellEnd"/>
-      <w:r>
-        <w:rPr>
-          <w:b/>
-          <w:bCs/>
-        </w:rPr>
-        <w:t>}</w:t>
       </w:r>
     </w:p>
     <w:p>
@@ -786,13 +1182,138 @@
           <w:ilvl w:val="0"/>
           <w:numId w:val="3"/>
         </w:numPr>
-        <w:rPr>
-          <w:lang w:val="en-US"/>
-        </w:rPr>
-      </w:pPr>
+      </w:pPr>
+      <w:r>
+        <w:t>Versiegelung</w:t>
+      </w:r>
+      <w:r>
+        <w:t xml:space="preserve">: </w:t>
+      </w:r>
+      <w:r>
+        <w:rPr>
+          <w:b/>
+          <w:bCs/>
+        </w:rPr>
+        <w:t>{</w:t>
+      </w:r>
       <w:proofErr w:type="spellStart"/>
       <w:r>
         <w:rPr>
+          <w:b/>
+          <w:bCs/>
+        </w:rPr>
+        <w:t>sealing_block_areas_high</w:t>
+      </w:r>
+      <w:proofErr w:type="spellEnd"/>
+      <w:r>
+        <w:rPr>
+          <w:b/>
+          <w:bCs/>
+        </w:rPr>
+        <w:t>}</w:t>
+      </w:r>
+    </w:p>
+    <w:p>
+      <w:pPr>
+        <w:pStyle w:val="BodytextBGI"/>
+        <w:ind w:left="1440"/>
+        <w:rPr>
+          <w:lang w:val="en-US"/>
+        </w:rPr>
+      </w:pPr>
+      <w:r>
+        <w:rPr>
+          <w:lang w:val="en-US"/>
+        </w:rPr>
+        <w:t>{#</w:t>
+      </w:r>
+      <w:r>
+        <w:rPr>
+          <w:b/>
+          <w:bCs/>
+          <w:lang w:val="en-US"/>
+        </w:rPr>
+        <w:t>sealing_block_areas_high</w:t>
+      </w:r>
+      <w:r>
+        <w:rPr>
+          <w:lang w:val="en-US"/>
+        </w:rPr>
+        <w:t>_notes</w:t>
+      </w:r>
+      <w:r>
+        <w:rPr>
+          <w:lang w:val="en-US"/>
+        </w:rPr>
+        <w:t>}</w:t>
+      </w:r>
+    </w:p>
+    <w:p>
+      <w:pPr>
+        <w:pStyle w:val="BodytextBGI"/>
+        <w:numPr>
+          <w:ilvl w:val="1"/>
+          <w:numId w:val="3"/>
+        </w:numPr>
+      </w:pPr>
+      <w:r>
+        <w:t>{.</w:t>
+      </w:r>
+      <w:r>
+        <w:t>}</w:t>
+      </w:r>
+    </w:p>
+    <w:p>
+      <w:pPr>
+        <w:pStyle w:val="BodytextBGI"/>
+        <w:ind w:left="1440"/>
+        <w:rPr>
+          <w:lang w:val="en-US"/>
+        </w:rPr>
+      </w:pPr>
+      <w:r>
+        <w:rPr>
+          <w:lang w:val="en-US"/>
+        </w:rPr>
+        <w:t>{/</w:t>
+      </w:r>
+      <w:proofErr w:type="spellStart"/>
+      <w:r>
+        <w:rPr>
+          <w:b/>
+          <w:bCs/>
+          <w:lang w:val="en-US"/>
+        </w:rPr>
+        <w:t>sealing_block_areas_high</w:t>
+      </w:r>
+      <w:r>
+        <w:rPr>
+          <w:lang w:val="en-US"/>
+        </w:rPr>
+        <w:t>_notes</w:t>
+      </w:r>
+      <w:proofErr w:type="spellEnd"/>
+      <w:r>
+        <w:rPr>
+          <w:lang w:val="en-US"/>
+        </w:rPr>
+        <w:t>}</w:t>
+      </w:r>
+    </w:p>
+    <w:p>
+      <w:pPr>
+        <w:pStyle w:val="BodytextBGI"/>
+        <w:numPr>
+          <w:ilvl w:val="0"/>
+          <w:numId w:val="3"/>
+        </w:numPr>
+        <w:rPr>
+          <w:lang w:val="en-US"/>
+        </w:rPr>
+      </w:pPr>
+      <w:proofErr w:type="spellStart"/>
+      <w:r>
+        <w:rPr>
           <w:lang w:val="en-US"/>
         </w:rPr>
         <w:t>Grünvolumenzahl</w:t>
@@ -826,6 +1347,93 @@
         <w:rPr>
           <w:b/>
           <w:bCs/>
+          <w:lang w:val="en-US"/>
+        </w:rPr>
+        <w:t>}</w:t>
+      </w:r>
+    </w:p>
+    <w:p>
+      <w:pPr>
+        <w:pStyle w:val="BodytextBGI"/>
+        <w:ind w:left="1440"/>
+        <w:rPr>
+          <w:lang w:val="en-US"/>
+        </w:rPr>
+      </w:pPr>
+      <w:r>
+        <w:rPr>
+          <w:lang w:val="en-US"/>
+        </w:rPr>
+        <w:t>{#</w:t>
+      </w:r>
+      <w:r>
+        <w:rPr>
+          <w:b/>
+          <w:bCs/>
+          <w:lang w:val="en-US"/>
+        </w:rPr>
+        <w:t>sealing_green_volume_low</w:t>
+      </w:r>
+      <w:r>
+        <w:rPr>
+          <w:lang w:val="en-US"/>
+        </w:rPr>
+        <w:t>_notes</w:t>
+      </w:r>
+      <w:r>
+        <w:rPr>
+          <w:lang w:val="en-US"/>
+        </w:rPr>
+        <w:t>}</w:t>
+      </w:r>
+    </w:p>
+    <w:p>
+      <w:pPr>
+        <w:pStyle w:val="BodytextBGI"/>
+        <w:numPr>
+          <w:ilvl w:val="1"/>
+          <w:numId w:val="3"/>
+        </w:numPr>
+      </w:pPr>
+      <w:r>
+        <w:t>{.</w:t>
+      </w:r>
+      <w:r>
+        <w:t>}</w:t>
+      </w:r>
+    </w:p>
+    <w:p>
+      <w:pPr>
+        <w:pStyle w:val="BodytextBGI"/>
+        <w:ind w:left="1440"/>
+        <w:rPr>
+          <w:lang w:val="en-US"/>
+        </w:rPr>
+      </w:pPr>
+      <w:r>
+        <w:rPr>
+          <w:lang w:val="en-US"/>
+        </w:rPr>
+        <w:t>{/</w:t>
+      </w:r>
+      <w:proofErr w:type="spellStart"/>
+      <w:r>
+        <w:rPr>
+          <w:b/>
+          <w:bCs/>
+          <w:lang w:val="en-US"/>
+        </w:rPr>
+        <w:t>sealing_green_volume_low</w:t>
+      </w:r>
+      <w:r>
+        <w:rPr>
+          <w:lang w:val="en-US"/>
+        </w:rPr>
+        <w:t>_notes</w:t>
+      </w:r>
+      <w:proofErr w:type="spellEnd"/>
+      <w:r>
+        <w:rPr>
           <w:lang w:val="en-US"/>
         </w:rPr>
         <w:t>}</w:t>
@@ -846,6 +1454,9 @@
           <w:ilvl w:val="0"/>
           <w:numId w:val="5"/>
         </w:numPr>
+        <w:rPr>
+          <w:lang w:val="en-US"/>
+        </w:rPr>
       </w:pPr>
       <w:r>
         <w:t xml:space="preserve">Wasserhaushalt: </w:t>
@@ -870,6 +1481,97 @@
         <w:rPr>
           <w:b/>
           <w:bCs/>
+        </w:rPr>
+        <w:t>}</w:t>
+      </w:r>
+    </w:p>
+    <w:p>
+      <w:pPr>
+        <w:pStyle w:val="BodytextBGI"/>
+        <w:ind w:left="1440"/>
+        <w:rPr>
+          <w:lang w:val="en-US"/>
+        </w:rPr>
+      </w:pPr>
+      <w:r>
+        <w:rPr>
+          <w:lang w:val="en-US"/>
+        </w:rPr>
+        <w:t>{#</w:t>
+      </w:r>
+      <w:r>
+        <w:rPr>
+          <w:b/>
+          <w:bCs/>
+          <w:lang w:val="en-US"/>
+        </w:rPr>
+        <w:t>water_balance_natural_deviation</w:t>
+      </w:r>
+      <w:r>
+        <w:rPr>
+          <w:lang w:val="en-US"/>
+        </w:rPr>
+        <w:t>_notes</w:t>
+      </w:r>
+      <w:r>
+        <w:rPr>
+          <w:lang w:val="en-US"/>
+        </w:rPr>
+        <w:t>}</w:t>
+      </w:r>
+    </w:p>
+    <w:p>
+      <w:pPr>
+        <w:pStyle w:val="BodytextBGI"/>
+        <w:numPr>
+          <w:ilvl w:val="1"/>
+          <w:numId w:val="3"/>
+        </w:numPr>
+      </w:pPr>
+      <w:r>
+        <w:t>{.</w:t>
+      </w:r>
+      <w:r>
+        <w:t>}</w:t>
+      </w:r>
+    </w:p>
+    <w:p>
+      <w:pPr>
+        <w:pStyle w:val="BodytextBGI"/>
+        <w:ind w:left="1440"/>
+        <w:rPr>
+          <w:lang w:val="en-US"/>
+        </w:rPr>
+      </w:pPr>
+      <w:r>
+        <w:rPr>
+          <w:lang w:val="en-US"/>
+        </w:rPr>
+        <w:t>{/</w:t>
+      </w:r>
+      <w:proofErr w:type="spellStart"/>
+      <w:r>
+        <w:rPr>
+          <w:b/>
+          <w:bCs/>
+          <w:lang w:val="en-US"/>
+        </w:rPr>
+        <w:t>water_balance_natural_deviation</w:t>
+      </w:r>
+      <w:r>
+        <w:rPr>
+          <w:b/>
+          <w:bCs/>
+          <w:lang w:val="en-US"/>
+        </w:rPr>
+        <w:t>_notes</w:t>
+      </w:r>
+      <w:proofErr w:type="spellEnd"/>
+      <w:r>
+        <w:rPr>
+          <w:b/>
+          <w:bCs/>
+          <w:lang w:val="en-US"/>
         </w:rPr>
         <w:t>}</w:t>
       </w:r>
@@ -923,37 +1625,90 @@
     <w:p>
       <w:pPr>
         <w:pStyle w:val="BodytextBGI"/>
+        <w:ind w:left="1440"/>
+        <w:rPr>
+          <w:lang w:val="en-US"/>
+        </w:rPr>
+      </w:pPr>
+      <w:r>
+        <w:rPr>
+          <w:lang w:val="en-US"/>
+        </w:rPr>
+        <w:t>{#</w:t>
+      </w:r>
+      <w:r>
+        <w:rPr>
+          <w:b/>
+          <w:bCs/>
+          <w:lang w:val="en-US"/>
+        </w:rPr>
+        <w:t>water_protection_sewer_type</w:t>
+      </w:r>
+      <w:r>
+        <w:rPr>
+          <w:lang w:val="en-US"/>
+        </w:rPr>
+        <w:t>_notes</w:t>
+      </w:r>
+      <w:r>
+        <w:rPr>
+          <w:lang w:val="en-US"/>
+        </w:rPr>
+        <w:t>}</w:t>
+      </w:r>
+    </w:p>
+    <w:p>
+      <w:pPr>
+        <w:pStyle w:val="BodytextBGI"/>
         <w:numPr>
-          <w:ilvl w:val="0"/>
-          <w:numId w:val="5"/>
+          <w:ilvl w:val="1"/>
+          <w:numId w:val="3"/>
         </w:numPr>
       </w:pPr>
       <w:r>
-        <w:t>Erstaufnehmendes Gewässer im Einzugsbereich der Trennkanalisation</w:t>
-      </w:r>
-      <w:r>
-        <w:t xml:space="preserve">: </w:t>
-      </w:r>
-      <w:r>
-        <w:rPr>
-          <w:b/>
-          <w:bCs/>
-        </w:rPr>
-        <w:t>{</w:t>
+        <w:t>{.</w:t>
+      </w:r>
+      <w:r>
+        <w:t>}</w:t>
+      </w:r>
+    </w:p>
+    <w:p>
+      <w:pPr>
+        <w:pStyle w:val="BodytextBGI"/>
+        <w:ind w:left="1440"/>
+        <w:rPr>
+          <w:lang w:val="en-US"/>
+        </w:rPr>
+      </w:pPr>
+      <w:r>
+        <w:rPr>
+          <w:lang w:val="en-US"/>
+        </w:rPr>
+        <w:t>{/</w:t>
       </w:r>
       <w:proofErr w:type="spellStart"/>
       <w:r>
         <w:rPr>
           <w:b/>
           <w:bCs/>
-        </w:rPr>
-        <w:t>water_protection_decoupling_requirements</w:t>
+          <w:lang w:val="en-US"/>
+        </w:rPr>
+        <w:t>water_protection_sewer_type</w:t>
+      </w:r>
+      <w:r>
+        <w:rPr>
+          <w:b/>
+          <w:bCs/>
+          <w:lang w:val="en-US"/>
+        </w:rPr>
+        <w:t>_notes</w:t>
       </w:r>
       <w:proofErr w:type="spellEnd"/>
       <w:r>
         <w:rPr>
           <w:b/>
           <w:bCs/>
+          <w:lang w:val="en-US"/>
         </w:rPr>
         <w:t>}</w:t>
       </w:r>
@@ -965,13 +1720,143 @@
           <w:ilvl w:val="0"/>
           <w:numId w:val="5"/>
         </w:numPr>
-        <w:rPr>
-          <w:lang w:val="en-US"/>
-        </w:rPr>
-      </w:pPr>
+      </w:pPr>
+      <w:r>
+        <w:t>Erstaufnehmendes Gewässer im Einzugsbereich der Trennkanalisation</w:t>
+      </w:r>
+      <w:r>
+        <w:t xml:space="preserve">: </w:t>
+      </w:r>
+      <w:r>
+        <w:rPr>
+          <w:b/>
+          <w:bCs/>
+        </w:rPr>
+        <w:t>{</w:t>
+      </w:r>
       <w:proofErr w:type="spellStart"/>
       <w:r>
         <w:rPr>
+          <w:b/>
+          <w:bCs/>
+        </w:rPr>
+        <w:t>water_protection_decoupling_requirements</w:t>
+      </w:r>
+      <w:proofErr w:type="spellEnd"/>
+      <w:r>
+        <w:rPr>
+          <w:b/>
+          <w:bCs/>
+        </w:rPr>
+        <w:t>}</w:t>
+      </w:r>
+    </w:p>
+    <w:p>
+      <w:pPr>
+        <w:pStyle w:val="BodytextBGI"/>
+        <w:ind w:left="1440"/>
+        <w:rPr>
+          <w:lang w:val="en-US"/>
+        </w:rPr>
+      </w:pPr>
+      <w:r>
+        <w:rPr>
+          <w:lang w:val="en-US"/>
+        </w:rPr>
+        <w:t>{#</w:t>
+      </w:r>
+      <w:r>
+        <w:rPr>
+          <w:b/>
+          <w:bCs/>
+          <w:lang w:val="en-US"/>
+        </w:rPr>
+        <w:t>water_protection_decoupling_requirements</w:t>
+      </w:r>
+      <w:r>
+        <w:rPr>
+          <w:lang w:val="en-US"/>
+        </w:rPr>
+        <w:t>_notes</w:t>
+      </w:r>
+      <w:r>
+        <w:rPr>
+          <w:lang w:val="en-US"/>
+        </w:rPr>
+        <w:t>}</w:t>
+      </w:r>
+    </w:p>
+    <w:p>
+      <w:pPr>
+        <w:pStyle w:val="BodytextBGI"/>
+        <w:numPr>
+          <w:ilvl w:val="1"/>
+          <w:numId w:val="3"/>
+        </w:numPr>
+      </w:pPr>
+      <w:r>
+        <w:lastRenderedPageBreak/>
+        <w:t>{.</w:t>
+      </w:r>
+      <w:r>
+        <w:t>}</w:t>
+      </w:r>
+    </w:p>
+    <w:p>
+      <w:pPr>
+        <w:pStyle w:val="BodytextBGI"/>
+        <w:ind w:left="1440"/>
+        <w:rPr>
+          <w:lang w:val="en-US"/>
+        </w:rPr>
+      </w:pPr>
+      <w:r>
+        <w:rPr>
+          <w:lang w:val="en-US"/>
+        </w:rPr>
+        <w:t>{/</w:t>
+      </w:r>
+      <w:proofErr w:type="spellStart"/>
+      <w:r>
+        <w:rPr>
+          <w:b/>
+          <w:bCs/>
+          <w:lang w:val="en-US"/>
+        </w:rPr>
+        <w:t>water_protection_decoupling_requirements</w:t>
+      </w:r>
+      <w:r>
+        <w:rPr>
+          <w:b/>
+          <w:bCs/>
+          <w:lang w:val="en-US"/>
+        </w:rPr>
+        <w:t>_notes</w:t>
+      </w:r>
+      <w:proofErr w:type="spellEnd"/>
+      <w:r>
+        <w:rPr>
+          <w:b/>
+          <w:bCs/>
+          <w:lang w:val="en-US"/>
+        </w:rPr>
+        <w:t>}</w:t>
+      </w:r>
+    </w:p>
+    <w:p>
+      <w:pPr>
+        <w:pStyle w:val="BodytextBGI"/>
+        <w:numPr>
+          <w:ilvl w:val="0"/>
+          <w:numId w:val="5"/>
+        </w:numPr>
+        <w:rPr>
+          <w:lang w:val="en-US"/>
+        </w:rPr>
+      </w:pPr>
+      <w:proofErr w:type="spellStart"/>
+      <w:r>
+        <w:rPr>
           <w:lang w:val="en-US"/>
         </w:rPr>
         <w:t>Kleingewässer</w:t>
@@ -999,6 +1884,97 @@
           <w:lang w:val="en-US"/>
         </w:rPr>
         <w:t>water_protection_small_waters_demand</w:t>
+      </w:r>
+      <w:proofErr w:type="spellEnd"/>
+      <w:r>
+        <w:rPr>
+          <w:b/>
+          <w:bCs/>
+          <w:lang w:val="en-US"/>
+        </w:rPr>
+        <w:t>}</w:t>
+      </w:r>
+    </w:p>
+    <w:p>
+      <w:pPr>
+        <w:pStyle w:val="BodytextBGI"/>
+        <w:ind w:left="1440"/>
+        <w:rPr>
+          <w:lang w:val="en-US"/>
+        </w:rPr>
+      </w:pPr>
+      <w:r>
+        <w:rPr>
+          <w:lang w:val="en-US"/>
+        </w:rPr>
+        <w:t>{#</w:t>
+      </w:r>
+      <w:r>
+        <w:rPr>
+          <w:b/>
+          <w:bCs/>
+          <w:lang w:val="en-US"/>
+        </w:rPr>
+        <w:t>water_protection_small_waters_demand</w:t>
+      </w:r>
+      <w:r>
+        <w:rPr>
+          <w:lang w:val="en-US"/>
+        </w:rPr>
+        <w:t>_notes</w:t>
+      </w:r>
+      <w:r>
+        <w:rPr>
+          <w:lang w:val="en-US"/>
+        </w:rPr>
+        <w:t>}</w:t>
+      </w:r>
+    </w:p>
+    <w:p>
+      <w:pPr>
+        <w:pStyle w:val="BodytextBGI"/>
+        <w:numPr>
+          <w:ilvl w:val="1"/>
+          <w:numId w:val="3"/>
+        </w:numPr>
+      </w:pPr>
+      <w:r>
+        <w:t>{.</w:t>
+      </w:r>
+      <w:r>
+        <w:t>}</w:t>
+      </w:r>
+    </w:p>
+    <w:p>
+      <w:pPr>
+        <w:pStyle w:val="BodytextBGI"/>
+        <w:ind w:left="1440"/>
+        <w:rPr>
+          <w:lang w:val="en-US"/>
+        </w:rPr>
+      </w:pPr>
+      <w:r>
+        <w:rPr>
+          <w:lang w:val="en-US"/>
+        </w:rPr>
+        <w:t>{/</w:t>
+      </w:r>
+      <w:proofErr w:type="spellStart"/>
+      <w:r>
+        <w:rPr>
+          <w:b/>
+          <w:bCs/>
+          <w:lang w:val="en-US"/>
+        </w:rPr>
+        <w:t>water_protection_small_waters_demand</w:t>
+      </w:r>
+      <w:r>
+        <w:rPr>
+          <w:b/>
+          <w:bCs/>
+          <w:lang w:val="en-US"/>
+        </w:rPr>
+        <w:t>_notes</w:t>
       </w:r>
       <w:proofErr w:type="spellEnd"/>
       <w:r>
@@ -3611,160 +4587,74 @@
           <w:rFonts w:ascii="Arthouse Owned Medium" w:hAnsi="Arthouse Owned Medium"/>
           <w:sz w:val="48"/>
           <w:szCs w:val="48"/>
-          <w:lang w:val="en-US"/>
-        </w:rPr>
-      </w:pPr>
-      <w:proofErr w:type="spellStart"/>
+        </w:rPr>
+      </w:pPr>
       <w:r>
         <w:rPr>
           <w:rFonts w:ascii="Arthouse Owned Medium" w:hAnsi="Arthouse Owned Medium"/>
           <w:sz w:val="48"/>
           <w:szCs w:val="48"/>
-          <w:lang w:val="en-US"/>
         </w:rPr>
         <w:lastRenderedPageBreak/>
-        <w:t>Effektbewertung</w:t>
+        <w:t>Effektbewertung Gewässerschutz</w:t>
+      </w:r>
+    </w:p>
+    <w:p>
+      <w:pPr>
+        <w:rPr>
+          <w:rFonts w:ascii="Arthouse Owned Medium" w:hAnsi="Arthouse Owned Medium"/>
+        </w:rPr>
+      </w:pPr>
+      <w:r>
+        <w:rPr>
+          <w:rFonts w:ascii="Arthouse Owned Medium" w:hAnsi="Arthouse Owned Medium"/>
+        </w:rPr>
+        <w:t>{%</w:t>
+      </w:r>
+      <w:proofErr w:type="spellStart"/>
+      <w:r>
+        <w:rPr>
+          <w:rFonts w:ascii="Arthouse Owned Medium" w:hAnsi="Arthouse Owned Medium"/>
+        </w:rPr>
+        <w:t>plot_critical_hours</w:t>
       </w:r>
       <w:proofErr w:type="spellEnd"/>
       <w:r>
         <w:rPr>
           <w:rFonts w:ascii="Arthouse Owned Medium" w:hAnsi="Arthouse Owned Medium"/>
-          <w:sz w:val="48"/>
-          <w:szCs w:val="48"/>
-          <w:lang w:val="en-US"/>
-        </w:rPr>
-        <w:t xml:space="preserve"> </w:t>
+        </w:rPr>
+        <w:t>}</w:t>
+      </w:r>
+    </w:p>
+    <w:p>
+      <w:pPr>
+        <w:rPr>
+          <w:rFonts w:ascii="Arthouse Owned Medium" w:hAnsi="Arthouse Owned Medium"/>
+          <w:lang w:val="en-US"/>
+        </w:rPr>
+      </w:pPr>
+      <w:r>
+        <w:rPr>
+          <w:rFonts w:ascii="Arthouse Owned Medium" w:hAnsi="Arthouse Owned Medium"/>
+          <w:lang w:val="en-US"/>
+        </w:rPr>
+        <w:t>{%</w:t>
       </w:r>
       <w:proofErr w:type="spellStart"/>
       <w:r>
         <w:rPr>
           <w:rFonts w:ascii="Arthouse Owned Medium" w:hAnsi="Arthouse Owned Medium"/>
-          <w:sz w:val="48"/>
-          <w:szCs w:val="48"/>
-          <w:lang w:val="en-US"/>
-        </w:rPr>
-        <w:t>Gewässerschutz</w:t>
+          <w:lang w:val="en-US"/>
+        </w:rPr>
+        <w:t>plot_critical_events</w:t>
       </w:r>
       <w:proofErr w:type="spellEnd"/>
-    </w:p>
-    <w:p>
-      <w:pPr>
+      <w:r>
         <w:rPr>
           <w:rFonts w:ascii="Arthouse Owned Medium" w:hAnsi="Arthouse Owned Medium"/>
           <w:lang w:val="en-US"/>
         </w:rPr>
-      </w:pPr>
-      <w:r>
-        <w:rPr>
-          <w:rFonts w:ascii="Arthouse Owned Medium" w:hAnsi="Arthouse Owned Medium"/>
-          <w:lang w:val="en-US"/>
-        </w:rPr>
-        <w:t>{%</w:t>
-      </w:r>
-      <w:proofErr w:type="spellStart"/>
-      <w:r>
-        <w:rPr>
-          <w:rFonts w:ascii="Arthouse Owned Medium" w:hAnsi="Arthouse Owned Medium"/>
-          <w:lang w:val="en-US"/>
-        </w:rPr>
-        <w:t>plot_critical_hours</w:t>
-      </w:r>
-      <w:proofErr w:type="spellEnd"/>
-      <w:r>
-        <w:rPr>
-          <w:rFonts w:ascii="Arthouse Owned Medium" w:hAnsi="Arthouse Owned Medium"/>
-          <w:lang w:val="en-US"/>
-        </w:rPr>
         <w:t>}</w:t>
-      </w:r>
-    </w:p>
-    <w:p>
-      <w:pPr>
-        <w:rPr>
-          <w:rFonts w:ascii="Arthouse Owned Medium" w:hAnsi="Arthouse Owned Medium"/>
-          <w:lang w:val="en-US"/>
-        </w:rPr>
-      </w:pPr>
-      <w:r>
-        <w:rPr>
-          <w:rFonts w:ascii="Arthouse Owned Medium" w:hAnsi="Arthouse Owned Medium"/>
-          <w:lang w:val="en-US"/>
-        </w:rPr>
-        <w:t>{%</w:t>
-      </w:r>
-      <w:proofErr w:type="spellStart"/>
-      <w:r>
-        <w:rPr>
-          <w:rFonts w:ascii="Arthouse Owned Medium" w:hAnsi="Arthouse Owned Medium"/>
-          <w:lang w:val="en-US"/>
-        </w:rPr>
-        <w:t>plot_critical_events</w:t>
-      </w:r>
-      <w:proofErr w:type="spellEnd"/>
-      <w:r>
-        <w:rPr>
-          <w:rFonts w:ascii="Arthouse Owned Medium" w:hAnsi="Arthouse Owned Medium"/>
-          <w:lang w:val="en-US"/>
-        </w:rPr>
-        <w:t>}</w:t>
-      </w:r>
-    </w:p>
-    <w:p>
-      <w:pPr>
-        <w:rPr>
-          <w:rFonts w:ascii="Arthouse Owned Medium" w:hAnsi="Arthouse Owned Medium"/>
-          <w:sz w:val="48"/>
-          <w:szCs w:val="48"/>
-        </w:rPr>
-      </w:pPr>
-      <w:r>
-        <w:rPr>
-          <w:rFonts w:ascii="Arthouse Owned Medium" w:hAnsi="Arthouse Owned Medium"/>
-          <w:lang w:val="en-US"/>
-        </w:rPr>
-        <w:br w:type="page"/>
-      </w:r>
-      <w:r>
-        <w:rPr>
-          <w:sz w:val="48"/>
-          <w:szCs w:val="48"/>
-        </w:rPr>
-        <w:lastRenderedPageBreak/>
-        <w:t>Notizen</w:t>
-      </w:r>
-    </w:p>
-    <w:p>
-      <w:pPr>
-        <w:spacing w:line="240" w:lineRule="auto"/>
-        <w:rPr>
-          <w:rFonts w:ascii="Arthouse Owned Medium" w:hAnsi="Arthouse Owned Medium"/>
-        </w:rPr>
-      </w:pPr>
-      <w:r>
-        <w:rPr>
-          <w:rFonts w:ascii="Arthouse Owned Medium" w:hAnsi="Arthouse Owned Medium"/>
-        </w:rPr>
-        <w:tab/>
-        <w:t>{#notes}</w:t>
-      </w:r>
-    </w:p>
-    <w:p>
-      <w:pPr>
-        <w:pStyle w:val="ListParagraph"/>
-        <w:numPr>
-          <w:ilvl w:val="0"/>
-          <w:numId w:val="7"/>
-        </w:numPr>
-        <w:spacing w:line="240" w:lineRule="auto"/>
-        <w:rPr>
-          <w:rFonts w:ascii="Arthouse Owned Medium" w:hAnsi="Arthouse Owned Medium"/>
-        </w:rPr>
-      </w:pPr>
-      <w:r>
-        <w:rPr>
-          <w:rFonts w:ascii="Arthouse Owned Medium" w:hAnsi="Arthouse Owned Medium"/>
-        </w:rPr>
-        <w:t>{.}</w:t>
       </w:r>
     </w:p>
     <w:p>
@@ -3775,26 +4665,6 @@
           <w:rFonts w:ascii="Arthouse Owned Medium" w:hAnsi="Arthouse Owned Medium"/>
         </w:rPr>
       </w:pPr>
-      <w:r>
-        <w:rPr>
-          <w:rFonts w:ascii="Arthouse Owned Medium" w:hAnsi="Arthouse Owned Medium"/>
-        </w:rPr>
-        <w:t>{/</w:t>
-      </w:r>
-      <w:proofErr w:type="spellStart"/>
-      <w:r>
-        <w:rPr>
-          <w:rFonts w:ascii="Arthouse Owned Medium" w:hAnsi="Arthouse Owned Medium"/>
-        </w:rPr>
-        <w:t>notes</w:t>
-      </w:r>
-      <w:proofErr w:type="spellEnd"/>
-      <w:r>
-        <w:rPr>
-          <w:rFonts w:ascii="Arthouse Owned Medium" w:hAnsi="Arthouse Owned Medium"/>
-        </w:rPr>
-        <w:t>}</w:t>
-      </w:r>
     </w:p>
     <w:sectPr>
       <w:headerReference w:type="default" r:id="rId8"/>

</xml_diff>

<commit_message>
feat: add missing notes into report template
</commit_message>
<xml_diff>
--- a/src/templates/report.docx
+++ b/src/templates/report.docx
@@ -10,28 +10,18 @@
           <w:lang w:val="en-US"/>
         </w:rPr>
       </w:pPr>
-      <w:proofErr w:type="spellStart"/>
-      <w:r>
-        <w:rPr>
-          <w:lang w:val="en-US"/>
-        </w:rPr>
-        <w:t>Projektart</w:t>
-      </w:r>
-      <w:proofErr w:type="spellEnd"/>
-      <w:r>
-        <w:rPr>
-          <w:lang w:val="en-US"/>
-        </w:rPr>
-        <w:t>: {</w:t>
-      </w:r>
-      <w:proofErr w:type="spellStart"/>
+      <w:r>
+        <w:rPr>
+          <w:lang w:val="en-US"/>
+        </w:rPr>
+        <w:t>Projektart: {</w:t>
+      </w:r>
       <w:r>
         <w:rPr>
           <w:lang w:val="en-US"/>
         </w:rPr>
         <w:t>use_case</w:t>
       </w:r>
-      <w:proofErr w:type="spellEnd"/>
       <w:r>
         <w:rPr>
           <w:lang w:val="en-US"/>
@@ -316,23 +306,7 @@
           <w:b/>
           <w:bCs/>
         </w:rPr>
-        <w:t>{</w:t>
-      </w:r>
-      <w:proofErr w:type="spellStart"/>
-      <w:r>
-        <w:rPr>
-          <w:b/>
-          <w:bCs/>
-        </w:rPr>
-        <w:t>heavy_rain_flow_velocity</w:t>
-      </w:r>
-      <w:proofErr w:type="spellEnd"/>
-      <w:r>
-        <w:rPr>
-          <w:b/>
-          <w:bCs/>
-        </w:rPr>
-        <w:t>}</w:t>
+        <w:t>{heavy_rain_flow_velocity}</w:t>
       </w:r>
     </w:p>
     <w:p>
@@ -377,21 +351,7 @@
         <w:rPr>
           <w:lang w:val="en-US"/>
         </w:rPr>
-        <w:t>{/</w:t>
-      </w:r>
-      <w:proofErr w:type="spellStart"/>
-      <w:r>
-        <w:rPr>
-          <w:lang w:val="en-US"/>
-        </w:rPr>
-        <w:t>heavy_rain_flow_velocity_notes</w:t>
-      </w:r>
-      <w:proofErr w:type="spellEnd"/>
-      <w:r>
-        <w:rPr>
-          <w:lang w:val="en-US"/>
-        </w:rPr>
-        <w:t>}</w:t>
+        <w:t>{/heavy_rain_flow_velocity_notes}</w:t>
       </w:r>
     </w:p>
     <w:p>
@@ -405,14 +365,12 @@
           <w:lang w:val="en-US"/>
         </w:rPr>
       </w:pPr>
-      <w:proofErr w:type="spellStart"/>
       <w:r>
         <w:rPr>
           <w:lang w:val="en-US"/>
         </w:rPr>
         <w:t>Feuerwehreinsätze</w:t>
       </w:r>
-      <w:proofErr w:type="spellEnd"/>
       <w:r>
         <w:rPr>
           <w:lang w:val="en-US"/>
@@ -425,25 +383,7 @@
           <w:bCs/>
           <w:lang w:val="en-US"/>
         </w:rPr>
-        <w:t>{</w:t>
-      </w:r>
-      <w:proofErr w:type="spellStart"/>
-      <w:r>
-        <w:rPr>
-          <w:b/>
-          <w:bCs/>
-          <w:lang w:val="en-US"/>
-        </w:rPr>
-        <w:t>heavy_rain_fire_department_incidents</w:t>
-      </w:r>
-      <w:proofErr w:type="spellEnd"/>
-      <w:r>
-        <w:rPr>
-          <w:b/>
-          <w:bCs/>
-          <w:lang w:val="en-US"/>
-        </w:rPr>
-        <w:t>}</w:t>
+        <w:t>{heavy_rain_fire_department_incidents}</w:t>
       </w:r>
     </w:p>
     <w:p>
@@ -502,7 +442,6 @@
         </w:rPr>
         <w:t>{/</w:t>
       </w:r>
-      <w:proofErr w:type="spellStart"/>
       <w:r>
         <w:rPr>
           <w:lang w:val="en-US"/>
@@ -513,14 +452,7 @@
         <w:rPr>
           <w:lang w:val="en-US"/>
         </w:rPr>
-        <w:t>_notes</w:t>
-      </w:r>
-      <w:proofErr w:type="spellEnd"/>
-      <w:r>
-        <w:rPr>
-          <w:lang w:val="en-US"/>
-        </w:rPr>
-        <w:t>}</w:t>
+        <w:t>_notes}</w:t>
       </w:r>
     </w:p>
     <w:p>
@@ -550,23 +482,7 @@
           <w:b/>
           <w:bCs/>
         </w:rPr>
-        <w:t>{</w:t>
-      </w:r>
-      <w:proofErr w:type="spellStart"/>
-      <w:r>
-        <w:rPr>
-          <w:b/>
-          <w:bCs/>
-        </w:rPr>
-        <w:t>heat_thermal_load_day</w:t>
-      </w:r>
-      <w:proofErr w:type="spellEnd"/>
-      <w:r>
-        <w:rPr>
-          <w:b/>
-          <w:bCs/>
-        </w:rPr>
-        <w:t>}</w:t>
+        <w:t>{heat_thermal_load_day}</w:t>
       </w:r>
     </w:p>
     <w:p>
@@ -581,29 +497,7 @@
         <w:rPr>
           <w:lang w:val="en-US"/>
         </w:rPr>
-        <w:t>{#</w:t>
-      </w:r>
-      <w:r>
-        <w:rPr>
-          <w:b/>
-          <w:bCs/>
-          <w:lang w:val="en-US"/>
-        </w:rPr>
-        <w:t>heat_thermal_load_day</w:t>
-      </w:r>
-      <w:r>
-        <w:rPr>
-          <w:b/>
-          <w:bCs/>
-          <w:lang w:val="en-US"/>
-        </w:rPr>
-        <w:t>_notes</w:t>
-      </w:r>
-      <w:r>
-        <w:rPr>
-          <w:lang w:val="en-US"/>
-        </w:rPr>
-        <w:t>}</w:t>
+        <w:t>{#heat_thermal_load_day_notes}</w:t>
       </w:r>
     </w:p>
     <w:p>
@@ -615,10 +509,7 @@
         </w:numPr>
       </w:pPr>
       <w:r>
-        <w:t>{.</w:t>
-      </w:r>
-      <w:r>
-        <w:t>}</w:t>
+        <w:t>{.}</w:t>
       </w:r>
     </w:p>
     <w:p>
@@ -633,31 +524,7 @@
         <w:rPr>
           <w:lang w:val="en-US"/>
         </w:rPr>
-        <w:t>{/</w:t>
-      </w:r>
-      <w:proofErr w:type="spellStart"/>
-      <w:r>
-        <w:rPr>
-          <w:b/>
-          <w:bCs/>
-          <w:lang w:val="en-US"/>
-        </w:rPr>
-        <w:t>heat_thermal_load_day</w:t>
-      </w:r>
-      <w:r>
-        <w:rPr>
-          <w:b/>
-          <w:bCs/>
-          <w:lang w:val="en-US"/>
-        </w:rPr>
-        <w:t>_notes</w:t>
-      </w:r>
-      <w:proofErr w:type="spellEnd"/>
-      <w:r>
-        <w:rPr>
-          <w:lang w:val="en-US"/>
-        </w:rPr>
-        <w:t>}</w:t>
+        <w:t>{/heat_thermal_load_day_notes}</w:t>
       </w:r>
     </w:p>
     <w:p>
@@ -679,23 +546,7 @@
           <w:b/>
           <w:bCs/>
         </w:rPr>
-        <w:t>{</w:t>
-      </w:r>
-      <w:proofErr w:type="spellStart"/>
-      <w:r>
-        <w:rPr>
-          <w:b/>
-          <w:bCs/>
-        </w:rPr>
-        <w:t>heat_thermal_load_night</w:t>
-      </w:r>
-      <w:proofErr w:type="spellEnd"/>
-      <w:r>
-        <w:rPr>
-          <w:b/>
-          <w:bCs/>
-        </w:rPr>
-        <w:t>}</w:t>
+        <w:t>{heat_thermal_load_night}</w:t>
       </w:r>
     </w:p>
     <w:p>
@@ -710,29 +561,7 @@
         <w:rPr>
           <w:lang w:val="en-US"/>
         </w:rPr>
-        <w:t>{#</w:t>
-      </w:r>
-      <w:r>
-        <w:rPr>
-          <w:b/>
-          <w:bCs/>
-          <w:lang w:val="en-US"/>
-        </w:rPr>
-        <w:t>heat_thermal_load_</w:t>
-      </w:r>
-      <w:r>
-        <w:rPr>
-          <w:b/>
-          <w:bCs/>
-          <w:lang w:val="en-US"/>
-        </w:rPr>
-        <w:t>night_notes</w:t>
-      </w:r>
-      <w:r>
-        <w:rPr>
-          <w:lang w:val="en-US"/>
-        </w:rPr>
-        <w:t>}</w:t>
+        <w:t>{#heat_thermal_load_night_notes}</w:t>
       </w:r>
     </w:p>
     <w:p>
@@ -744,10 +573,7 @@
         </w:numPr>
       </w:pPr>
       <w:r>
-        <w:t>{.</w:t>
-      </w:r>
-      <w:r>
-        <w:t>}</w:t>
+        <w:t>{.}</w:t>
       </w:r>
     </w:p>
     <w:p>
@@ -762,31 +588,7 @@
         <w:rPr>
           <w:lang w:val="en-US"/>
         </w:rPr>
-        <w:t>{/</w:t>
-      </w:r>
-      <w:proofErr w:type="spellStart"/>
-      <w:r>
-        <w:rPr>
-          <w:b/>
-          <w:bCs/>
-          <w:lang w:val="en-US"/>
-        </w:rPr>
-        <w:t>heat_thermal_load_</w:t>
-      </w:r>
-      <w:r>
-        <w:rPr>
-          <w:b/>
-          <w:bCs/>
-          <w:lang w:val="en-US"/>
-        </w:rPr>
-        <w:t>night_notes</w:t>
-      </w:r>
-      <w:proofErr w:type="spellEnd"/>
-      <w:r>
-        <w:rPr>
-          <w:lang w:val="en-US"/>
-        </w:rPr>
-        <w:t>}</w:t>
+        <w:t>{/heat_thermal_load_night_notes}</w:t>
       </w:r>
     </w:p>
     <w:p>
@@ -808,23 +610,7 @@
           <w:b/>
           <w:bCs/>
         </w:rPr>
-        <w:t>{</w:t>
-      </w:r>
-      <w:proofErr w:type="spellStart"/>
-      <w:r>
-        <w:rPr>
-          <w:b/>
-          <w:bCs/>
-        </w:rPr>
-        <w:t>heat_vulnerable_areas</w:t>
-      </w:r>
-      <w:proofErr w:type="spellEnd"/>
-      <w:r>
-        <w:rPr>
-          <w:b/>
-          <w:bCs/>
-        </w:rPr>
-        <w:t>}</w:t>
+        <w:t>{heat_vulnerable_areas}</w:t>
       </w:r>
     </w:p>
     <w:p>
@@ -841,22 +627,9 @@
         </w:rPr>
         <w:t>{#</w:t>
       </w:r>
-      <w:proofErr w:type="spellStart"/>
-      <w:r>
-        <w:rPr>
-          <w:b/>
-          <w:bCs/>
-        </w:rPr>
-        <w:t>heat_vulnerable_areas</w:t>
-      </w:r>
-      <w:r>
-        <w:rPr>
-          <w:b/>
-          <w:bCs/>
-        </w:rPr>
-        <w:t>_notes</w:t>
-      </w:r>
-      <w:proofErr w:type="spellEnd"/>
+      <w:r>
+        <w:t>heat_vulnerable_areas_notes</w:t>
+      </w:r>
       <w:r>
         <w:rPr>
           <w:lang w:val="en-US"/>
@@ -873,10 +646,7 @@
         </w:numPr>
       </w:pPr>
       <w:r>
-        <w:t>{.</w:t>
-      </w:r>
-      <w:r>
-        <w:t>}</w:t>
+        <w:t>{.}</w:t>
       </w:r>
     </w:p>
     <w:p>
@@ -893,22 +663,9 @@
         </w:rPr>
         <w:t>{/</w:t>
       </w:r>
-      <w:proofErr w:type="spellStart"/>
-      <w:r>
-        <w:rPr>
-          <w:b/>
-          <w:bCs/>
-        </w:rPr>
-        <w:t>heat_vulnerable_areas</w:t>
-      </w:r>
-      <w:r>
-        <w:rPr>
-          <w:b/>
-          <w:bCs/>
-        </w:rPr>
-        <w:t>_notes</w:t>
-      </w:r>
-      <w:proofErr w:type="spellEnd"/>
+      <w:r>
+        <w:t>heat_vulnerable_areas_notes</w:t>
+      </w:r>
       <w:r>
         <w:rPr>
           <w:lang w:val="en-US"/>
@@ -935,23 +692,7 @@
           <w:b/>
           <w:bCs/>
         </w:rPr>
-        <w:t>{</w:t>
-      </w:r>
-      <w:proofErr w:type="spellStart"/>
-      <w:r>
-        <w:rPr>
-          <w:b/>
-          <w:bCs/>
-        </w:rPr>
-        <w:t>heat_cold_air_corridors</w:t>
-      </w:r>
-      <w:proofErr w:type="spellEnd"/>
-      <w:r>
-        <w:rPr>
-          <w:b/>
-          <w:bCs/>
-        </w:rPr>
-        <w:t>}</w:t>
+        <w:t>{heat_cold_air_corridors}</w:t>
       </w:r>
     </w:p>
     <w:p>
@@ -966,27 +707,7 @@
         <w:rPr>
           <w:lang w:val="en-US"/>
         </w:rPr>
-        <w:t>{#</w:t>
-      </w:r>
-      <w:r>
-        <w:rPr>
-          <w:b/>
-          <w:bCs/>
-          <w:lang w:val="en-US"/>
-        </w:rPr>
-        <w:t>heat_cold_air_corridors</w:t>
-      </w:r>
-      <w:r>
-        <w:rPr>
-          <w:lang w:val="en-US"/>
-        </w:rPr>
-        <w:t>_notes</w:t>
-      </w:r>
-      <w:r>
-        <w:rPr>
-          <w:lang w:val="en-US"/>
-        </w:rPr>
-        <w:t>}</w:t>
+        <w:t>{#heat_cold_air_corridors_notes}</w:t>
       </w:r>
     </w:p>
     <w:p>
@@ -998,10 +719,7 @@
         </w:numPr>
       </w:pPr>
       <w:r>
-        <w:t>{.</w:t>
-      </w:r>
-      <w:r>
-        <w:t>}</w:t>
+        <w:t>{.}</w:t>
       </w:r>
     </w:p>
     <w:p>
@@ -1017,29 +735,7 @@
           <w:lang w:val="en-US"/>
         </w:rPr>
         <w:lastRenderedPageBreak/>
-        <w:t>{/</w:t>
-      </w:r>
-      <w:proofErr w:type="spellStart"/>
-      <w:r>
-        <w:rPr>
-          <w:b/>
-          <w:bCs/>
-          <w:lang w:val="en-US"/>
-        </w:rPr>
-        <w:t>heat_cold_air_corridors</w:t>
-      </w:r>
-      <w:r>
-        <w:rPr>
-          <w:lang w:val="en-US"/>
-        </w:rPr>
-        <w:t>_notes</w:t>
-      </w:r>
-      <w:proofErr w:type="spellEnd"/>
-      <w:r>
-        <w:rPr>
-          <w:lang w:val="en-US"/>
-        </w:rPr>
-        <w:t>}</w:t>
+        <w:t>{/heat_cold_air_corridors_notes}</w:t>
       </w:r>
     </w:p>
     <w:p>
@@ -1061,23 +757,7 @@
           <w:b/>
           <w:bCs/>
         </w:rPr>
-        <w:t>{</w:t>
-      </w:r>
-      <w:proofErr w:type="spellStart"/>
-      <w:r>
-        <w:rPr>
-          <w:b/>
-          <w:bCs/>
-        </w:rPr>
-        <w:t>heat_cold_air_flow</w:t>
-      </w:r>
-      <w:proofErr w:type="spellEnd"/>
-      <w:r>
-        <w:rPr>
-          <w:b/>
-          <w:bCs/>
-        </w:rPr>
-        <w:t>}</w:t>
+        <w:t>{heat_cold_air_flow}</w:t>
       </w:r>
     </w:p>
     <w:p>
@@ -1092,27 +772,7 @@
         <w:rPr>
           <w:lang w:val="en-US"/>
         </w:rPr>
-        <w:t>{#</w:t>
-      </w:r>
-      <w:r>
-        <w:rPr>
-          <w:b/>
-          <w:bCs/>
-          <w:lang w:val="en-US"/>
-        </w:rPr>
-        <w:t>heat_cold_air_flow</w:t>
-      </w:r>
-      <w:r>
-        <w:rPr>
-          <w:lang w:val="en-US"/>
-        </w:rPr>
-        <w:t>_notes</w:t>
-      </w:r>
-      <w:r>
-        <w:rPr>
-          <w:lang w:val="en-US"/>
-        </w:rPr>
-        <w:t>}</w:t>
+        <w:t>{#heat_cold_air_flow_notes}</w:t>
       </w:r>
     </w:p>
     <w:p>
@@ -1124,10 +784,7 @@
         </w:numPr>
       </w:pPr>
       <w:r>
-        <w:t>{.</w:t>
-      </w:r>
-      <w:r>
-        <w:t>}</w:t>
+        <w:t>{.}</w:t>
       </w:r>
     </w:p>
     <w:p>
@@ -1142,29 +799,7 @@
         <w:rPr>
           <w:lang w:val="en-US"/>
         </w:rPr>
-        <w:t>{/</w:t>
-      </w:r>
-      <w:proofErr w:type="spellStart"/>
-      <w:r>
-        <w:rPr>
-          <w:b/>
-          <w:bCs/>
-          <w:lang w:val="en-US"/>
-        </w:rPr>
-        <w:t>heat_cold_air_flow</w:t>
-      </w:r>
-      <w:r>
-        <w:rPr>
-          <w:lang w:val="en-US"/>
-        </w:rPr>
-        <w:t>_notes</w:t>
-      </w:r>
-      <w:proofErr w:type="spellEnd"/>
-      <w:r>
-        <w:rPr>
-          <w:lang w:val="en-US"/>
-        </w:rPr>
-        <w:t>}</w:t>
+        <w:t>{/heat_cold_air_flow_notes}</w:t>
       </w:r>
     </w:p>
     <w:p>
@@ -1194,23 +829,7 @@
           <w:b/>
           <w:bCs/>
         </w:rPr>
-        <w:t>{</w:t>
-      </w:r>
-      <w:proofErr w:type="spellStart"/>
-      <w:r>
-        <w:rPr>
-          <w:b/>
-          <w:bCs/>
-        </w:rPr>
-        <w:t>sealing_block_areas_high</w:t>
-      </w:r>
-      <w:proofErr w:type="spellEnd"/>
-      <w:r>
-        <w:rPr>
-          <w:b/>
-          <w:bCs/>
-        </w:rPr>
-        <w:t>}</w:t>
+        <w:t>{sealing_block_areas_high}</w:t>
       </w:r>
     </w:p>
     <w:p>
@@ -1225,27 +844,7 @@
         <w:rPr>
           <w:lang w:val="en-US"/>
         </w:rPr>
-        <w:t>{#</w:t>
-      </w:r>
-      <w:r>
-        <w:rPr>
-          <w:b/>
-          <w:bCs/>
-          <w:lang w:val="en-US"/>
-        </w:rPr>
-        <w:t>sealing_block_areas_high</w:t>
-      </w:r>
-      <w:r>
-        <w:rPr>
-          <w:lang w:val="en-US"/>
-        </w:rPr>
-        <w:t>_notes</w:t>
-      </w:r>
-      <w:r>
-        <w:rPr>
-          <w:lang w:val="en-US"/>
-        </w:rPr>
-        <w:t>}</w:t>
+        <w:t>{#sealing_block_areas_high_notes}</w:t>
       </w:r>
     </w:p>
     <w:p>
@@ -1257,10 +856,7 @@
         </w:numPr>
       </w:pPr>
       <w:r>
-        <w:t>{.</w:t>
-      </w:r>
-      <w:r>
-        <w:t>}</w:t>
+        <w:t>{.}</w:t>
       </w:r>
     </w:p>
     <w:p>
@@ -1275,29 +871,7 @@
         <w:rPr>
           <w:lang w:val="en-US"/>
         </w:rPr>
-        <w:t>{/</w:t>
-      </w:r>
-      <w:proofErr w:type="spellStart"/>
-      <w:r>
-        <w:rPr>
-          <w:b/>
-          <w:bCs/>
-          <w:lang w:val="en-US"/>
-        </w:rPr>
-        <w:t>sealing_block_areas_high</w:t>
-      </w:r>
-      <w:r>
-        <w:rPr>
-          <w:lang w:val="en-US"/>
-        </w:rPr>
-        <w:t>_notes</w:t>
-      </w:r>
-      <w:proofErr w:type="spellEnd"/>
-      <w:r>
-        <w:rPr>
-          <w:lang w:val="en-US"/>
-        </w:rPr>
-        <w:t>}</w:t>
+        <w:t>{/sealing_block_areas_high_notes}</w:t>
       </w:r>
     </w:p>
     <w:p>
@@ -1311,14 +885,12 @@
           <w:lang w:val="en-US"/>
         </w:rPr>
       </w:pPr>
-      <w:proofErr w:type="spellStart"/>
       <w:r>
         <w:rPr>
           <w:lang w:val="en-US"/>
         </w:rPr>
         <w:t>Grünvolumenzahl</w:t>
       </w:r>
-      <w:proofErr w:type="spellEnd"/>
       <w:r>
         <w:rPr>
           <w:lang w:val="en-US"/>
@@ -1331,25 +903,7 @@
           <w:bCs/>
           <w:lang w:val="en-US"/>
         </w:rPr>
-        <w:t>{</w:t>
-      </w:r>
-      <w:proofErr w:type="spellStart"/>
-      <w:r>
-        <w:rPr>
-          <w:b/>
-          <w:bCs/>
-          <w:lang w:val="en-US"/>
-        </w:rPr>
-        <w:t>sealing_green_volume_low</w:t>
-      </w:r>
-      <w:proofErr w:type="spellEnd"/>
-      <w:r>
-        <w:rPr>
-          <w:b/>
-          <w:bCs/>
-          <w:lang w:val="en-US"/>
-        </w:rPr>
-        <w:t>}</w:t>
+        <w:t>{sealing_green_volume_low}</w:t>
       </w:r>
     </w:p>
     <w:p>
@@ -1364,27 +918,7 @@
         <w:rPr>
           <w:lang w:val="en-US"/>
         </w:rPr>
-        <w:t>{#</w:t>
-      </w:r>
-      <w:r>
-        <w:rPr>
-          <w:b/>
-          <w:bCs/>
-          <w:lang w:val="en-US"/>
-        </w:rPr>
-        <w:t>sealing_green_volume_low</w:t>
-      </w:r>
-      <w:r>
-        <w:rPr>
-          <w:lang w:val="en-US"/>
-        </w:rPr>
-        <w:t>_notes</w:t>
-      </w:r>
-      <w:r>
-        <w:rPr>
-          <w:lang w:val="en-US"/>
-        </w:rPr>
-        <w:t>}</w:t>
+        <w:t>{#sealing_green_volume_low_notes}</w:t>
       </w:r>
     </w:p>
     <w:p>
@@ -1396,10 +930,7 @@
         </w:numPr>
       </w:pPr>
       <w:r>
-        <w:t>{.</w:t>
-      </w:r>
-      <w:r>
-        <w:t>}</w:t>
+        <w:t>{.}</w:t>
       </w:r>
     </w:p>
     <w:p>
@@ -1414,29 +945,7 @@
         <w:rPr>
           <w:lang w:val="en-US"/>
         </w:rPr>
-        <w:t>{/</w:t>
-      </w:r>
-      <w:proofErr w:type="spellStart"/>
-      <w:r>
-        <w:rPr>
-          <w:b/>
-          <w:bCs/>
-          <w:lang w:val="en-US"/>
-        </w:rPr>
-        <w:t>sealing_green_volume_low</w:t>
-      </w:r>
-      <w:r>
-        <w:rPr>
-          <w:lang w:val="en-US"/>
-        </w:rPr>
-        <w:t>_notes</w:t>
-      </w:r>
-      <w:proofErr w:type="spellEnd"/>
-      <w:r>
-        <w:rPr>
-          <w:lang w:val="en-US"/>
-        </w:rPr>
-        <w:t>}</w:t>
+        <w:t>{/sealing_green_volume_low_notes}</w:t>
       </w:r>
     </w:p>
     <w:p>
@@ -1466,23 +975,7 @@
           <w:b/>
           <w:bCs/>
         </w:rPr>
-        <w:t>{</w:t>
-      </w:r>
-      <w:proofErr w:type="spellStart"/>
-      <w:r>
-        <w:rPr>
-          <w:b/>
-          <w:bCs/>
-        </w:rPr>
-        <w:t>water_balance_natural_deviation</w:t>
-      </w:r>
-      <w:proofErr w:type="spellEnd"/>
-      <w:r>
-        <w:rPr>
-          <w:b/>
-          <w:bCs/>
-        </w:rPr>
-        <w:t>}</w:t>
+        <w:t>{water_balance_natural_deviation}</w:t>
       </w:r>
     </w:p>
     <w:p>
@@ -1497,27 +990,7 @@
         <w:rPr>
           <w:lang w:val="en-US"/>
         </w:rPr>
-        <w:t>{#</w:t>
-      </w:r>
-      <w:r>
-        <w:rPr>
-          <w:b/>
-          <w:bCs/>
-          <w:lang w:val="en-US"/>
-        </w:rPr>
-        <w:t>water_balance_natural_deviation</w:t>
-      </w:r>
-      <w:r>
-        <w:rPr>
-          <w:lang w:val="en-US"/>
-        </w:rPr>
-        <w:t>_notes</w:t>
-      </w:r>
-      <w:r>
-        <w:rPr>
-          <w:lang w:val="en-US"/>
-        </w:rPr>
-        <w:t>}</w:t>
+        <w:t>{#water_balance_natural_deviation_notes}</w:t>
       </w:r>
     </w:p>
     <w:p>
@@ -1529,10 +1002,7 @@
         </w:numPr>
       </w:pPr>
       <w:r>
-        <w:t>{.</w:t>
-      </w:r>
-      <w:r>
-        <w:t>}</w:t>
+        <w:t>{.}</w:t>
       </w:r>
     </w:p>
     <w:p>
@@ -1547,33 +1017,7 @@
         <w:rPr>
           <w:lang w:val="en-US"/>
         </w:rPr>
-        <w:t>{/</w:t>
-      </w:r>
-      <w:proofErr w:type="spellStart"/>
-      <w:r>
-        <w:rPr>
-          <w:b/>
-          <w:bCs/>
-          <w:lang w:val="en-US"/>
-        </w:rPr>
-        <w:t>water_balance_natural_deviation</w:t>
-      </w:r>
-      <w:r>
-        <w:rPr>
-          <w:b/>
-          <w:bCs/>
-          <w:lang w:val="en-US"/>
-        </w:rPr>
-        <w:t>_notes</w:t>
-      </w:r>
-      <w:proofErr w:type="spellEnd"/>
-      <w:r>
-        <w:rPr>
-          <w:b/>
-          <w:bCs/>
-          <w:lang w:val="en-US"/>
-        </w:rPr>
-        <w:t>}</w:t>
+        <w:t>{/water_balance_natural_deviation_notes}</w:t>
       </w:r>
     </w:p>
     <w:p>
@@ -1603,23 +1047,7 @@
           <w:b/>
           <w:bCs/>
         </w:rPr>
-        <w:t>{</w:t>
-      </w:r>
-      <w:proofErr w:type="spellStart"/>
-      <w:r>
-        <w:rPr>
-          <w:b/>
-          <w:bCs/>
-        </w:rPr>
-        <w:t>water_protection_sewer_type</w:t>
-      </w:r>
-      <w:proofErr w:type="spellEnd"/>
-      <w:r>
-        <w:rPr>
-          <w:b/>
-          <w:bCs/>
-        </w:rPr>
-        <w:t>}</w:t>
+        <w:t>{water_protection_sewer_type}</w:t>
       </w:r>
     </w:p>
     <w:p>
@@ -1634,27 +1062,7 @@
         <w:rPr>
           <w:lang w:val="en-US"/>
         </w:rPr>
-        <w:t>{#</w:t>
-      </w:r>
-      <w:r>
-        <w:rPr>
-          <w:b/>
-          <w:bCs/>
-          <w:lang w:val="en-US"/>
-        </w:rPr>
-        <w:t>water_protection_sewer_type</w:t>
-      </w:r>
-      <w:r>
-        <w:rPr>
-          <w:lang w:val="en-US"/>
-        </w:rPr>
-        <w:t>_notes</w:t>
-      </w:r>
-      <w:r>
-        <w:rPr>
-          <w:lang w:val="en-US"/>
-        </w:rPr>
-        <w:t>}</w:t>
+        <w:t>{#water_protection_sewer_type_notes}</w:t>
       </w:r>
     </w:p>
     <w:p>
@@ -1666,10 +1074,7 @@
         </w:numPr>
       </w:pPr>
       <w:r>
-        <w:t>{.</w:t>
-      </w:r>
-      <w:r>
-        <w:t>}</w:t>
+        <w:t>{.}</w:t>
       </w:r>
     </w:p>
     <w:p>
@@ -1684,33 +1089,7 @@
         <w:rPr>
           <w:lang w:val="en-US"/>
         </w:rPr>
-        <w:t>{/</w:t>
-      </w:r>
-      <w:proofErr w:type="spellStart"/>
-      <w:r>
-        <w:rPr>
-          <w:b/>
-          <w:bCs/>
-          <w:lang w:val="en-US"/>
-        </w:rPr>
-        <w:t>water_protection_sewer_type</w:t>
-      </w:r>
-      <w:r>
-        <w:rPr>
-          <w:b/>
-          <w:bCs/>
-          <w:lang w:val="en-US"/>
-        </w:rPr>
-        <w:t>_notes</w:t>
-      </w:r>
-      <w:proofErr w:type="spellEnd"/>
-      <w:r>
-        <w:rPr>
-          <w:b/>
-          <w:bCs/>
-          <w:lang w:val="en-US"/>
-        </w:rPr>
-        <w:t>}</w:t>
+        <w:t>{/water_protection_sewer_type_notes}</w:t>
       </w:r>
     </w:p>
     <w:p>
@@ -1732,23 +1111,7 @@
           <w:b/>
           <w:bCs/>
         </w:rPr>
-        <w:t>{</w:t>
-      </w:r>
-      <w:proofErr w:type="spellStart"/>
-      <w:r>
-        <w:rPr>
-          <w:b/>
-          <w:bCs/>
-        </w:rPr>
-        <w:t>water_protection_decoupling_requirements</w:t>
-      </w:r>
-      <w:proofErr w:type="spellEnd"/>
-      <w:r>
-        <w:rPr>
-          <w:b/>
-          <w:bCs/>
-        </w:rPr>
-        <w:t>}</w:t>
+        <w:t>{water_protection_decoupling_requirements}</w:t>
       </w:r>
     </w:p>
     <w:p>
@@ -1763,27 +1126,7 @@
         <w:rPr>
           <w:lang w:val="en-US"/>
         </w:rPr>
-        <w:t>{#</w:t>
-      </w:r>
-      <w:r>
-        <w:rPr>
-          <w:b/>
-          <w:bCs/>
-          <w:lang w:val="en-US"/>
-        </w:rPr>
-        <w:t>water_protection_decoupling_requirements</w:t>
-      </w:r>
-      <w:r>
-        <w:rPr>
-          <w:lang w:val="en-US"/>
-        </w:rPr>
-        <w:t>_notes</w:t>
-      </w:r>
-      <w:r>
-        <w:rPr>
-          <w:lang w:val="en-US"/>
-        </w:rPr>
-        <w:t>}</w:t>
+        <w:t>{#water_protection_decoupling_requirements_notes}</w:t>
       </w:r>
     </w:p>
     <w:p>
@@ -1796,10 +1139,7 @@
       </w:pPr>
       <w:r>
         <w:lastRenderedPageBreak/>
-        <w:t>{.</w:t>
-      </w:r>
-      <w:r>
-        <w:t>}</w:t>
+        <w:t>{.}</w:t>
       </w:r>
     </w:p>
     <w:p>
@@ -1814,33 +1154,7 @@
         <w:rPr>
           <w:lang w:val="en-US"/>
         </w:rPr>
-        <w:t>{/</w:t>
-      </w:r>
-      <w:proofErr w:type="spellStart"/>
-      <w:r>
-        <w:rPr>
-          <w:b/>
-          <w:bCs/>
-          <w:lang w:val="en-US"/>
-        </w:rPr>
-        <w:t>water_protection_decoupling_requirements</w:t>
-      </w:r>
-      <w:r>
-        <w:rPr>
-          <w:b/>
-          <w:bCs/>
-          <w:lang w:val="en-US"/>
-        </w:rPr>
-        <w:t>_notes</w:t>
-      </w:r>
-      <w:proofErr w:type="spellEnd"/>
-      <w:r>
-        <w:rPr>
-          <w:b/>
-          <w:bCs/>
-          <w:lang w:val="en-US"/>
-        </w:rPr>
-        <w:t>}</w:t>
+        <w:t>{/water_protection_decoupling_requirements_notes}</w:t>
       </w:r>
     </w:p>
     <w:p>
@@ -1854,14 +1168,12 @@
           <w:lang w:val="en-US"/>
         </w:rPr>
       </w:pPr>
-      <w:proofErr w:type="spellStart"/>
       <w:r>
         <w:rPr>
           <w:lang w:val="en-US"/>
         </w:rPr>
         <w:t>Kleingewässer</w:t>
       </w:r>
-      <w:proofErr w:type="spellEnd"/>
       <w:r>
         <w:rPr>
           <w:lang w:val="en-US"/>
@@ -1874,25 +1186,7 @@
           <w:bCs/>
           <w:lang w:val="en-US"/>
         </w:rPr>
-        <w:t>{</w:t>
-      </w:r>
-      <w:proofErr w:type="spellStart"/>
-      <w:r>
-        <w:rPr>
-          <w:b/>
-          <w:bCs/>
-          <w:lang w:val="en-US"/>
-        </w:rPr>
-        <w:t>water_protection_small_waters_demand</w:t>
-      </w:r>
-      <w:proofErr w:type="spellEnd"/>
-      <w:r>
-        <w:rPr>
-          <w:b/>
-          <w:bCs/>
-          <w:lang w:val="en-US"/>
-        </w:rPr>
-        <w:t>}</w:t>
+        <w:t>{water_protection_small_waters_demand}</w:t>
       </w:r>
     </w:p>
     <w:p>
@@ -1907,27 +1201,7 @@
         <w:rPr>
           <w:lang w:val="en-US"/>
         </w:rPr>
-        <w:t>{#</w:t>
-      </w:r>
-      <w:r>
-        <w:rPr>
-          <w:b/>
-          <w:bCs/>
-          <w:lang w:val="en-US"/>
-        </w:rPr>
-        <w:t>water_protection_small_waters_demand</w:t>
-      </w:r>
-      <w:r>
-        <w:rPr>
-          <w:lang w:val="en-US"/>
-        </w:rPr>
-        <w:t>_notes</w:t>
-      </w:r>
-      <w:r>
-        <w:rPr>
-          <w:lang w:val="en-US"/>
-        </w:rPr>
-        <w:t>}</w:t>
+        <w:t>{#water_protection_small_waters_demand_notes}</w:t>
       </w:r>
     </w:p>
     <w:p>
@@ -1939,10 +1213,7 @@
         </w:numPr>
       </w:pPr>
       <w:r>
-        <w:t>{.</w:t>
-      </w:r>
-      <w:r>
-        <w:t>}</w:t>
+        <w:t>{.}</w:t>
       </w:r>
     </w:p>
     <w:p>
@@ -1957,33 +1228,7 @@
         <w:rPr>
           <w:lang w:val="en-US"/>
         </w:rPr>
-        <w:t>{/</w:t>
-      </w:r>
-      <w:proofErr w:type="spellStart"/>
-      <w:r>
-        <w:rPr>
-          <w:b/>
-          <w:bCs/>
-          <w:lang w:val="en-US"/>
-        </w:rPr>
-        <w:t>water_protection_small_waters_demand</w:t>
-      </w:r>
-      <w:r>
-        <w:rPr>
-          <w:b/>
-          <w:bCs/>
-          <w:lang w:val="en-US"/>
-        </w:rPr>
-        <w:t>_notes</w:t>
-      </w:r>
-      <w:proofErr w:type="spellEnd"/>
-      <w:r>
-        <w:rPr>
-          <w:b/>
-          <w:bCs/>
-          <w:lang w:val="en-US"/>
-        </w:rPr>
-        <w:t>}</w:t>
+        <w:t>{/water_protection_small_waters_demand_notes}</w:t>
       </w:r>
     </w:p>
     <w:p>
@@ -2034,6 +1279,78 @@
     <w:p>
       <w:pPr>
         <w:pStyle w:val="BodytextBGI"/>
+        <w:ind w:left="1440"/>
+        <w:rPr>
+          <w:lang w:val="en-US"/>
+        </w:rPr>
+      </w:pPr>
+      <w:r>
+        <w:rPr>
+          <w:lang w:val="en-US"/>
+        </w:rPr>
+        <w:t>{#</w:t>
+      </w:r>
+      <w:r>
+        <w:rPr>
+          <w:lang w:val="en-US"/>
+        </w:rPr>
+        <w:t>2</w:t>
+      </w:r>
+      <w:r>
+        <w:rPr>
+          <w:lang w:val="en-US"/>
+        </w:rPr>
+        <w:t>V2</w:t>
+      </w:r>
+      <w:r>
+        <w:rPr>
+          <w:lang w:val="en-US"/>
+        </w:rPr>
+        <w:t>_notes}</w:t>
+      </w:r>
+    </w:p>
+    <w:p>
+      <w:pPr>
+        <w:pStyle w:val="BodytextBGI"/>
+        <w:numPr>
+          <w:ilvl w:val="1"/>
+          <w:numId w:val="3"/>
+        </w:numPr>
+      </w:pPr>
+      <w:r>
+        <w:t>{.}</w:t>
+      </w:r>
+    </w:p>
+    <w:p>
+      <w:pPr>
+        <w:pStyle w:val="BodytextBGI"/>
+        <w:ind w:left="1440"/>
+        <w:rPr>
+          <w:lang w:val="en-US"/>
+        </w:rPr>
+      </w:pPr>
+      <w:r>
+        <w:rPr>
+          <w:lang w:val="en-US"/>
+        </w:rPr>
+        <w:t>{/2</w:t>
+      </w:r>
+      <w:r>
+        <w:rPr>
+          <w:lang w:val="en-US"/>
+        </w:rPr>
+        <w:t>V2</w:t>
+      </w:r>
+      <w:r>
+        <w:rPr>
+          <w:lang w:val="en-US"/>
+        </w:rPr>
+        <w:t>_notes}</w:t>
+      </w:r>
+    </w:p>
+    <w:p>
+      <w:pPr>
+        <w:pStyle w:val="BodytextBGI"/>
         <w:numPr>
           <w:ilvl w:val="0"/>
           <w:numId w:val="6"/>
@@ -2056,6 +1373,72 @@
     <w:p>
       <w:pPr>
         <w:pStyle w:val="BodytextBGI"/>
+        <w:ind w:left="1440"/>
+        <w:rPr>
+          <w:lang w:val="en-US"/>
+        </w:rPr>
+      </w:pPr>
+      <w:r>
+        <w:rPr>
+          <w:lang w:val="en-US"/>
+        </w:rPr>
+        <w:t>{#2V</w:t>
+      </w:r>
+      <w:r>
+        <w:rPr>
+          <w:lang w:val="en-US"/>
+        </w:rPr>
+        <w:t>3</w:t>
+      </w:r>
+      <w:r>
+        <w:rPr>
+          <w:lang w:val="en-US"/>
+        </w:rPr>
+        <w:t>_notes}</w:t>
+      </w:r>
+    </w:p>
+    <w:p>
+      <w:pPr>
+        <w:pStyle w:val="BodytextBGI"/>
+        <w:numPr>
+          <w:ilvl w:val="1"/>
+          <w:numId w:val="3"/>
+        </w:numPr>
+      </w:pPr>
+      <w:r>
+        <w:t>{.}</w:t>
+      </w:r>
+    </w:p>
+    <w:p>
+      <w:pPr>
+        <w:pStyle w:val="BodytextBGI"/>
+        <w:ind w:left="1440"/>
+        <w:rPr>
+          <w:lang w:val="en-US"/>
+        </w:rPr>
+      </w:pPr>
+      <w:r>
+        <w:rPr>
+          <w:lang w:val="en-US"/>
+        </w:rPr>
+        <w:t>{/2V</w:t>
+      </w:r>
+      <w:r>
+        <w:rPr>
+          <w:lang w:val="en-US"/>
+        </w:rPr>
+        <w:t>3</w:t>
+      </w:r>
+      <w:r>
+        <w:rPr>
+          <w:lang w:val="en-US"/>
+        </w:rPr>
+        <w:t>_notes}</w:t>
+      </w:r>
+    </w:p>
+    <w:p>
+      <w:pPr>
+        <w:pStyle w:val="BodytextBGI"/>
         <w:numPr>
           <w:ilvl w:val="0"/>
           <w:numId w:val="6"/>
@@ -2078,6 +1461,84 @@
     <w:p>
       <w:pPr>
         <w:pStyle w:val="BodytextBGI"/>
+        <w:ind w:left="1440"/>
+        <w:rPr>
+          <w:lang w:val="en-US"/>
+        </w:rPr>
+      </w:pPr>
+      <w:r>
+        <w:rPr>
+          <w:lang w:val="en-US"/>
+        </w:rPr>
+        <w:t>{#2</w:t>
+      </w:r>
+      <w:r>
+        <w:rPr>
+          <w:lang w:val="en-US"/>
+        </w:rPr>
+        <w:t>V</w:t>
+      </w:r>
+      <w:r>
+        <w:rPr>
+          <w:lang w:val="en-US"/>
+        </w:rPr>
+        <w:t>4</w:t>
+      </w:r>
+      <w:r>
+        <w:rPr>
+          <w:lang w:val="en-US"/>
+        </w:rPr>
+        <w:t>_notes}</w:t>
+      </w:r>
+    </w:p>
+    <w:p>
+      <w:pPr>
+        <w:pStyle w:val="BodytextBGI"/>
+        <w:numPr>
+          <w:ilvl w:val="1"/>
+          <w:numId w:val="3"/>
+        </w:numPr>
+      </w:pPr>
+      <w:r>
+        <w:t>{.}</w:t>
+      </w:r>
+    </w:p>
+    <w:p>
+      <w:pPr>
+        <w:pStyle w:val="BodytextBGI"/>
+        <w:ind w:left="1440"/>
+        <w:rPr>
+          <w:lang w:val="en-US"/>
+        </w:rPr>
+      </w:pPr>
+      <w:r>
+        <w:rPr>
+          <w:lang w:val="en-US"/>
+        </w:rPr>
+        <w:t>{/2</w:t>
+      </w:r>
+      <w:r>
+        <w:rPr>
+          <w:lang w:val="en-US"/>
+        </w:rPr>
+        <w:t>V</w:t>
+      </w:r>
+      <w:r>
+        <w:rPr>
+          <w:lang w:val="en-US"/>
+        </w:rPr>
+        <w:t>4</w:t>
+      </w:r>
+      <w:r>
+        <w:rPr>
+          <w:lang w:val="en-US"/>
+        </w:rPr>
+        <w:t>_notes}</w:t>
+      </w:r>
+    </w:p>
+    <w:p>
+      <w:pPr>
+        <w:pStyle w:val="BodytextBGI"/>
         <w:numPr>
           <w:ilvl w:val="0"/>
           <w:numId w:val="6"/>
@@ -2107,6 +1568,84 @@
     <w:p>
       <w:pPr>
         <w:pStyle w:val="BodytextBGI"/>
+        <w:ind w:left="1440"/>
+        <w:rPr>
+          <w:lang w:val="en-US"/>
+        </w:rPr>
+      </w:pPr>
+      <w:r>
+        <w:rPr>
+          <w:lang w:val="en-US"/>
+        </w:rPr>
+        <w:t>{#2</w:t>
+      </w:r>
+      <w:r>
+        <w:rPr>
+          <w:lang w:val="en-US"/>
+        </w:rPr>
+        <w:t>V</w:t>
+      </w:r>
+      <w:r>
+        <w:rPr>
+          <w:lang w:val="en-US"/>
+        </w:rPr>
+        <w:t>5</w:t>
+      </w:r>
+      <w:r>
+        <w:rPr>
+          <w:lang w:val="en-US"/>
+        </w:rPr>
+        <w:t>_notes}</w:t>
+      </w:r>
+    </w:p>
+    <w:p>
+      <w:pPr>
+        <w:pStyle w:val="BodytextBGI"/>
+        <w:numPr>
+          <w:ilvl w:val="1"/>
+          <w:numId w:val="3"/>
+        </w:numPr>
+      </w:pPr>
+      <w:r>
+        <w:t>{.}</w:t>
+      </w:r>
+    </w:p>
+    <w:p>
+      <w:pPr>
+        <w:pStyle w:val="BodytextBGI"/>
+        <w:ind w:left="1440"/>
+        <w:rPr>
+          <w:lang w:val="en-US"/>
+        </w:rPr>
+      </w:pPr>
+      <w:r>
+        <w:rPr>
+          <w:lang w:val="en-US"/>
+        </w:rPr>
+        <w:t>{/2</w:t>
+      </w:r>
+      <w:r>
+        <w:rPr>
+          <w:lang w:val="en-US"/>
+        </w:rPr>
+        <w:t>V</w:t>
+      </w:r>
+      <w:r>
+        <w:rPr>
+          <w:lang w:val="en-US"/>
+        </w:rPr>
+        <w:t>5</w:t>
+      </w:r>
+      <w:r>
+        <w:rPr>
+          <w:lang w:val="en-US"/>
+        </w:rPr>
+        <w:t>_notes}</w:t>
+      </w:r>
+    </w:p>
+    <w:p>
+      <w:pPr>
+        <w:pStyle w:val="BodytextBGI"/>
         <w:numPr>
           <w:ilvl w:val="0"/>
           <w:numId w:val="6"/>
@@ -2124,6 +1663,72 @@
           <w:bCs/>
         </w:rPr>
         <w:t>{2B1}</w:t>
+      </w:r>
+    </w:p>
+    <w:p>
+      <w:pPr>
+        <w:pStyle w:val="BodytextBGI"/>
+        <w:ind w:left="1440"/>
+        <w:rPr>
+          <w:lang w:val="en-US"/>
+        </w:rPr>
+      </w:pPr>
+      <w:r>
+        <w:rPr>
+          <w:lang w:val="en-US"/>
+        </w:rPr>
+        <w:t>{#2</w:t>
+      </w:r>
+      <w:r>
+        <w:rPr>
+          <w:lang w:val="en-US"/>
+        </w:rPr>
+        <w:t>B1</w:t>
+      </w:r>
+      <w:r>
+        <w:rPr>
+          <w:lang w:val="en-US"/>
+        </w:rPr>
+        <w:t>_notes}</w:t>
+      </w:r>
+    </w:p>
+    <w:p>
+      <w:pPr>
+        <w:pStyle w:val="BodytextBGI"/>
+        <w:numPr>
+          <w:ilvl w:val="1"/>
+          <w:numId w:val="3"/>
+        </w:numPr>
+      </w:pPr>
+      <w:r>
+        <w:t>{.}</w:t>
+      </w:r>
+    </w:p>
+    <w:p>
+      <w:pPr>
+        <w:pStyle w:val="BodytextBGI"/>
+        <w:ind w:left="1440"/>
+        <w:rPr>
+          <w:lang w:val="en-US"/>
+        </w:rPr>
+      </w:pPr>
+      <w:r>
+        <w:rPr>
+          <w:lang w:val="en-US"/>
+        </w:rPr>
+        <w:t>{/2</w:t>
+      </w:r>
+      <w:r>
+        <w:rPr>
+          <w:lang w:val="en-US"/>
+        </w:rPr>
+        <w:t>B1</w:t>
+      </w:r>
+      <w:r>
+        <w:rPr>
+          <w:lang w:val="en-US"/>
+        </w:rPr>
+        <w:t>_notes}</w:t>
       </w:r>
     </w:p>
     <w:p>
@@ -2294,16 +1899,11 @@
               <w:pStyle w:val="BodytextBGI"/>
             </w:pPr>
             <w:r>
-              <w:t>{</w:t>
-            </w:r>
-            <w:proofErr w:type="spellStart"/>
-            <w:r>
-              <w:t>p</w:t>
+              <w:t>{p</w:t>
             </w:r>
             <w:r>
               <w:t>_green_roof_ext</w:t>
             </w:r>
-            <w:proofErr w:type="spellEnd"/>
             <w:r>
               <w:t>}</w:t>
             </w:r>
@@ -2326,7 +1926,6 @@
               </w:rPr>
               <w:t>{</w:t>
             </w:r>
-            <w:proofErr w:type="spellStart"/>
             <w:r>
               <w:rPr>
                 <w:lang w:val="en-US"/>
@@ -2337,9 +1936,92 @@
               <w:rPr>
                 <w:lang w:val="en-US"/>
               </w:rPr>
-              <w:t>_green_roof_ext</w:t>
-            </w:r>
-            <w:proofErr w:type="spellEnd"/>
+              <w:t>_green_roof_ext}</w:t>
+            </w:r>
+          </w:p>
+        </w:tc>
+      </w:tr>
+      <w:tr>
+        <w:tc>
+          <w:tcPr>
+            <w:tcW w:w="3865" w:type="dxa"/>
+          </w:tcPr>
+          <w:p>
+            <w:pPr>
+              <w:pStyle w:val="BodytextBGI"/>
+            </w:pPr>
+            <w:r>
+              <w:t>Extensive Dachbegrünung</w:t>
+            </w:r>
+          </w:p>
+        </w:tc>
+        <w:tc>
+          <w:tcPr>
+            <w:tcW w:w="1270" w:type="dxa"/>
+          </w:tcPr>
+          <w:p>
+            <w:pPr>
+              <w:pStyle w:val="BodytextBGI"/>
+            </w:pPr>
+            <w:r>
+              <w:t>-</w:t>
+            </w:r>
+          </w:p>
+        </w:tc>
+        <w:tc>
+          <w:tcPr>
+            <w:tcW w:w="2612" w:type="dxa"/>
+          </w:tcPr>
+          <w:p>
+            <w:pPr>
+              <w:pStyle w:val="BodytextBGI"/>
+            </w:pPr>
+            <w:r>
+              <w:t>{p</w:t>
+            </w:r>
+            <w:r>
+              <w:t>_green_roof_int</w:t>
+            </w:r>
+            <w:r>
+              <w:t>}</w:t>
+            </w:r>
+          </w:p>
+        </w:tc>
+        <w:tc>
+          <w:tcPr>
+            <w:tcW w:w="2709" w:type="dxa"/>
+          </w:tcPr>
+          <w:p>
+            <w:pPr>
+              <w:pStyle w:val="BodytextBGI"/>
+              <w:rPr>
+                <w:lang w:val="en-US"/>
+              </w:rPr>
+            </w:pPr>
+            <w:r>
+              <w:rPr>
+                <w:lang w:val="en-US"/>
+              </w:rPr>
+              <w:t>{</w:t>
+            </w:r>
+            <w:r>
+              <w:rPr>
+                <w:lang w:val="en-US"/>
+              </w:rPr>
+              <w:t>ca</w:t>
+            </w:r>
+            <w:r>
+              <w:rPr>
+                <w:lang w:val="en-US"/>
+              </w:rPr>
+              <w:t>_green_roof_</w:t>
+            </w:r>
+            <w:r>
+              <w:rPr>
+                <w:lang w:val="en-US"/>
+              </w:rPr>
+              <w:t>int</w:t>
+            </w:r>
             <w:r>
               <w:rPr>
                 <w:lang w:val="en-US"/>
@@ -2359,7 +2041,7 @@
               <w:pStyle w:val="BodytextBGI"/>
             </w:pPr>
             <w:r>
-              <w:t>Extensive Dachbegrünung</w:t>
+              <w:t>Erdgebundene Fassadenbegrünung</w:t>
             </w:r>
           </w:p>
         </w:tc>
@@ -2385,18 +2067,7 @@
               <w:pStyle w:val="BodytextBGI"/>
             </w:pPr>
             <w:r>
-              <w:t>{</w:t>
-            </w:r>
-            <w:proofErr w:type="spellStart"/>
-            <w:r>
-              <w:t>p</w:t>
-            </w:r>
-            <w:r>
-              <w:t>_green_roof_int</w:t>
-            </w:r>
-            <w:proofErr w:type="spellEnd"/>
-            <w:r>
-              <w:t>}</w:t>
+              <w:t>{p_3G5}</w:t>
             </w:r>
           </w:p>
         </w:tc>
@@ -2407,41 +2078,9 @@
           <w:p>
             <w:pPr>
               <w:pStyle w:val="BodytextBGI"/>
-              <w:rPr>
-                <w:lang w:val="en-US"/>
-              </w:rPr>
-            </w:pPr>
-            <w:r>
-              <w:rPr>
-                <w:lang w:val="en-US"/>
-              </w:rPr>
-              <w:t>{</w:t>
-            </w:r>
-            <w:proofErr w:type="spellStart"/>
-            <w:r>
-              <w:rPr>
-                <w:lang w:val="en-US"/>
-              </w:rPr>
-              <w:t>ca</w:t>
-            </w:r>
-            <w:r>
-              <w:rPr>
-                <w:lang w:val="en-US"/>
-              </w:rPr>
-              <w:t>_green_roof_</w:t>
-            </w:r>
-            <w:r>
-              <w:rPr>
-                <w:lang w:val="en-US"/>
-              </w:rPr>
-              <w:t>int</w:t>
-            </w:r>
-            <w:proofErr w:type="spellEnd"/>
-            <w:r>
-              <w:rPr>
-                <w:lang w:val="en-US"/>
-              </w:rPr>
-              <w:t>}</w:t>
+            </w:pPr>
+            <w:r>
+              <w:t>{ca_3G5}</w:t>
             </w:r>
           </w:p>
         </w:tc>
@@ -2456,7 +2095,7 @@
               <w:pStyle w:val="BodytextBGI"/>
             </w:pPr>
             <w:r>
-              <w:t>Erdgebundene Fassadenbegrünung</w:t>
+              <w:t>Teildurchlässiger Flächenbelag</w:t>
             </w:r>
           </w:p>
         </w:tc>
@@ -2482,72 +2121,13 @@
               <w:pStyle w:val="BodytextBGI"/>
             </w:pPr>
             <w:r>
-              <w:t>{p_3G5}</w:t>
-            </w:r>
-          </w:p>
-        </w:tc>
-        <w:tc>
-          <w:tcPr>
-            <w:tcW w:w="2709" w:type="dxa"/>
-          </w:tcPr>
-          <w:p>
-            <w:pPr>
-              <w:pStyle w:val="BodytextBGI"/>
-            </w:pPr>
-            <w:r>
-              <w:t>{ca_3G5}</w:t>
-            </w:r>
-          </w:p>
-        </w:tc>
-      </w:tr>
-      <w:tr>
-        <w:tc>
-          <w:tcPr>
-            <w:tcW w:w="3865" w:type="dxa"/>
-          </w:tcPr>
-          <w:p>
-            <w:pPr>
-              <w:pStyle w:val="BodytextBGI"/>
-            </w:pPr>
-            <w:r>
-              <w:t>Teildurchlässiger Flächenbelag</w:t>
-            </w:r>
-          </w:p>
-        </w:tc>
-        <w:tc>
-          <w:tcPr>
-            <w:tcW w:w="1270" w:type="dxa"/>
-          </w:tcPr>
-          <w:p>
-            <w:pPr>
-              <w:pStyle w:val="BodytextBGI"/>
-            </w:pPr>
-            <w:r>
-              <w:t>-</w:t>
-            </w:r>
-          </w:p>
-        </w:tc>
-        <w:tc>
-          <w:tcPr>
-            <w:tcW w:w="2612" w:type="dxa"/>
-          </w:tcPr>
-          <w:p>
-            <w:pPr>
-              <w:pStyle w:val="BodytextBGI"/>
-            </w:pPr>
-            <w:r>
               <w:t>{</w:t>
             </w:r>
-            <w:proofErr w:type="spellStart"/>
             <w:r>
               <w:t>p</w:t>
             </w:r>
             <w:r>
-              <w:t>_permeable_paving</w:t>
-            </w:r>
-            <w:proofErr w:type="spellEnd"/>
-            <w:r>
-              <w:t>}</w:t>
+              <w:t>_permeable_paving}</w:t>
             </w:r>
           </w:p>
         </w:tc>
@@ -2565,16 +2145,11 @@
             <w:r>
               <w:t>{</w:t>
             </w:r>
-            <w:proofErr w:type="spellStart"/>
             <w:r>
               <w:t>ca_</w:t>
             </w:r>
             <w:r>
-              <w:t>permeable_paving</w:t>
-            </w:r>
-            <w:proofErr w:type="spellEnd"/>
-            <w:r>
-              <w:t>}</w:t>
+              <w:t>permeable_paving}</w:t>
             </w:r>
           </w:p>
         </w:tc>
@@ -2776,15 +2351,7 @@
               <w:pStyle w:val="BodytextBGI"/>
             </w:pPr>
             <w:r>
-              <w:t>{</w:t>
-            </w:r>
-            <w:proofErr w:type="spellStart"/>
-            <w:r>
-              <w:t>t_n</w:t>
-            </w:r>
-            <w:proofErr w:type="spellEnd"/>
-            <w:r>
-              <w:t>}</w:t>
+              <w:t>{t_n}</w:t>
             </w:r>
           </w:p>
         </w:tc>
@@ -2853,7 +2420,6 @@
             <w:r>
               <w:t>{</w:t>
             </w:r>
-            <w:proofErr w:type="spellStart"/>
             <w:r>
               <w:t>p</w:t>
             </w:r>
@@ -2863,7 +2429,6 @@
             <w:r>
               <w:t>to_swale</w:t>
             </w:r>
-            <w:proofErr w:type="spellEnd"/>
             <w:r>
               <w:t>}</w:t>
             </w:r>
@@ -2880,7 +2445,6 @@
             <w:r>
               <w:t>{</w:t>
             </w:r>
-            <w:proofErr w:type="spellStart"/>
             <w:r>
               <w:t>ca</w:t>
             </w:r>
@@ -2890,7 +2454,6 @@
             <w:r>
               <w:t>to_swale</w:t>
             </w:r>
-            <w:proofErr w:type="spellEnd"/>
             <w:r>
               <w:t>}</w:t>
             </w:r>
@@ -2935,7 +2498,6 @@
             <w:r>
               <w:t>{</w:t>
             </w:r>
-            <w:proofErr w:type="spellStart"/>
             <w:r>
               <w:t>p</w:t>
             </w:r>
@@ -2945,7 +2507,6 @@
             <w:r>
               <w:t>to_surf_infil</w:t>
             </w:r>
-            <w:proofErr w:type="spellEnd"/>
             <w:r>
               <w:t>}</w:t>
             </w:r>
@@ -2962,7 +2523,6 @@
             <w:r>
               <w:t>{</w:t>
             </w:r>
-            <w:proofErr w:type="spellStart"/>
             <w:r>
               <w:t>ca</w:t>
             </w:r>
@@ -2972,7 +2532,6 @@
             <w:r>
               <w:t>to_surf_infil</w:t>
             </w:r>
-            <w:proofErr w:type="spellEnd"/>
             <w:r>
               <w:t>}</w:t>
             </w:r>
@@ -3017,7 +2576,6 @@
             <w:r>
               <w:t>{</w:t>
             </w:r>
-            <w:proofErr w:type="spellStart"/>
             <w:r>
               <w:t>p</w:t>
             </w:r>
@@ -3027,7 +2585,6 @@
             <w:r>
               <w:t>to_swale_trench</w:t>
             </w:r>
-            <w:proofErr w:type="spellEnd"/>
             <w:r>
               <w:t>}</w:t>
             </w:r>
@@ -3044,7 +2601,6 @@
             <w:r>
               <w:t>{</w:t>
             </w:r>
-            <w:proofErr w:type="spellStart"/>
             <w:r>
               <w:t>ca</w:t>
             </w:r>
@@ -3054,7 +2610,6 @@
             <w:r>
               <w:t>to_swale_trench</w:t>
             </w:r>
-            <w:proofErr w:type="spellEnd"/>
             <w:r>
               <w:t>}</w:t>
             </w:r>
@@ -3162,15 +2717,7 @@
               <w:pStyle w:val="BodytextBGI"/>
             </w:pPr>
             <w:r>
-              <w:t>{</w:t>
-            </w:r>
-            <w:proofErr w:type="spellStart"/>
-            <w:r>
-              <w:t>t_o</w:t>
-            </w:r>
-            <w:proofErr w:type="spellEnd"/>
-            <w:r>
-              <w:t>}</w:t>
+              <w:t>{t_o}</w:t>
             </w:r>
           </w:p>
         </w:tc>
@@ -3196,15 +2743,7 @@
               <w:pStyle w:val="BodytextBGI"/>
             </w:pPr>
             <w:r>
-              <w:t>{</w:t>
-            </w:r>
-            <w:proofErr w:type="spellStart"/>
-            <w:r>
-              <w:t>ca_t_o</w:t>
-            </w:r>
-            <w:proofErr w:type="spellEnd"/>
-            <w:r>
-              <w:t>}</w:t>
+              <w:t>{ca_t_o}</w:t>
             </w:r>
           </w:p>
         </w:tc>
@@ -3247,7 +2786,6 @@
             <w:r>
               <w:t>{</w:t>
             </w:r>
-            <w:proofErr w:type="spellStart"/>
             <w:r>
               <w:t>p</w:t>
             </w:r>
@@ -3257,7 +2795,6 @@
             <w:r>
               <w:t>to_trench</w:t>
             </w:r>
-            <w:proofErr w:type="spellEnd"/>
             <w:r>
               <w:t>}</w:t>
             </w:r>
@@ -3274,7 +2811,6 @@
             <w:r>
               <w:t>{</w:t>
             </w:r>
-            <w:proofErr w:type="spellStart"/>
             <w:r>
               <w:t>ca</w:t>
             </w:r>
@@ -3284,7 +2820,6 @@
             <w:r>
               <w:t>to_trench</w:t>
             </w:r>
-            <w:proofErr w:type="spellEnd"/>
             <w:r>
               <w:t>}</w:t>
             </w:r>
@@ -3404,7 +2939,6 @@
             <w:r>
               <w:t>{</w:t>
             </w:r>
-            <w:proofErr w:type="spellStart"/>
             <w:r>
               <w:t>p</w:t>
             </w:r>
@@ -3414,7 +2948,6 @@
             <w:r>
               <w:t>to_cistern</w:t>
             </w:r>
-            <w:proofErr w:type="spellEnd"/>
             <w:r>
               <w:t>}</w:t>
             </w:r>
@@ -3434,14 +2967,12 @@
             <w:r>
               <w:t>{</w:t>
             </w:r>
-            <w:proofErr w:type="spellStart"/>
             <w:r>
               <w:t>ca_</w:t>
             </w:r>
             <w:r>
               <w:t>to_cistern</w:t>
             </w:r>
-            <w:proofErr w:type="spellEnd"/>
             <w:r>
               <w:t>}</w:t>
             </w:r>
@@ -3732,15 +3263,7 @@
               <w:pStyle w:val="BodytextBGI"/>
             </w:pPr>
             <w:r>
-              <w:t>{</w:t>
-            </w:r>
-            <w:proofErr w:type="spellStart"/>
-            <w:r>
-              <w:t>delta_w_status_quo</w:t>
-            </w:r>
-            <w:proofErr w:type="spellEnd"/>
-            <w:r>
-              <w:t>}</w:t>
+              <w:t>{delta_w_status_quo}</w:t>
             </w:r>
           </w:p>
         </w:tc>
@@ -3753,15 +3276,7 @@
               <w:pStyle w:val="BodytextBGI"/>
             </w:pPr>
             <w:r>
-              <w:t>{</w:t>
-            </w:r>
-            <w:proofErr w:type="spellStart"/>
-            <w:r>
-              <w:t>delta_w_with_measures</w:t>
-            </w:r>
-            <w:proofErr w:type="spellEnd"/>
-            <w:r>
-              <w:t>}</w:t>
+              <w:t>{delta_w_with_measures}</w:t>
             </w:r>
           </w:p>
         </w:tc>
@@ -3789,15 +3304,7 @@
               <w:pStyle w:val="BodytextBGI"/>
             </w:pPr>
             <w:r>
-              <w:t>{</w:t>
-            </w:r>
-            <w:proofErr w:type="spellStart"/>
-            <w:r>
-              <w:t>runoff_status_quo</w:t>
-            </w:r>
-            <w:proofErr w:type="spellEnd"/>
-            <w:r>
-              <w:t>}</w:t>
+              <w:t>{runoff_status_quo}</w:t>
             </w:r>
           </w:p>
         </w:tc>
@@ -3810,15 +3317,7 @@
               <w:pStyle w:val="BodytextBGI"/>
             </w:pPr>
             <w:r>
-              <w:t>{</w:t>
-            </w:r>
-            <w:proofErr w:type="spellStart"/>
-            <w:r>
-              <w:t>runoff_with_measures</w:t>
-            </w:r>
-            <w:proofErr w:type="spellEnd"/>
-            <w:r>
-              <w:t>}</w:t>
+              <w:t>{runoff_with_measures}</w:t>
             </w:r>
           </w:p>
         </w:tc>
@@ -3848,16 +3347,11 @@
             <w:r>
               <w:t>{</w:t>
             </w:r>
-            <w:proofErr w:type="spellStart"/>
             <w:r>
               <w:t>infiltr</w:t>
             </w:r>
             <w:r>
-              <w:t>_status_quo</w:t>
-            </w:r>
-            <w:proofErr w:type="spellEnd"/>
-            <w:r>
-              <w:t>}</w:t>
+              <w:t>_status_quo}</w:t>
             </w:r>
           </w:p>
         </w:tc>
@@ -3872,16 +3366,11 @@
             <w:r>
               <w:t>{</w:t>
             </w:r>
-            <w:proofErr w:type="spellStart"/>
             <w:r>
               <w:t>infiltr</w:t>
             </w:r>
             <w:r>
-              <w:t>_with_measures</w:t>
-            </w:r>
-            <w:proofErr w:type="spellEnd"/>
-            <w:r>
-              <w:t>}</w:t>
+              <w:t>_with_measures}</w:t>
             </w:r>
           </w:p>
         </w:tc>
@@ -3911,16 +3400,11 @@
             <w:r>
               <w:t>{</w:t>
             </w:r>
-            <w:proofErr w:type="spellStart"/>
             <w:r>
               <w:t>evapor</w:t>
             </w:r>
             <w:r>
-              <w:t>_status_quo</w:t>
-            </w:r>
-            <w:proofErr w:type="spellEnd"/>
-            <w:r>
-              <w:t>}</w:t>
+              <w:t>_status_quo}</w:t>
             </w:r>
           </w:p>
         </w:tc>
@@ -3935,16 +3419,11 @@
             <w:r>
               <w:t>{</w:t>
             </w:r>
-            <w:proofErr w:type="spellStart"/>
             <w:r>
               <w:t>evapor</w:t>
             </w:r>
             <w:r>
-              <w:t>_with_measures</w:t>
-            </w:r>
-            <w:proofErr w:type="spellEnd"/>
-            <w:r>
-              <w:t>}</w:t>
+              <w:t>_with_measures}</w:t>
             </w:r>
           </w:p>
         </w:tc>
@@ -3973,25 +3452,7 @@
           <w:sz w:val="24"/>
           <w:szCs w:val="24"/>
         </w:rPr>
-        <w:t xml:space="preserve">Für den ausgewählten Projektbereich berechnet das Modell ABIMO die drei Komponenten des Wasserhaushalts in Millimetern pro Jahr: den kanalisierten Oberflächenabfluss, die </w:t>
-      </w:r>
-      <w:proofErr w:type="spellStart"/>
-      <w:r>
-        <w:rPr>
-          <w:rFonts w:ascii="Arthouse Owned Medium" w:hAnsi="Arthouse Owned Medium"/>
-          <w:sz w:val="24"/>
-          <w:szCs w:val="24"/>
-        </w:rPr>
-        <w:t>Evapotranspiration</w:t>
-      </w:r>
-      <w:proofErr w:type="spellEnd"/>
-      <w:r>
-        <w:rPr>
-          <w:rFonts w:ascii="Arthouse Owned Medium" w:hAnsi="Arthouse Owned Medium"/>
-          <w:sz w:val="24"/>
-          <w:szCs w:val="24"/>
-        </w:rPr>
-        <w:t xml:space="preserve"> – also die Verdunstung über Oberflächen und Pflanzen – sowie die Versickerung.</w:t>
+        <w:t>Für den ausgewählten Projektbereich berechnet das Modell ABIMO die drei Komponenten des Wasserhaushalts in Millimetern pro Jahr: den kanalisierten Oberflächenabfluss, die Evapotranspiration – also die Verdunstung über Oberflächen und Pflanzen – sowie die Versickerung.</w:t>
       </w:r>
     </w:p>
     <w:p>
@@ -4196,11 +3657,9 @@
             <w:r>
               <w:t>{</w:t>
             </w:r>
-            <w:proofErr w:type="spellStart"/>
             <w:r>
               <w:t>runoffReduction</w:t>
             </w:r>
-            <w:proofErr w:type="spellEnd"/>
             <w:r>
               <w:t>}</w:t>
             </w:r>
@@ -4235,11 +3694,9 @@
             <w:r>
               <w:t>{</w:t>
             </w:r>
-            <w:proofErr w:type="spellStart"/>
             <w:r>
               <w:t>overflow_volume_status_quo</w:t>
             </w:r>
-            <w:proofErr w:type="spellEnd"/>
             <w:r>
               <w:t>}</w:t>
             </w:r>
@@ -4256,16 +3713,11 @@
             <w:r>
               <w:t>{</w:t>
             </w:r>
-            <w:proofErr w:type="spellStart"/>
             <w:r>
               <w:t>overflow_volume_s</w:t>
             </w:r>
             <w:r>
-              <w:t>imulation</w:t>
-            </w:r>
-            <w:proofErr w:type="spellEnd"/>
-            <w:r>
-              <w:t>}</w:t>
+              <w:t>imulation}</w:t>
             </w:r>
           </w:p>
         </w:tc>
@@ -4298,11 +3750,9 @@
             <w:r>
               <w:t>{</w:t>
             </w:r>
-            <w:proofErr w:type="spellStart"/>
             <w:r>
               <w:t>critical_hours_status_quo</w:t>
             </w:r>
-            <w:proofErr w:type="spellEnd"/>
             <w:r>
               <w:t>}</w:t>
             </w:r>
@@ -4319,11 +3769,9 @@
             <w:r>
               <w:t>{</w:t>
             </w:r>
-            <w:proofErr w:type="spellStart"/>
             <w:r>
               <w:t>critical_hours_simulation</w:t>
             </w:r>
-            <w:proofErr w:type="spellEnd"/>
             <w:r>
               <w:t>}</w:t>
             </w:r>
@@ -4367,11 +3815,9 @@
             <w:r>
               <w:t>{</w:t>
             </w:r>
-            <w:proofErr w:type="spellStart"/>
             <w:r>
               <w:t>critical_events_status_quo</w:t>
             </w:r>
-            <w:proofErr w:type="spellEnd"/>
             <w:r>
               <w:t>}</w:t>
             </w:r>
@@ -4388,11 +3834,9 @@
             <w:r>
               <w:t>{</w:t>
             </w:r>
-            <w:proofErr w:type="spellStart"/>
             <w:r>
               <w:t>critical_events_simulation</w:t>
             </w:r>
-            <w:proofErr w:type="spellEnd"/>
             <w:r>
               <w:t>}</w:t>
             </w:r>
@@ -4430,35 +3874,7 @@
         <w:rPr>
           <w:rFonts w:ascii="Arthouse Owned Medium" w:hAnsi="Arthouse Owned Medium"/>
         </w:rPr>
-        <w:t xml:space="preserve">Grundlage sind umfangreiche hydrodynamische Simulationen des Berliner Mischwassersystems mit den Modellen </w:t>
-      </w:r>
-      <w:proofErr w:type="spellStart"/>
-      <w:r>
-        <w:rPr>
-          <w:rFonts w:ascii="Arthouse Owned Medium" w:hAnsi="Arthouse Owned Medium"/>
-        </w:rPr>
-        <w:t>InfoWorks</w:t>
-      </w:r>
-      <w:proofErr w:type="spellEnd"/>
-      <w:r>
-        <w:rPr>
-          <w:rFonts w:ascii="Arthouse Owned Medium" w:hAnsi="Arthouse Owned Medium"/>
-        </w:rPr>
-        <w:t xml:space="preserve"> ICM, GERRIS, HYDRAX und </w:t>
-      </w:r>
-      <w:proofErr w:type="spellStart"/>
-      <w:r>
-        <w:rPr>
-          <w:rFonts w:ascii="Arthouse Owned Medium" w:hAnsi="Arthouse Owned Medium"/>
-        </w:rPr>
-        <w:t>QSim</w:t>
-      </w:r>
-      <w:proofErr w:type="spellEnd"/>
-      <w:r>
-        <w:rPr>
-          <w:rFonts w:ascii="Arthouse Owned Medium" w:hAnsi="Arthouse Owned Medium"/>
-        </w:rPr>
-        <w:t>.</w:t>
+        <w:t>Grundlage sind umfangreiche hydrodynamische Simulationen des Berliner Mischwassersystems mit den Modellen InfoWorks ICM, GERRIS, HYDRAX und QSim.</w:t>
       </w:r>
     </w:p>
     <w:p>
@@ -4611,14 +4027,12 @@
         </w:rPr>
         <w:t>{%</w:t>
       </w:r>
-      <w:proofErr w:type="spellStart"/>
       <w:r>
         <w:rPr>
           <w:rFonts w:ascii="Arthouse Owned Medium" w:hAnsi="Arthouse Owned Medium"/>
         </w:rPr>
         <w:t>plot_critical_hours</w:t>
       </w:r>
-      <w:proofErr w:type="spellEnd"/>
       <w:r>
         <w:rPr>
           <w:rFonts w:ascii="Arthouse Owned Medium" w:hAnsi="Arthouse Owned Medium"/>
@@ -4640,7 +4054,6 @@
         </w:rPr>
         <w:t>{%</w:t>
       </w:r>
-      <w:proofErr w:type="spellStart"/>
       <w:r>
         <w:rPr>
           <w:rFonts w:ascii="Arthouse Owned Medium" w:hAnsi="Arthouse Owned Medium"/>
@@ -4648,7 +4061,6 @@
         </w:rPr>
         <w:t>plot_critical_events</w:t>
       </w:r>
-      <w:proofErr w:type="spellEnd"/>
       <w:r>
         <w:rPr>
           <w:rFonts w:ascii="Arthouse Owned Medium" w:hAnsi="Arthouse Owned Medium"/>
@@ -4837,21 +4249,12 @@
                               <w:szCs w:val="36"/>
                             </w:rPr>
                           </w:pPr>
-                          <w:proofErr w:type="spellStart"/>
                           <w:r>
                             <w:rPr>
                               <w:sz w:val="36"/>
                               <w:szCs w:val="36"/>
                             </w:rPr>
-                            <w:t>SmartWater</w:t>
-                          </w:r>
-                          <w:proofErr w:type="spellEnd"/>
-                          <w:r>
-                            <w:rPr>
-                              <w:sz w:val="36"/>
-                              <w:szCs w:val="36"/>
-                            </w:rPr>
-                            <w:t xml:space="preserve"> BGI-Planer</w:t>
+                            <w:t>SmartWater BGI-Planer</w:t>
                           </w:r>
                         </w:p>
                       </w:txbxContent>
@@ -4919,25 +4322,7 @@
         <w:szCs w:val="36"/>
         <w:lang w:val="en-US"/>
       </w:rPr>
-      <w:t>{</w:t>
-    </w:r>
-    <w:proofErr w:type="spellStart"/>
-    <w:r>
-      <w:rPr>
-        <w:sz w:val="36"/>
-        <w:szCs w:val="36"/>
-        <w:lang w:val="en-US"/>
-      </w:rPr>
-      <w:t>project_name</w:t>
-    </w:r>
-    <w:proofErr w:type="spellEnd"/>
-    <w:r>
-      <w:rPr>
-        <w:sz w:val="36"/>
-        <w:szCs w:val="36"/>
-        <w:lang w:val="en-US"/>
-      </w:rPr>
-      <w:t>}</w:t>
+      <w:t>{project_name}</w:t>
     </w:r>
   </w:p>
   <w:p>

</xml_diff>

<commit_message>
feat: add ist-zustand images to effektbewertung gewaesserschutz
</commit_message>
<xml_diff>
--- a/src/templates/report.docx
+++ b/src/templates/report.docx
@@ -10,18 +10,28 @@
           <w:lang w:val="en-US"/>
         </w:rPr>
       </w:pPr>
-      <w:r>
-        <w:rPr>
-          <w:lang w:val="en-US"/>
-        </w:rPr>
-        <w:t>Projektart: {</w:t>
-      </w:r>
+      <w:proofErr w:type="spellStart"/>
+      <w:r>
+        <w:rPr>
+          <w:lang w:val="en-US"/>
+        </w:rPr>
+        <w:t>Projektart</w:t>
+      </w:r>
+      <w:proofErr w:type="spellEnd"/>
+      <w:r>
+        <w:rPr>
+          <w:lang w:val="en-US"/>
+        </w:rPr>
+        <w:t>: {</w:t>
+      </w:r>
+      <w:proofErr w:type="spellStart"/>
       <w:r>
         <w:rPr>
           <w:lang w:val="en-US"/>
         </w:rPr>
         <w:t>use_case</w:t>
       </w:r>
+      <w:proofErr w:type="spellEnd"/>
       <w:r>
         <w:rPr>
           <w:lang w:val="en-US"/>
@@ -306,7 +316,23 @@
           <w:b/>
           <w:bCs/>
         </w:rPr>
-        <w:t>{heavy_rain_flow_velocity}</w:t>
+        <w:t>{</w:t>
+      </w:r>
+      <w:proofErr w:type="spellStart"/>
+      <w:r>
+        <w:rPr>
+          <w:b/>
+          <w:bCs/>
+        </w:rPr>
+        <w:t>heavy_rain_flow_velocity</w:t>
+      </w:r>
+      <w:proofErr w:type="spellEnd"/>
+      <w:r>
+        <w:rPr>
+          <w:b/>
+          <w:bCs/>
+        </w:rPr>
+        <w:t>}</w:t>
       </w:r>
     </w:p>
     <w:p>
@@ -351,7 +377,21 @@
         <w:rPr>
           <w:lang w:val="en-US"/>
         </w:rPr>
-        <w:t>{/heavy_rain_flow_velocity_notes}</w:t>
+        <w:t>{/</w:t>
+      </w:r>
+      <w:proofErr w:type="spellStart"/>
+      <w:r>
+        <w:rPr>
+          <w:lang w:val="en-US"/>
+        </w:rPr>
+        <w:t>heavy_rain_flow_velocity_notes</w:t>
+      </w:r>
+      <w:proofErr w:type="spellEnd"/>
+      <w:r>
+        <w:rPr>
+          <w:lang w:val="en-US"/>
+        </w:rPr>
+        <w:t>}</w:t>
       </w:r>
     </w:p>
     <w:p>
@@ -365,12 +405,14 @@
           <w:lang w:val="en-US"/>
         </w:rPr>
       </w:pPr>
+      <w:proofErr w:type="spellStart"/>
       <w:r>
         <w:rPr>
           <w:lang w:val="en-US"/>
         </w:rPr>
         <w:t>Feuerwehreinsätze</w:t>
       </w:r>
+      <w:proofErr w:type="spellEnd"/>
       <w:r>
         <w:rPr>
           <w:lang w:val="en-US"/>
@@ -383,7 +425,25 @@
           <w:bCs/>
           <w:lang w:val="en-US"/>
         </w:rPr>
-        <w:t>{heavy_rain_fire_department_incidents}</w:t>
+        <w:t>{</w:t>
+      </w:r>
+      <w:proofErr w:type="spellStart"/>
+      <w:r>
+        <w:rPr>
+          <w:b/>
+          <w:bCs/>
+          <w:lang w:val="en-US"/>
+        </w:rPr>
+        <w:t>heavy_rain_fire_department_incidents</w:t>
+      </w:r>
+      <w:proofErr w:type="spellEnd"/>
+      <w:r>
+        <w:rPr>
+          <w:b/>
+          <w:bCs/>
+          <w:lang w:val="en-US"/>
+        </w:rPr>
+        <w:t>}</w:t>
       </w:r>
     </w:p>
     <w:p>
@@ -442,6 +502,7 @@
         </w:rPr>
         <w:t>{/</w:t>
       </w:r>
+      <w:proofErr w:type="spellStart"/>
       <w:r>
         <w:rPr>
           <w:lang w:val="en-US"/>
@@ -452,7 +513,14 @@
         <w:rPr>
           <w:lang w:val="en-US"/>
         </w:rPr>
-        <w:t>_notes}</w:t>
+        <w:t>_notes</w:t>
+      </w:r>
+      <w:proofErr w:type="spellEnd"/>
+      <w:r>
+        <w:rPr>
+          <w:lang w:val="en-US"/>
+        </w:rPr>
+        <w:t>}</w:t>
       </w:r>
     </w:p>
     <w:p>
@@ -482,7 +550,23 @@
           <w:b/>
           <w:bCs/>
         </w:rPr>
-        <w:t>{heat_thermal_load_day}</w:t>
+        <w:t>{</w:t>
+      </w:r>
+      <w:proofErr w:type="spellStart"/>
+      <w:r>
+        <w:rPr>
+          <w:b/>
+          <w:bCs/>
+        </w:rPr>
+        <w:t>heat_thermal_load_day</w:t>
+      </w:r>
+      <w:proofErr w:type="spellEnd"/>
+      <w:r>
+        <w:rPr>
+          <w:b/>
+          <w:bCs/>
+        </w:rPr>
+        <w:t>}</w:t>
       </w:r>
     </w:p>
     <w:p>
@@ -524,7 +608,21 @@
         <w:rPr>
           <w:lang w:val="en-US"/>
         </w:rPr>
-        <w:t>{/heat_thermal_load_day_notes}</w:t>
+        <w:t>{/</w:t>
+      </w:r>
+      <w:proofErr w:type="spellStart"/>
+      <w:r>
+        <w:rPr>
+          <w:lang w:val="en-US"/>
+        </w:rPr>
+        <w:t>heat_thermal_load_day_notes</w:t>
+      </w:r>
+      <w:proofErr w:type="spellEnd"/>
+      <w:r>
+        <w:rPr>
+          <w:lang w:val="en-US"/>
+        </w:rPr>
+        <w:t>}</w:t>
       </w:r>
     </w:p>
     <w:p>
@@ -546,7 +644,23 @@
           <w:b/>
           <w:bCs/>
         </w:rPr>
-        <w:t>{heat_thermal_load_night}</w:t>
+        <w:t>{</w:t>
+      </w:r>
+      <w:proofErr w:type="spellStart"/>
+      <w:r>
+        <w:rPr>
+          <w:b/>
+          <w:bCs/>
+        </w:rPr>
+        <w:t>heat_thermal_load_night</w:t>
+      </w:r>
+      <w:proofErr w:type="spellEnd"/>
+      <w:r>
+        <w:rPr>
+          <w:b/>
+          <w:bCs/>
+        </w:rPr>
+        <w:t>}</w:t>
       </w:r>
     </w:p>
     <w:p>
@@ -588,7 +702,21 @@
         <w:rPr>
           <w:lang w:val="en-US"/>
         </w:rPr>
-        <w:t>{/heat_thermal_load_night_notes}</w:t>
+        <w:t>{/</w:t>
+      </w:r>
+      <w:proofErr w:type="spellStart"/>
+      <w:r>
+        <w:rPr>
+          <w:lang w:val="en-US"/>
+        </w:rPr>
+        <w:t>heat_thermal_load_night_notes</w:t>
+      </w:r>
+      <w:proofErr w:type="spellEnd"/>
+      <w:r>
+        <w:rPr>
+          <w:lang w:val="en-US"/>
+        </w:rPr>
+        <w:t>}</w:t>
       </w:r>
     </w:p>
     <w:p>
@@ -610,7 +738,23 @@
           <w:b/>
           <w:bCs/>
         </w:rPr>
-        <w:t>{heat_vulnerable_areas}</w:t>
+        <w:t>{</w:t>
+      </w:r>
+      <w:proofErr w:type="spellStart"/>
+      <w:r>
+        <w:rPr>
+          <w:b/>
+          <w:bCs/>
+        </w:rPr>
+        <w:t>heat_vulnerable_areas</w:t>
+      </w:r>
+      <w:proofErr w:type="spellEnd"/>
+      <w:r>
+        <w:rPr>
+          <w:b/>
+          <w:bCs/>
+        </w:rPr>
+        <w:t>}</w:t>
       </w:r>
     </w:p>
     <w:p>
@@ -627,9 +771,11 @@
         </w:rPr>
         <w:t>{#</w:t>
       </w:r>
+      <w:proofErr w:type="spellStart"/>
       <w:r>
         <w:t>heat_vulnerable_areas_notes</w:t>
       </w:r>
+      <w:proofErr w:type="spellEnd"/>
       <w:r>
         <w:rPr>
           <w:lang w:val="en-US"/>
@@ -663,9 +809,11 @@
         </w:rPr>
         <w:t>{/</w:t>
       </w:r>
+      <w:proofErr w:type="spellStart"/>
       <w:r>
         <w:t>heat_vulnerable_areas_notes</w:t>
       </w:r>
+      <w:proofErr w:type="spellEnd"/>
       <w:r>
         <w:rPr>
           <w:lang w:val="en-US"/>
@@ -692,7 +840,23 @@
           <w:b/>
           <w:bCs/>
         </w:rPr>
-        <w:t>{heat_cold_air_corridors}</w:t>
+        <w:t>{</w:t>
+      </w:r>
+      <w:proofErr w:type="spellStart"/>
+      <w:r>
+        <w:rPr>
+          <w:b/>
+          <w:bCs/>
+        </w:rPr>
+        <w:t>heat_cold_air_corridors</w:t>
+      </w:r>
+      <w:proofErr w:type="spellEnd"/>
+      <w:r>
+        <w:rPr>
+          <w:b/>
+          <w:bCs/>
+        </w:rPr>
+        <w:t>}</w:t>
       </w:r>
     </w:p>
     <w:p>
@@ -735,7 +899,21 @@
           <w:lang w:val="en-US"/>
         </w:rPr>
         <w:lastRenderedPageBreak/>
-        <w:t>{/heat_cold_air_corridors_notes}</w:t>
+        <w:t>{/</w:t>
+      </w:r>
+      <w:proofErr w:type="spellStart"/>
+      <w:r>
+        <w:rPr>
+          <w:lang w:val="en-US"/>
+        </w:rPr>
+        <w:t>heat_cold_air_corridors_notes</w:t>
+      </w:r>
+      <w:proofErr w:type="spellEnd"/>
+      <w:r>
+        <w:rPr>
+          <w:lang w:val="en-US"/>
+        </w:rPr>
+        <w:t>}</w:t>
       </w:r>
     </w:p>
     <w:p>
@@ -757,7 +935,23 @@
           <w:b/>
           <w:bCs/>
         </w:rPr>
-        <w:t>{heat_cold_air_flow}</w:t>
+        <w:t>{</w:t>
+      </w:r>
+      <w:proofErr w:type="spellStart"/>
+      <w:r>
+        <w:rPr>
+          <w:b/>
+          <w:bCs/>
+        </w:rPr>
+        <w:t>heat_cold_air_flow</w:t>
+      </w:r>
+      <w:proofErr w:type="spellEnd"/>
+      <w:r>
+        <w:rPr>
+          <w:b/>
+          <w:bCs/>
+        </w:rPr>
+        <w:t>}</w:t>
       </w:r>
     </w:p>
     <w:p>
@@ -799,7 +993,21 @@
         <w:rPr>
           <w:lang w:val="en-US"/>
         </w:rPr>
-        <w:t>{/heat_cold_air_flow_notes}</w:t>
+        <w:t>{/</w:t>
+      </w:r>
+      <w:proofErr w:type="spellStart"/>
+      <w:r>
+        <w:rPr>
+          <w:lang w:val="en-US"/>
+        </w:rPr>
+        <w:t>heat_cold_air_flow_notes</w:t>
+      </w:r>
+      <w:proofErr w:type="spellEnd"/>
+      <w:r>
+        <w:rPr>
+          <w:lang w:val="en-US"/>
+        </w:rPr>
+        <w:t>}</w:t>
       </w:r>
     </w:p>
     <w:p>
@@ -829,7 +1037,23 @@
           <w:b/>
           <w:bCs/>
         </w:rPr>
-        <w:t>{sealing_block_areas_high}</w:t>
+        <w:t>{</w:t>
+      </w:r>
+      <w:proofErr w:type="spellStart"/>
+      <w:r>
+        <w:rPr>
+          <w:b/>
+          <w:bCs/>
+        </w:rPr>
+        <w:t>sealing_block_areas_high</w:t>
+      </w:r>
+      <w:proofErr w:type="spellEnd"/>
+      <w:r>
+        <w:rPr>
+          <w:b/>
+          <w:bCs/>
+        </w:rPr>
+        <w:t>}</w:t>
       </w:r>
     </w:p>
     <w:p>
@@ -871,7 +1095,21 @@
         <w:rPr>
           <w:lang w:val="en-US"/>
         </w:rPr>
-        <w:t>{/sealing_block_areas_high_notes}</w:t>
+        <w:t>{/</w:t>
+      </w:r>
+      <w:proofErr w:type="spellStart"/>
+      <w:r>
+        <w:rPr>
+          <w:lang w:val="en-US"/>
+        </w:rPr>
+        <w:t>sealing_block_areas_high_notes</w:t>
+      </w:r>
+      <w:proofErr w:type="spellEnd"/>
+      <w:r>
+        <w:rPr>
+          <w:lang w:val="en-US"/>
+        </w:rPr>
+        <w:t>}</w:t>
       </w:r>
     </w:p>
     <w:p>
@@ -885,12 +1123,14 @@
           <w:lang w:val="en-US"/>
         </w:rPr>
       </w:pPr>
+      <w:proofErr w:type="spellStart"/>
       <w:r>
         <w:rPr>
           <w:lang w:val="en-US"/>
         </w:rPr>
         <w:t>Grünvolumenzahl</w:t>
       </w:r>
+      <w:proofErr w:type="spellEnd"/>
       <w:r>
         <w:rPr>
           <w:lang w:val="en-US"/>
@@ -903,7 +1143,25 @@
           <w:bCs/>
           <w:lang w:val="en-US"/>
         </w:rPr>
-        <w:t>{sealing_green_volume_low}</w:t>
+        <w:t>{</w:t>
+      </w:r>
+      <w:proofErr w:type="spellStart"/>
+      <w:r>
+        <w:rPr>
+          <w:b/>
+          <w:bCs/>
+          <w:lang w:val="en-US"/>
+        </w:rPr>
+        <w:t>sealing_green_volume_low</w:t>
+      </w:r>
+      <w:proofErr w:type="spellEnd"/>
+      <w:r>
+        <w:rPr>
+          <w:b/>
+          <w:bCs/>
+          <w:lang w:val="en-US"/>
+        </w:rPr>
+        <w:t>}</w:t>
       </w:r>
     </w:p>
     <w:p>
@@ -945,7 +1203,21 @@
         <w:rPr>
           <w:lang w:val="en-US"/>
         </w:rPr>
-        <w:t>{/sealing_green_volume_low_notes}</w:t>
+        <w:t>{/</w:t>
+      </w:r>
+      <w:proofErr w:type="spellStart"/>
+      <w:r>
+        <w:rPr>
+          <w:lang w:val="en-US"/>
+        </w:rPr>
+        <w:t>sealing_green_volume_low_notes</w:t>
+      </w:r>
+      <w:proofErr w:type="spellEnd"/>
+      <w:r>
+        <w:rPr>
+          <w:lang w:val="en-US"/>
+        </w:rPr>
+        <w:t>}</w:t>
       </w:r>
     </w:p>
     <w:p>
@@ -975,7 +1247,23 @@
           <w:b/>
           <w:bCs/>
         </w:rPr>
-        <w:t>{water_balance_natural_deviation}</w:t>
+        <w:t>{</w:t>
+      </w:r>
+      <w:proofErr w:type="spellStart"/>
+      <w:r>
+        <w:rPr>
+          <w:b/>
+          <w:bCs/>
+        </w:rPr>
+        <w:t>water_balance_natural_deviation</w:t>
+      </w:r>
+      <w:proofErr w:type="spellEnd"/>
+      <w:r>
+        <w:rPr>
+          <w:b/>
+          <w:bCs/>
+        </w:rPr>
+        <w:t>}</w:t>
       </w:r>
     </w:p>
     <w:p>
@@ -1017,7 +1305,21 @@
         <w:rPr>
           <w:lang w:val="en-US"/>
         </w:rPr>
-        <w:t>{/water_balance_natural_deviation_notes}</w:t>
+        <w:t>{/</w:t>
+      </w:r>
+      <w:proofErr w:type="spellStart"/>
+      <w:r>
+        <w:rPr>
+          <w:lang w:val="en-US"/>
+        </w:rPr>
+        <w:t>water_balance_natural_deviation_notes</w:t>
+      </w:r>
+      <w:proofErr w:type="spellEnd"/>
+      <w:r>
+        <w:rPr>
+          <w:lang w:val="en-US"/>
+        </w:rPr>
+        <w:t>}</w:t>
       </w:r>
     </w:p>
     <w:p>
@@ -1047,7 +1349,23 @@
           <w:b/>
           <w:bCs/>
         </w:rPr>
-        <w:t>{water_protection_sewer_type}</w:t>
+        <w:t>{</w:t>
+      </w:r>
+      <w:proofErr w:type="spellStart"/>
+      <w:r>
+        <w:rPr>
+          <w:b/>
+          <w:bCs/>
+        </w:rPr>
+        <w:t>water_protection_sewer_type</w:t>
+      </w:r>
+      <w:proofErr w:type="spellEnd"/>
+      <w:r>
+        <w:rPr>
+          <w:b/>
+          <w:bCs/>
+        </w:rPr>
+        <w:t>}</w:t>
       </w:r>
     </w:p>
     <w:p>
@@ -1089,7 +1407,21 @@
         <w:rPr>
           <w:lang w:val="en-US"/>
         </w:rPr>
-        <w:t>{/water_protection_sewer_type_notes}</w:t>
+        <w:t>{/</w:t>
+      </w:r>
+      <w:proofErr w:type="spellStart"/>
+      <w:r>
+        <w:rPr>
+          <w:lang w:val="en-US"/>
+        </w:rPr>
+        <w:t>water_protection_sewer_type_notes</w:t>
+      </w:r>
+      <w:proofErr w:type="spellEnd"/>
+      <w:r>
+        <w:rPr>
+          <w:lang w:val="en-US"/>
+        </w:rPr>
+        <w:t>}</w:t>
       </w:r>
     </w:p>
     <w:p>
@@ -1111,7 +1443,23 @@
           <w:b/>
           <w:bCs/>
         </w:rPr>
-        <w:t>{water_protection_decoupling_requirements}</w:t>
+        <w:t>{</w:t>
+      </w:r>
+      <w:proofErr w:type="spellStart"/>
+      <w:r>
+        <w:rPr>
+          <w:b/>
+          <w:bCs/>
+        </w:rPr>
+        <w:t>water_protection_decoupling_requirements</w:t>
+      </w:r>
+      <w:proofErr w:type="spellEnd"/>
+      <w:r>
+        <w:rPr>
+          <w:b/>
+          <w:bCs/>
+        </w:rPr>
+        <w:t>}</w:t>
       </w:r>
     </w:p>
     <w:p>
@@ -1154,7 +1502,21 @@
         <w:rPr>
           <w:lang w:val="en-US"/>
         </w:rPr>
-        <w:t>{/water_protection_decoupling_requirements_notes}</w:t>
+        <w:t>{/</w:t>
+      </w:r>
+      <w:proofErr w:type="spellStart"/>
+      <w:r>
+        <w:rPr>
+          <w:lang w:val="en-US"/>
+        </w:rPr>
+        <w:t>water_protection_decoupling_requirements_notes</w:t>
+      </w:r>
+      <w:proofErr w:type="spellEnd"/>
+      <w:r>
+        <w:rPr>
+          <w:lang w:val="en-US"/>
+        </w:rPr>
+        <w:t>}</w:t>
       </w:r>
     </w:p>
     <w:p>
@@ -1168,12 +1530,14 @@
           <w:lang w:val="en-US"/>
         </w:rPr>
       </w:pPr>
+      <w:proofErr w:type="spellStart"/>
       <w:r>
         <w:rPr>
           <w:lang w:val="en-US"/>
         </w:rPr>
         <w:t>Kleingewässer</w:t>
       </w:r>
+      <w:proofErr w:type="spellEnd"/>
       <w:r>
         <w:rPr>
           <w:lang w:val="en-US"/>
@@ -1186,7 +1550,25 @@
           <w:bCs/>
           <w:lang w:val="en-US"/>
         </w:rPr>
-        <w:t>{water_protection_small_waters_demand}</w:t>
+        <w:t>{</w:t>
+      </w:r>
+      <w:proofErr w:type="spellStart"/>
+      <w:r>
+        <w:rPr>
+          <w:b/>
+          <w:bCs/>
+          <w:lang w:val="en-US"/>
+        </w:rPr>
+        <w:t>water_protection_small_waters_demand</w:t>
+      </w:r>
+      <w:proofErr w:type="spellEnd"/>
+      <w:r>
+        <w:rPr>
+          <w:b/>
+          <w:bCs/>
+          <w:lang w:val="en-US"/>
+        </w:rPr>
+        <w:t>}</w:t>
       </w:r>
     </w:p>
     <w:p>
@@ -1228,7 +1610,21 @@
         <w:rPr>
           <w:lang w:val="en-US"/>
         </w:rPr>
-        <w:t>{/water_protection_small_waters_demand_notes}</w:t>
+        <w:t>{/</w:t>
+      </w:r>
+      <w:proofErr w:type="spellStart"/>
+      <w:r>
+        <w:rPr>
+          <w:lang w:val="en-US"/>
+        </w:rPr>
+        <w:t>water_protection_small_waters_demand_notes</w:t>
+      </w:r>
+      <w:proofErr w:type="spellEnd"/>
+      <w:r>
+        <w:rPr>
+          <w:lang w:val="en-US"/>
+        </w:rPr>
+        <w:t>}</w:t>
       </w:r>
     </w:p>
     <w:p>
@@ -1288,13 +1684,7 @@
         <w:rPr>
           <w:lang w:val="en-US"/>
         </w:rPr>
-        <w:t>{#</w:t>
-      </w:r>
-      <w:r>
-        <w:rPr>
-          <w:lang w:val="en-US"/>
-        </w:rPr>
-        <w:t>2</w:t>
+        <w:t>{#2</w:t>
       </w:r>
       <w:r>
         <w:rPr>
@@ -1476,13 +1866,7 @@
         <w:rPr>
           <w:lang w:val="en-US"/>
         </w:rPr>
-        <w:t>V</w:t>
-      </w:r>
-      <w:r>
-        <w:rPr>
-          <w:lang w:val="en-US"/>
-        </w:rPr>
-        <w:t>4</w:t>
+        <w:t>V4</w:t>
       </w:r>
       <w:r>
         <w:rPr>
@@ -1521,13 +1905,7 @@
         <w:rPr>
           <w:lang w:val="en-US"/>
         </w:rPr>
-        <w:t>V</w:t>
-      </w:r>
-      <w:r>
-        <w:rPr>
-          <w:lang w:val="en-US"/>
-        </w:rPr>
-        <w:t>4</w:t>
+        <w:t>V4</w:t>
       </w:r>
       <w:r>
         <w:rPr>
@@ -1583,13 +1961,7 @@
         <w:rPr>
           <w:lang w:val="en-US"/>
         </w:rPr>
-        <w:t>V</w:t>
-      </w:r>
-      <w:r>
-        <w:rPr>
-          <w:lang w:val="en-US"/>
-        </w:rPr>
-        <w:t>5</w:t>
+        <w:t>V5</w:t>
       </w:r>
       <w:r>
         <w:rPr>
@@ -1628,13 +2000,7 @@
         <w:rPr>
           <w:lang w:val="en-US"/>
         </w:rPr>
-        <w:t>V</w:t>
-      </w:r>
-      <w:r>
-        <w:rPr>
-          <w:lang w:val="en-US"/>
-        </w:rPr>
-        <w:t>5</w:t>
+        <w:t>V5</w:t>
       </w:r>
       <w:r>
         <w:rPr>
@@ -1899,11 +2265,16 @@
               <w:pStyle w:val="BodytextBGI"/>
             </w:pPr>
             <w:r>
-              <w:t>{p</w:t>
+              <w:t>{</w:t>
+            </w:r>
+            <w:proofErr w:type="spellStart"/>
+            <w:r>
+              <w:t>p</w:t>
             </w:r>
             <w:r>
               <w:t>_green_roof_ext</w:t>
             </w:r>
+            <w:proofErr w:type="spellEnd"/>
             <w:r>
               <w:t>}</w:t>
             </w:r>
@@ -1926,6 +2297,7 @@
               </w:rPr>
               <w:t>{</w:t>
             </w:r>
+            <w:proofErr w:type="spellStart"/>
             <w:r>
               <w:rPr>
                 <w:lang w:val="en-US"/>
@@ -1936,7 +2308,14 @@
               <w:rPr>
                 <w:lang w:val="en-US"/>
               </w:rPr>
-              <w:t>_green_roof_ext}</w:t>
+              <w:t>_green_roof_ext</w:t>
+            </w:r>
+            <w:proofErr w:type="spellEnd"/>
+            <w:r>
+              <w:rPr>
+                <w:lang w:val="en-US"/>
+              </w:rPr>
+              <w:t>}</w:t>
             </w:r>
           </w:p>
         </w:tc>
@@ -1977,11 +2356,16 @@
               <w:pStyle w:val="BodytextBGI"/>
             </w:pPr>
             <w:r>
-              <w:t>{p</w:t>
+              <w:t>{</w:t>
+            </w:r>
+            <w:proofErr w:type="spellStart"/>
+            <w:r>
+              <w:t>p</w:t>
             </w:r>
             <w:r>
               <w:t>_green_roof_int</w:t>
             </w:r>
+            <w:proofErr w:type="spellEnd"/>
             <w:r>
               <w:t>}</w:t>
             </w:r>
@@ -2004,6 +2388,7 @@
               </w:rPr>
               <w:t>{</w:t>
             </w:r>
+            <w:proofErr w:type="spellStart"/>
             <w:r>
               <w:rPr>
                 <w:lang w:val="en-US"/>
@@ -2022,6 +2407,7 @@
               </w:rPr>
               <w:t>int</w:t>
             </w:r>
+            <w:proofErr w:type="spellEnd"/>
             <w:r>
               <w:rPr>
                 <w:lang w:val="en-US"/>
@@ -2123,11 +2509,16 @@
             <w:r>
               <w:t>{</w:t>
             </w:r>
+            <w:proofErr w:type="spellStart"/>
             <w:r>
               <w:t>p</w:t>
             </w:r>
             <w:r>
-              <w:t>_permeable_paving}</w:t>
+              <w:t>_permeable_paving</w:t>
+            </w:r>
+            <w:proofErr w:type="spellEnd"/>
+            <w:r>
+              <w:t>}</w:t>
             </w:r>
           </w:p>
         </w:tc>
@@ -2145,11 +2536,16 @@
             <w:r>
               <w:t>{</w:t>
             </w:r>
+            <w:proofErr w:type="spellStart"/>
             <w:r>
               <w:t>ca_</w:t>
             </w:r>
             <w:r>
-              <w:t>permeable_paving}</w:t>
+              <w:t>permeable_paving</w:t>
+            </w:r>
+            <w:proofErr w:type="spellEnd"/>
+            <w:r>
+              <w:t>}</w:t>
             </w:r>
           </w:p>
         </w:tc>
@@ -2351,7 +2747,15 @@
               <w:pStyle w:val="BodytextBGI"/>
             </w:pPr>
             <w:r>
-              <w:t>{t_n}</w:t>
+              <w:t>{</w:t>
+            </w:r>
+            <w:proofErr w:type="spellStart"/>
+            <w:r>
+              <w:t>t_n</w:t>
+            </w:r>
+            <w:proofErr w:type="spellEnd"/>
+            <w:r>
+              <w:t>}</w:t>
             </w:r>
           </w:p>
         </w:tc>
@@ -2420,6 +2824,7 @@
             <w:r>
               <w:t>{</w:t>
             </w:r>
+            <w:proofErr w:type="spellStart"/>
             <w:r>
               <w:t>p</w:t>
             </w:r>
@@ -2429,6 +2834,7 @@
             <w:r>
               <w:t>to_swale</w:t>
             </w:r>
+            <w:proofErr w:type="spellEnd"/>
             <w:r>
               <w:t>}</w:t>
             </w:r>
@@ -2445,6 +2851,7 @@
             <w:r>
               <w:t>{</w:t>
             </w:r>
+            <w:proofErr w:type="spellStart"/>
             <w:r>
               <w:t>ca</w:t>
             </w:r>
@@ -2454,6 +2861,7 @@
             <w:r>
               <w:t>to_swale</w:t>
             </w:r>
+            <w:proofErr w:type="spellEnd"/>
             <w:r>
               <w:t>}</w:t>
             </w:r>
@@ -2498,6 +2906,7 @@
             <w:r>
               <w:t>{</w:t>
             </w:r>
+            <w:proofErr w:type="spellStart"/>
             <w:r>
               <w:t>p</w:t>
             </w:r>
@@ -2507,6 +2916,7 @@
             <w:r>
               <w:t>to_surf_infil</w:t>
             </w:r>
+            <w:proofErr w:type="spellEnd"/>
             <w:r>
               <w:t>}</w:t>
             </w:r>
@@ -2523,6 +2933,7 @@
             <w:r>
               <w:t>{</w:t>
             </w:r>
+            <w:proofErr w:type="spellStart"/>
             <w:r>
               <w:t>ca</w:t>
             </w:r>
@@ -2532,6 +2943,7 @@
             <w:r>
               <w:t>to_surf_infil</w:t>
             </w:r>
+            <w:proofErr w:type="spellEnd"/>
             <w:r>
               <w:t>}</w:t>
             </w:r>
@@ -2576,6 +2988,7 @@
             <w:r>
               <w:t>{</w:t>
             </w:r>
+            <w:proofErr w:type="spellStart"/>
             <w:r>
               <w:t>p</w:t>
             </w:r>
@@ -2585,6 +2998,7 @@
             <w:r>
               <w:t>to_swale_trench</w:t>
             </w:r>
+            <w:proofErr w:type="spellEnd"/>
             <w:r>
               <w:t>}</w:t>
             </w:r>
@@ -2601,6 +3015,7 @@
             <w:r>
               <w:t>{</w:t>
             </w:r>
+            <w:proofErr w:type="spellStart"/>
             <w:r>
               <w:t>ca</w:t>
             </w:r>
@@ -2610,6 +3025,7 @@
             <w:r>
               <w:t>to_swale_trench</w:t>
             </w:r>
+            <w:proofErr w:type="spellEnd"/>
             <w:r>
               <w:t>}</w:t>
             </w:r>
@@ -2717,7 +3133,15 @@
               <w:pStyle w:val="BodytextBGI"/>
             </w:pPr>
             <w:r>
-              <w:t>{t_o}</w:t>
+              <w:t>{</w:t>
+            </w:r>
+            <w:proofErr w:type="spellStart"/>
+            <w:r>
+              <w:t>t_o</w:t>
+            </w:r>
+            <w:proofErr w:type="spellEnd"/>
+            <w:r>
+              <w:t>}</w:t>
             </w:r>
           </w:p>
         </w:tc>
@@ -2743,7 +3167,15 @@
               <w:pStyle w:val="BodytextBGI"/>
             </w:pPr>
             <w:r>
-              <w:t>{ca_t_o}</w:t>
+              <w:t>{</w:t>
+            </w:r>
+            <w:proofErr w:type="spellStart"/>
+            <w:r>
+              <w:t>ca_t_o</w:t>
+            </w:r>
+            <w:proofErr w:type="spellEnd"/>
+            <w:r>
+              <w:t>}</w:t>
             </w:r>
           </w:p>
         </w:tc>
@@ -2786,6 +3218,7 @@
             <w:r>
               <w:t>{</w:t>
             </w:r>
+            <w:proofErr w:type="spellStart"/>
             <w:r>
               <w:t>p</w:t>
             </w:r>
@@ -2795,6 +3228,7 @@
             <w:r>
               <w:t>to_trench</w:t>
             </w:r>
+            <w:proofErr w:type="spellEnd"/>
             <w:r>
               <w:t>}</w:t>
             </w:r>
@@ -2811,6 +3245,7 @@
             <w:r>
               <w:t>{</w:t>
             </w:r>
+            <w:proofErr w:type="spellStart"/>
             <w:r>
               <w:t>ca</w:t>
             </w:r>
@@ -2820,6 +3255,7 @@
             <w:r>
               <w:t>to_trench</w:t>
             </w:r>
+            <w:proofErr w:type="spellEnd"/>
             <w:r>
               <w:t>}</w:t>
             </w:r>
@@ -2939,6 +3375,7 @@
             <w:r>
               <w:t>{</w:t>
             </w:r>
+            <w:proofErr w:type="spellStart"/>
             <w:r>
               <w:t>p</w:t>
             </w:r>
@@ -2948,6 +3385,7 @@
             <w:r>
               <w:t>to_cistern</w:t>
             </w:r>
+            <w:proofErr w:type="spellEnd"/>
             <w:r>
               <w:t>}</w:t>
             </w:r>
@@ -2967,12 +3405,14 @@
             <w:r>
               <w:t>{</w:t>
             </w:r>
+            <w:proofErr w:type="spellStart"/>
             <w:r>
               <w:t>ca_</w:t>
             </w:r>
             <w:r>
               <w:t>to_cistern</w:t>
             </w:r>
+            <w:proofErr w:type="spellEnd"/>
             <w:r>
               <w:t>}</w:t>
             </w:r>
@@ -3263,7 +3703,15 @@
               <w:pStyle w:val="BodytextBGI"/>
             </w:pPr>
             <w:r>
-              <w:t>{delta_w_status_quo}</w:t>
+              <w:t>{</w:t>
+            </w:r>
+            <w:proofErr w:type="spellStart"/>
+            <w:r>
+              <w:t>delta_w_status_quo</w:t>
+            </w:r>
+            <w:proofErr w:type="spellEnd"/>
+            <w:r>
+              <w:t>}</w:t>
             </w:r>
           </w:p>
         </w:tc>
@@ -3276,7 +3724,15 @@
               <w:pStyle w:val="BodytextBGI"/>
             </w:pPr>
             <w:r>
-              <w:t>{delta_w_with_measures}</w:t>
+              <w:t>{</w:t>
+            </w:r>
+            <w:proofErr w:type="spellStart"/>
+            <w:r>
+              <w:t>delta_w_with_measures</w:t>
+            </w:r>
+            <w:proofErr w:type="spellEnd"/>
+            <w:r>
+              <w:t>}</w:t>
             </w:r>
           </w:p>
         </w:tc>
@@ -3304,7 +3760,15 @@
               <w:pStyle w:val="BodytextBGI"/>
             </w:pPr>
             <w:r>
-              <w:t>{runoff_status_quo}</w:t>
+              <w:t>{</w:t>
+            </w:r>
+            <w:proofErr w:type="spellStart"/>
+            <w:r>
+              <w:t>runoff_status_quo</w:t>
+            </w:r>
+            <w:proofErr w:type="spellEnd"/>
+            <w:r>
+              <w:t>}</w:t>
             </w:r>
           </w:p>
         </w:tc>
@@ -3317,7 +3781,15 @@
               <w:pStyle w:val="BodytextBGI"/>
             </w:pPr>
             <w:r>
-              <w:t>{runoff_with_measures}</w:t>
+              <w:t>{</w:t>
+            </w:r>
+            <w:proofErr w:type="spellStart"/>
+            <w:r>
+              <w:t>runoff_with_measures</w:t>
+            </w:r>
+            <w:proofErr w:type="spellEnd"/>
+            <w:r>
+              <w:t>}</w:t>
             </w:r>
           </w:p>
         </w:tc>
@@ -3347,11 +3819,16 @@
             <w:r>
               <w:t>{</w:t>
             </w:r>
+            <w:proofErr w:type="spellStart"/>
             <w:r>
               <w:t>infiltr</w:t>
             </w:r>
             <w:r>
-              <w:t>_status_quo}</w:t>
+              <w:t>_status_quo</w:t>
+            </w:r>
+            <w:proofErr w:type="spellEnd"/>
+            <w:r>
+              <w:t>}</w:t>
             </w:r>
           </w:p>
         </w:tc>
@@ -3366,11 +3843,16 @@
             <w:r>
               <w:t>{</w:t>
             </w:r>
+            <w:proofErr w:type="spellStart"/>
             <w:r>
               <w:t>infiltr</w:t>
             </w:r>
             <w:r>
-              <w:t>_with_measures}</w:t>
+              <w:t>_with_measures</w:t>
+            </w:r>
+            <w:proofErr w:type="spellEnd"/>
+            <w:r>
+              <w:t>}</w:t>
             </w:r>
           </w:p>
         </w:tc>
@@ -3400,11 +3882,16 @@
             <w:r>
               <w:t>{</w:t>
             </w:r>
+            <w:proofErr w:type="spellStart"/>
             <w:r>
               <w:t>evapor</w:t>
             </w:r>
             <w:r>
-              <w:t>_status_quo}</w:t>
+              <w:t>_status_quo</w:t>
+            </w:r>
+            <w:proofErr w:type="spellEnd"/>
+            <w:r>
+              <w:t>}</w:t>
             </w:r>
           </w:p>
         </w:tc>
@@ -3419,11 +3906,16 @@
             <w:r>
               <w:t>{</w:t>
             </w:r>
+            <w:proofErr w:type="spellStart"/>
             <w:r>
               <w:t>evapor</w:t>
             </w:r>
             <w:r>
-              <w:t>_with_measures}</w:t>
+              <w:t>_with_measures</w:t>
+            </w:r>
+            <w:proofErr w:type="spellEnd"/>
+            <w:r>
+              <w:t>}</w:t>
             </w:r>
           </w:p>
         </w:tc>
@@ -3452,7 +3944,25 @@
           <w:sz w:val="24"/>
           <w:szCs w:val="24"/>
         </w:rPr>
-        <w:t>Für den ausgewählten Projektbereich berechnet das Modell ABIMO die drei Komponenten des Wasserhaushalts in Millimetern pro Jahr: den kanalisierten Oberflächenabfluss, die Evapotranspiration – also die Verdunstung über Oberflächen und Pflanzen – sowie die Versickerung.</w:t>
+        <w:t xml:space="preserve">Für den ausgewählten Projektbereich berechnet das Modell ABIMO die drei Komponenten des Wasserhaushalts in Millimetern pro Jahr: den kanalisierten Oberflächenabfluss, die </w:t>
+      </w:r>
+      <w:proofErr w:type="spellStart"/>
+      <w:r>
+        <w:rPr>
+          <w:rFonts w:ascii="Arthouse Owned Medium" w:hAnsi="Arthouse Owned Medium"/>
+          <w:sz w:val="24"/>
+          <w:szCs w:val="24"/>
+        </w:rPr>
+        <w:t>Evapotranspiration</w:t>
+      </w:r>
+      <w:proofErr w:type="spellEnd"/>
+      <w:r>
+        <w:rPr>
+          <w:rFonts w:ascii="Arthouse Owned Medium" w:hAnsi="Arthouse Owned Medium"/>
+          <w:sz w:val="24"/>
+          <w:szCs w:val="24"/>
+        </w:rPr>
+        <w:t xml:space="preserve"> – also die Verdunstung über Oberflächen und Pflanzen – sowie die Versickerung.</w:t>
       </w:r>
     </w:p>
     <w:p>
@@ -3657,9 +4167,11 @@
             <w:r>
               <w:t>{</w:t>
             </w:r>
+            <w:proofErr w:type="spellStart"/>
             <w:r>
               <w:t>runoffReduction</w:t>
             </w:r>
+            <w:proofErr w:type="spellEnd"/>
             <w:r>
               <w:t>}</w:t>
             </w:r>
@@ -3694,9 +4206,11 @@
             <w:r>
               <w:t>{</w:t>
             </w:r>
+            <w:proofErr w:type="spellStart"/>
             <w:r>
               <w:t>overflow_volume_status_quo</w:t>
             </w:r>
+            <w:proofErr w:type="spellEnd"/>
             <w:r>
               <w:t>}</w:t>
             </w:r>
@@ -3713,11 +4227,16 @@
             <w:r>
               <w:t>{</w:t>
             </w:r>
+            <w:proofErr w:type="spellStart"/>
             <w:r>
               <w:t>overflow_volume_s</w:t>
             </w:r>
             <w:r>
-              <w:t>imulation}</w:t>
+              <w:t>imulation</w:t>
+            </w:r>
+            <w:proofErr w:type="spellEnd"/>
+            <w:r>
+              <w:t>}</w:t>
             </w:r>
           </w:p>
         </w:tc>
@@ -3750,9 +4269,11 @@
             <w:r>
               <w:t>{</w:t>
             </w:r>
+            <w:proofErr w:type="spellStart"/>
             <w:r>
               <w:t>critical_hours_status_quo</w:t>
             </w:r>
+            <w:proofErr w:type="spellEnd"/>
             <w:r>
               <w:t>}</w:t>
             </w:r>
@@ -3769,9 +4290,11 @@
             <w:r>
               <w:t>{</w:t>
             </w:r>
+            <w:proofErr w:type="spellStart"/>
             <w:r>
               <w:t>critical_hours_simulation</w:t>
             </w:r>
+            <w:proofErr w:type="spellEnd"/>
             <w:r>
               <w:t>}</w:t>
             </w:r>
@@ -3815,9 +4338,11 @@
             <w:r>
               <w:t>{</w:t>
             </w:r>
+            <w:proofErr w:type="spellStart"/>
             <w:r>
               <w:t>critical_events_status_quo</w:t>
             </w:r>
+            <w:proofErr w:type="spellEnd"/>
             <w:r>
               <w:t>}</w:t>
             </w:r>
@@ -3834,9 +4359,11 @@
             <w:r>
               <w:t>{</w:t>
             </w:r>
+            <w:proofErr w:type="spellStart"/>
             <w:r>
               <w:t>critical_events_simulation</w:t>
             </w:r>
+            <w:proofErr w:type="spellEnd"/>
             <w:r>
               <w:t>}</w:t>
             </w:r>
@@ -3874,7 +4401,35 @@
         <w:rPr>
           <w:rFonts w:ascii="Arthouse Owned Medium" w:hAnsi="Arthouse Owned Medium"/>
         </w:rPr>
-        <w:t>Grundlage sind umfangreiche hydrodynamische Simulationen des Berliner Mischwassersystems mit den Modellen InfoWorks ICM, GERRIS, HYDRAX und QSim.</w:t>
+        <w:t xml:space="preserve">Grundlage sind umfangreiche hydrodynamische Simulationen des Berliner Mischwassersystems mit den Modellen </w:t>
+      </w:r>
+      <w:proofErr w:type="spellStart"/>
+      <w:r>
+        <w:rPr>
+          <w:rFonts w:ascii="Arthouse Owned Medium" w:hAnsi="Arthouse Owned Medium"/>
+        </w:rPr>
+        <w:t>InfoWorks</w:t>
+      </w:r>
+      <w:proofErr w:type="spellEnd"/>
+      <w:r>
+        <w:rPr>
+          <w:rFonts w:ascii="Arthouse Owned Medium" w:hAnsi="Arthouse Owned Medium"/>
+        </w:rPr>
+        <w:t xml:space="preserve"> ICM, GERRIS, HYDRAX und </w:t>
+      </w:r>
+      <w:proofErr w:type="spellStart"/>
+      <w:r>
+        <w:rPr>
+          <w:rFonts w:ascii="Arthouse Owned Medium" w:hAnsi="Arthouse Owned Medium"/>
+        </w:rPr>
+        <w:t>QSim</w:t>
+      </w:r>
+      <w:proofErr w:type="spellEnd"/>
+      <w:r>
+        <w:rPr>
+          <w:rFonts w:ascii="Arthouse Owned Medium" w:hAnsi="Arthouse Owned Medium"/>
+        </w:rPr>
+        <w:t>.</w:t>
       </w:r>
     </w:p>
     <w:p>
@@ -4025,14 +4580,29 @@
         <w:rPr>
           <w:rFonts w:ascii="Arthouse Owned Medium" w:hAnsi="Arthouse Owned Medium"/>
         </w:rPr>
+        <w:t>Unterschreitungsdauer - Simuliert</w:t>
+      </w:r>
+    </w:p>
+    <w:p>
+      <w:pPr>
+        <w:rPr>
+          <w:rFonts w:ascii="Arthouse Owned Medium" w:hAnsi="Arthouse Owned Medium"/>
+        </w:rPr>
+      </w:pPr>
+      <w:r>
+        <w:rPr>
+          <w:rFonts w:ascii="Arthouse Owned Medium" w:hAnsi="Arthouse Owned Medium"/>
+        </w:rPr>
         <w:t>{%</w:t>
       </w:r>
+      <w:proofErr w:type="spellStart"/>
       <w:r>
         <w:rPr>
           <w:rFonts w:ascii="Arthouse Owned Medium" w:hAnsi="Arthouse Owned Medium"/>
         </w:rPr>
         <w:t>plot_critical_hours</w:t>
       </w:r>
+      <w:proofErr w:type="spellEnd"/>
       <w:r>
         <w:rPr>
           <w:rFonts w:ascii="Arthouse Owned Medium" w:hAnsi="Arthouse Owned Medium"/>
@@ -4044,43 +4614,335 @@
       <w:pPr>
         <w:rPr>
           <w:rFonts w:ascii="Arthouse Owned Medium" w:hAnsi="Arthouse Owned Medium"/>
-          <w:lang w:val="en-US"/>
-        </w:rPr>
-      </w:pPr>
-      <w:r>
-        <w:rPr>
-          <w:rFonts w:ascii="Arthouse Owned Medium" w:hAnsi="Arthouse Owned Medium"/>
-          <w:lang w:val="en-US"/>
+        </w:rPr>
+      </w:pPr>
+      <w:r>
+        <w:rPr>
+          <w:rFonts w:ascii="Arthouse Owned Medium" w:hAnsi="Arthouse Owned Medium"/>
+        </w:rPr>
+        <w:t xml:space="preserve">Unterschreitungsdauer </w:t>
+      </w:r>
+      <w:r>
+        <w:rPr>
+          <w:rFonts w:ascii="Arthouse Owned Medium" w:hAnsi="Arthouse Owned Medium"/>
+        </w:rPr>
+        <w:t>–</w:t>
+      </w:r>
+      <w:r>
+        <w:rPr>
+          <w:rFonts w:ascii="Arthouse Owned Medium" w:hAnsi="Arthouse Owned Medium"/>
+        </w:rPr>
+        <w:t xml:space="preserve"> </w:t>
+      </w:r>
+      <w:r>
+        <w:rPr>
+          <w:rFonts w:ascii="Arthouse Owned Medium" w:hAnsi="Arthouse Owned Medium"/>
+        </w:rPr>
+        <w:t>Ist-Zustand</w:t>
+      </w:r>
+    </w:p>
+    <w:p>
+      <w:pPr>
+        <w:spacing w:line="240" w:lineRule="auto"/>
+        <w:rPr>
+          <w:rFonts w:ascii="Arthouse Owned Medium" w:hAnsi="Arthouse Owned Medium"/>
+          <w:sz w:val="48"/>
+          <w:szCs w:val="48"/>
+        </w:rPr>
+      </w:pPr>
+      <w:r>
+        <w:rPr>
+          <w:rFonts w:ascii="Arthouse Owned Medium" w:hAnsi="Arthouse Owned Medium"/>
+          <w:noProof/>
+          <w:sz w:val="48"/>
+          <w:szCs w:val="48"/>
+        </w:rPr>
+        <w:drawing>
+          <wp:inline distT="0" distB="0" distL="0" distR="0" wp14:anchorId="0CCD3C11" wp14:editId="12AF39A1">
+            <wp:extent cx="6645910" cy="4430395"/>
+            <wp:effectExtent l="0" t="0" r="0" b="1905"/>
+            <wp:docPr id="877336374" name="Picture 3"/>
+            <wp:cNvGraphicFramePr>
+              <a:graphicFrameLocks xmlns:a="http://schemas.openxmlformats.org/drawingml/2006/main" noChangeAspect="1"/>
+            </wp:cNvGraphicFramePr>
+            <a:graphic xmlns:a="http://schemas.openxmlformats.org/drawingml/2006/main">
+              <a:graphicData uri="http://schemas.openxmlformats.org/drawingml/2006/picture">
+                <pic:pic xmlns:pic="http://schemas.openxmlformats.org/drawingml/2006/picture">
+                  <pic:nvPicPr>
+                    <pic:cNvPr id="877336374" name="Picture 877336374"/>
+                    <pic:cNvPicPr/>
+                  </pic:nvPicPr>
+                  <pic:blipFill>
+                    <a:blip r:embed="rId8" cstate="print">
+                      <a:extLst>
+                        <a:ext uri="{28A0092B-C50C-407E-A947-70E740481C1C}">
+                          <a14:useLocalDpi xmlns:a14="http://schemas.microsoft.com/office/drawing/2010/main" val="0"/>
+                        </a:ext>
+                      </a:extLst>
+                    </a:blip>
+                    <a:stretch>
+                      <a:fillRect/>
+                    </a:stretch>
+                  </pic:blipFill>
+                  <pic:spPr>
+                    <a:xfrm>
+                      <a:off x="0" y="0"/>
+                      <a:ext cx="6645910" cy="4430395"/>
+                    </a:xfrm>
+                    <a:prstGeom prst="rect">
+                      <a:avLst/>
+                    </a:prstGeom>
+                  </pic:spPr>
+                </pic:pic>
+              </a:graphicData>
+            </a:graphic>
+          </wp:inline>
+        </w:drawing>
+      </w:r>
+    </w:p>
+    <w:p>
+      <w:pPr>
+        <w:spacing w:line="240" w:lineRule="auto"/>
+        <w:rPr>
+          <w:rFonts w:ascii="Arthouse Owned Medium" w:hAnsi="Arthouse Owned Medium"/>
+          <w:sz w:val="48"/>
+          <w:szCs w:val="48"/>
+        </w:rPr>
+      </w:pPr>
+    </w:p>
+    <w:p>
+      <w:pPr>
+        <w:spacing w:line="240" w:lineRule="auto"/>
+        <w:rPr>
+          <w:rFonts w:ascii="Arthouse Owned Medium" w:hAnsi="Arthouse Owned Medium"/>
+          <w:sz w:val="48"/>
+          <w:szCs w:val="48"/>
+        </w:rPr>
+      </w:pPr>
+    </w:p>
+    <w:p>
+      <w:pPr>
+        <w:spacing w:line="240" w:lineRule="auto"/>
+        <w:rPr>
+          <w:rFonts w:ascii="Arthouse Owned Medium" w:hAnsi="Arthouse Owned Medium"/>
+          <w:sz w:val="48"/>
+          <w:szCs w:val="48"/>
+        </w:rPr>
+      </w:pPr>
+    </w:p>
+    <w:p>
+      <w:pPr>
+        <w:spacing w:line="240" w:lineRule="auto"/>
+        <w:rPr>
+          <w:rFonts w:ascii="Arthouse Owned Medium" w:hAnsi="Arthouse Owned Medium"/>
+          <w:sz w:val="48"/>
+          <w:szCs w:val="48"/>
+        </w:rPr>
+      </w:pPr>
+    </w:p>
+    <w:p>
+      <w:pPr>
+        <w:spacing w:line="240" w:lineRule="auto"/>
+        <w:rPr>
+          <w:rFonts w:ascii="Arthouse Owned Medium" w:hAnsi="Arthouse Owned Medium"/>
+          <w:sz w:val="48"/>
+          <w:szCs w:val="48"/>
+        </w:rPr>
+      </w:pPr>
+    </w:p>
+    <w:p>
+      <w:pPr>
+        <w:spacing w:line="240" w:lineRule="auto"/>
+        <w:rPr>
+          <w:rFonts w:ascii="Arthouse Owned Medium" w:hAnsi="Arthouse Owned Medium"/>
+          <w:sz w:val="48"/>
+          <w:szCs w:val="48"/>
+        </w:rPr>
+      </w:pPr>
+    </w:p>
+    <w:p>
+      <w:pPr>
+        <w:spacing w:line="240" w:lineRule="auto"/>
+        <w:rPr>
+          <w:rFonts w:ascii="Arthouse Owned Medium" w:hAnsi="Arthouse Owned Medium"/>
+          <w:sz w:val="48"/>
+          <w:szCs w:val="48"/>
+        </w:rPr>
+      </w:pPr>
+      <w:r>
+        <w:rPr>
+          <w:rFonts w:ascii="Arthouse Owned Medium" w:hAnsi="Arthouse Owned Medium"/>
+          <w:sz w:val="48"/>
+          <w:szCs w:val="48"/>
+        </w:rPr>
+        <w:lastRenderedPageBreak/>
+        <w:t>Effektbewertung Gewässerschutz</w:t>
+      </w:r>
+    </w:p>
+    <w:p>
+      <w:pPr>
+        <w:rPr>
+          <w:rFonts w:ascii="Arthouse Owned Medium" w:hAnsi="Arthouse Owned Medium"/>
+        </w:rPr>
+      </w:pPr>
+      <w:r>
+        <w:rPr>
+          <w:rFonts w:ascii="Arthouse Owned Medium" w:hAnsi="Arthouse Owned Medium"/>
+        </w:rPr>
+        <w:t>Kritische</w:t>
+      </w:r>
+      <w:r>
+        <w:rPr>
+          <w:rFonts w:ascii="Arthouse Owned Medium" w:hAnsi="Arthouse Owned Medium"/>
+        </w:rPr>
+        <w:t xml:space="preserve"> </w:t>
+      </w:r>
+      <w:r>
+        <w:rPr>
+          <w:rFonts w:ascii="Arthouse Owned Medium" w:hAnsi="Arthouse Owned Medium"/>
+        </w:rPr>
+        <w:t>Ereignisse</w:t>
+      </w:r>
+      <w:r>
+        <w:rPr>
+          <w:rFonts w:ascii="Arthouse Owned Medium" w:hAnsi="Arthouse Owned Medium"/>
+        </w:rPr>
+        <w:t xml:space="preserve"> - Simuliert</w:t>
+      </w:r>
+    </w:p>
+    <w:p>
+      <w:pPr>
+        <w:rPr>
+          <w:rFonts w:ascii="Arthouse Owned Medium" w:hAnsi="Arthouse Owned Medium"/>
+        </w:rPr>
+      </w:pPr>
+      <w:r>
+        <w:rPr>
+          <w:rFonts w:ascii="Arthouse Owned Medium" w:hAnsi="Arthouse Owned Medium"/>
         </w:rPr>
         <w:t>{%</w:t>
       </w:r>
-      <w:r>
-        <w:rPr>
-          <w:rFonts w:ascii="Arthouse Owned Medium" w:hAnsi="Arthouse Owned Medium"/>
-          <w:lang w:val="en-US"/>
+      <w:proofErr w:type="spellStart"/>
+      <w:r>
+        <w:rPr>
+          <w:rFonts w:ascii="Arthouse Owned Medium" w:hAnsi="Arthouse Owned Medium"/>
         </w:rPr>
         <w:t>plot_critical_events</w:t>
       </w:r>
-      <w:r>
-        <w:rPr>
-          <w:rFonts w:ascii="Arthouse Owned Medium" w:hAnsi="Arthouse Owned Medium"/>
-          <w:lang w:val="en-US"/>
+      <w:proofErr w:type="spellEnd"/>
+      <w:r>
+        <w:rPr>
+          <w:rFonts w:ascii="Arthouse Owned Medium" w:hAnsi="Arthouse Owned Medium"/>
         </w:rPr>
         <w:t>}</w:t>
       </w:r>
     </w:p>
     <w:p>
       <w:pPr>
-        <w:spacing w:line="240" w:lineRule="auto"/>
-        <w:ind w:left="708"/>
-        <w:rPr>
-          <w:rFonts w:ascii="Arthouse Owned Medium" w:hAnsi="Arthouse Owned Medium"/>
-        </w:rPr>
-      </w:pPr>
+        <w:rPr>
+          <w:rFonts w:ascii="Arthouse Owned Medium" w:hAnsi="Arthouse Owned Medium"/>
+        </w:rPr>
+      </w:pPr>
+      <w:r>
+        <w:rPr>
+          <w:rFonts w:ascii="Arthouse Owned Medium" w:hAnsi="Arthouse Owned Medium"/>
+        </w:rPr>
+        <w:t>Kritische</w:t>
+      </w:r>
+      <w:r>
+        <w:rPr>
+          <w:rFonts w:ascii="Arthouse Owned Medium" w:hAnsi="Arthouse Owned Medium"/>
+        </w:rPr>
+        <w:t xml:space="preserve"> </w:t>
+      </w:r>
+      <w:r>
+        <w:rPr>
+          <w:rFonts w:ascii="Arthouse Owned Medium" w:hAnsi="Arthouse Owned Medium"/>
+        </w:rPr>
+        <w:t>Ereignisse</w:t>
+      </w:r>
+      <w:r>
+        <w:rPr>
+          <w:rFonts w:ascii="Arthouse Owned Medium" w:hAnsi="Arthouse Owned Medium"/>
+        </w:rPr>
+        <w:t xml:space="preserve"> - </w:t>
+      </w:r>
+      <w:r>
+        <w:rPr>
+          <w:rFonts w:ascii="Arthouse Owned Medium" w:hAnsi="Arthouse Owned Medium"/>
+        </w:rPr>
+        <w:t>Ist</w:t>
+      </w:r>
+      <w:r>
+        <w:rPr>
+          <w:rFonts w:ascii="Arthouse Owned Medium" w:hAnsi="Arthouse Owned Medium"/>
+        </w:rPr>
+        <w:t>-</w:t>
+      </w:r>
+      <w:r>
+        <w:rPr>
+          <w:rFonts w:ascii="Arthouse Owned Medium" w:hAnsi="Arthouse Owned Medium"/>
+        </w:rPr>
+        <w:t>Zustand</w:t>
+      </w:r>
+      <w:r>
+        <w:rPr>
+          <w:rFonts w:ascii="Arthouse Owned Medium" w:hAnsi="Arthouse Owned Medium"/>
+          <w:noProof/>
+        </w:rPr>
+        <w:t xml:space="preserve"> </w:t>
+      </w:r>
+      <w:r>
+        <w:rPr>
+          <w:rFonts w:ascii="Arthouse Owned Medium" w:hAnsi="Arthouse Owned Medium"/>
+          <w:noProof/>
+        </w:rPr>
+        <w:drawing>
+          <wp:inline distT="0" distB="0" distL="0" distR="0" wp14:anchorId="7FD8A15D" wp14:editId="6AFD4E3C">
+            <wp:extent cx="6645910" cy="4430395"/>
+            <wp:effectExtent l="0" t="0" r="0" b="1905"/>
+            <wp:docPr id="1927336746" name="Picture 4"/>
+            <wp:cNvGraphicFramePr>
+              <a:graphicFrameLocks xmlns:a="http://schemas.openxmlformats.org/drawingml/2006/main" noChangeAspect="1"/>
+            </wp:cNvGraphicFramePr>
+            <a:graphic xmlns:a="http://schemas.openxmlformats.org/drawingml/2006/main">
+              <a:graphicData uri="http://schemas.openxmlformats.org/drawingml/2006/picture">
+                <pic:pic xmlns:pic="http://schemas.openxmlformats.org/drawingml/2006/picture">
+                  <pic:nvPicPr>
+                    <pic:cNvPr id="1927336746" name="Picture 1927336746"/>
+                    <pic:cNvPicPr/>
+                  </pic:nvPicPr>
+                  <pic:blipFill>
+                    <a:blip r:embed="rId9" cstate="print">
+                      <a:extLst>
+                        <a:ext uri="{28A0092B-C50C-407E-A947-70E740481C1C}">
+                          <a14:useLocalDpi xmlns:a14="http://schemas.microsoft.com/office/drawing/2010/main" val="0"/>
+                        </a:ext>
+                      </a:extLst>
+                    </a:blip>
+                    <a:stretch>
+                      <a:fillRect/>
+                    </a:stretch>
+                  </pic:blipFill>
+                  <pic:spPr>
+                    <a:xfrm>
+                      <a:off x="0" y="0"/>
+                      <a:ext cx="6645910" cy="4430395"/>
+                    </a:xfrm>
+                    <a:prstGeom prst="rect">
+                      <a:avLst/>
+                    </a:prstGeom>
+                  </pic:spPr>
+                </pic:pic>
+              </a:graphicData>
+            </a:graphic>
+          </wp:inline>
+        </w:drawing>
+      </w:r>
     </w:p>
     <w:sectPr>
-      <w:headerReference w:type="default" r:id="rId8"/>
-      <w:footerReference w:type="default" r:id="rId9"/>
+      <w:headerReference w:type="default" r:id="rId10"/>
+      <w:footerReference w:type="default" r:id="rId11"/>
       <w:pgSz w:w="11906" w:h="16838"/>
       <w:pgMar w:top="720" w:right="720" w:bottom="720" w:left="720" w:header="567" w:footer="567" w:gutter="0"/>
       <w:cols w:space="708"/>
@@ -4249,12 +5111,21 @@
                               <w:szCs w:val="36"/>
                             </w:rPr>
                           </w:pPr>
+                          <w:proofErr w:type="spellStart"/>
                           <w:r>
                             <w:rPr>
                               <w:sz w:val="36"/>
                               <w:szCs w:val="36"/>
                             </w:rPr>
-                            <w:t>SmartWater BGI-Planer</w:t>
+                            <w:t>SmartWater</w:t>
+                          </w:r>
+                          <w:proofErr w:type="spellEnd"/>
+                          <w:r>
+                            <w:rPr>
+                              <w:sz w:val="36"/>
+                              <w:szCs w:val="36"/>
+                            </w:rPr>
+                            <w:t xml:space="preserve"> BGI-Planer</w:t>
                           </w:r>
                         </w:p>
                       </w:txbxContent>
@@ -4322,7 +5193,25 @@
         <w:szCs w:val="36"/>
         <w:lang w:val="en-US"/>
       </w:rPr>
-      <w:t>{project_name}</w:t>
+      <w:t>{</w:t>
+    </w:r>
+    <w:proofErr w:type="spellStart"/>
+    <w:r>
+      <w:rPr>
+        <w:sz w:val="36"/>
+        <w:szCs w:val="36"/>
+        <w:lang w:val="en-US"/>
+      </w:rPr>
+      <w:t>project_name</w:t>
+    </w:r>
+    <w:proofErr w:type="spellEnd"/>
+    <w:r>
+      <w:rPr>
+        <w:sz w:val="36"/>
+        <w:szCs w:val="36"/>
+        <w:lang w:val="en-US"/>
+      </w:rPr>
+      <w:t>}</w:t>
     </w:r>
   </w:p>
   <w:p>

</xml_diff>

<commit_message>
fix: small text changes and smaller plots in report
</commit_message>
<xml_diff>
--- a/src/templates/report.docx
+++ b/src/templates/report.docx
@@ -204,16 +204,8 @@
     <w:p>
       <w:pPr>
         <w:pStyle w:val="ListParagraph"/>
-        <w:numPr>
-          <w:ilvl w:val="0"/>
-          <w:numId w:val="1"/>
-        </w:numPr>
-      </w:pPr>
-      <w:r>
-        <w:t>Notizen</w:t>
-      </w:r>
-    </w:p>
-    <w:p/>
+      </w:pPr>
+    </w:p>
     <w:p>
       <w:pPr>
         <w:pStyle w:val="BodyboldBGI"/>
@@ -227,13 +219,14 @@
         <w:pStyle w:val="BodytextBGI"/>
       </w:pPr>
       <w:r>
-        <w:t>Die hier abgebildete Information und Berechnungen sind als erster und unverbindlicher Einschätzung zu verstehen. Fehler sind grundsätzlich nicht auszuschließen. Dieses Dokument ist kein Ersatz für einen professionellen Fachgutachten. (Platzhalter Text erstmal)</w:t>
-      </w:r>
-    </w:p>
-    <w:p>
-      <w:pPr>
-        <w:pStyle w:val="BodytextBGI"/>
-      </w:pPr>
+        <w:t>Die hier abgebildeten Informationen und Effektbewertungen sind als unverbindliche Einschätzung zu verstehen. Fehler sind grundsätzlich nicht auszuschließen. Dieses</w:t>
+      </w:r>
+      <w:r>
+        <w:t xml:space="preserve"> </w:t>
+      </w:r>
+      <w:r>
+        <w:t>Dokument ersetzt kein professionelles Fachgutachten.</w:t>
+      </w:r>
     </w:p>
     <w:p>
       <w:pPr>
@@ -4017,7 +4010,7 @@
           <w:sz w:val="24"/>
           <w:szCs w:val="24"/>
         </w:rPr>
-        <w:t>obigen</w:t>
+        <w:t xml:space="preserve">obige Tabelle </w:t>
       </w:r>
       <w:r>
         <w:rPr>
@@ -4025,15 +4018,24 @@
           <w:sz w:val="24"/>
           <w:szCs w:val="24"/>
         </w:rPr>
-        <w:t> Grafiken zeigen, wie die geplanten Maßnahmen den Wasserhaushalt verbessern und den ΔW-Wert verringern. Die Werte der einzelnen ausgewählten Blockteilflächen werden dabei zu einem flächengewichteten Mittelwert zusammengefasst.</w:t>
-      </w:r>
-    </w:p>
-    <w:p>
-      <w:pPr>
-        <w:rPr>
-          <w:rFonts w:ascii="Arthouse Owned Medium" w:hAnsi="Arthouse Owned Medium"/>
-        </w:rPr>
-      </w:pPr>
+        <w:t>zeig</w:t>
+      </w:r>
+      <w:r>
+        <w:rPr>
+          <w:rFonts w:ascii="Arthouse Owned Medium" w:hAnsi="Arthouse Owned Medium"/>
+          <w:sz w:val="24"/>
+          <w:szCs w:val="24"/>
+        </w:rPr>
+        <w:t>t</w:t>
+      </w:r>
+      <w:r>
+        <w:rPr>
+          <w:rFonts w:ascii="Arthouse Owned Medium" w:hAnsi="Arthouse Owned Medium"/>
+          <w:sz w:val="24"/>
+          <w:szCs w:val="24"/>
+        </w:rPr>
+        <w:t>, wie die geplanten Maßnahmen den Wasserhaushalt verbessern und den ΔW-Wert verringern. Die Werte der einzelnen ausgewählten Blockteilflächen werden dabei zu einem flächengewichteten Mittelwert zusammengefasst.</w:t>
+      </w:r>
       <w:r>
         <w:rPr>
           <w:rFonts w:ascii="Arthouse Owned Medium" w:hAnsi="Arthouse Owned Medium"/>
@@ -4537,13 +4539,6 @@
         </w:rPr>
         <w:t>wasserüberläufe.</w:t>
       </w:r>
-    </w:p>
-    <w:p>
-      <w:pPr>
-        <w:rPr>
-          <w:rFonts w:ascii="Arthouse Owned Medium" w:hAnsi="Arthouse Owned Medium"/>
-        </w:rPr>
-      </w:pPr>
       <w:r>
         <w:rPr>
           <w:rFonts w:ascii="Arthouse Owned Medium" w:hAnsi="Arthouse Owned Medium"/>
@@ -4620,25 +4615,7 @@
         <w:rPr>
           <w:rFonts w:ascii="Arthouse Owned Medium" w:hAnsi="Arthouse Owned Medium"/>
         </w:rPr>
-        <w:t xml:space="preserve">Unterschreitungsdauer </w:t>
-      </w:r>
-      <w:r>
-        <w:rPr>
-          <w:rFonts w:ascii="Arthouse Owned Medium" w:hAnsi="Arthouse Owned Medium"/>
-        </w:rPr>
-        <w:t>–</w:t>
-      </w:r>
-      <w:r>
-        <w:rPr>
-          <w:rFonts w:ascii="Arthouse Owned Medium" w:hAnsi="Arthouse Owned Medium"/>
-        </w:rPr>
-        <w:t xml:space="preserve"> </w:t>
-      </w:r>
-      <w:r>
-        <w:rPr>
-          <w:rFonts w:ascii="Arthouse Owned Medium" w:hAnsi="Arthouse Owned Medium"/>
-        </w:rPr>
-        <w:t>Ist-Zustand</w:t>
+        <w:t>Unterschreitungsdauer – Ist-Zustand</w:t>
       </w:r>
     </w:p>
     <w:p>
@@ -4658,9 +4635,9 @@
           <w:szCs w:val="48"/>
         </w:rPr>
         <w:drawing>
-          <wp:inline distT="0" distB="0" distL="0" distR="0" wp14:anchorId="0CCD3C11" wp14:editId="12AF39A1">
-            <wp:extent cx="6645910" cy="4430395"/>
-            <wp:effectExtent l="0" t="0" r="0" b="1905"/>
+          <wp:inline distT="0" distB="0" distL="0" distR="0" wp14:anchorId="0CCD3C11" wp14:editId="614CBF1E">
+            <wp:extent cx="5486400" cy="3657425"/>
+            <wp:effectExtent l="0" t="0" r="0" b="635"/>
             <wp:docPr id="877336374" name="Picture 3"/>
             <wp:cNvGraphicFramePr>
               <a:graphicFrameLocks xmlns:a="http://schemas.openxmlformats.org/drawingml/2006/main" noChangeAspect="1"/>
@@ -4687,7 +4664,7 @@
                   <pic:spPr>
                     <a:xfrm>
                       <a:off x="0" y="0"/>
-                      <a:ext cx="6645910" cy="4430395"/>
+                      <a:ext cx="5597019" cy="3731167"/>
                     </a:xfrm>
                     <a:prstGeom prst="rect">
                       <a:avLst/>
@@ -4769,12 +4746,22 @@
           <w:szCs w:val="48"/>
         </w:rPr>
       </w:pPr>
-      <w:r>
+    </w:p>
+    <w:p>
+      <w:pPr>
+        <w:spacing w:line="240" w:lineRule="auto"/>
         <w:rPr>
           <w:rFonts w:ascii="Arthouse Owned Medium" w:hAnsi="Arthouse Owned Medium"/>
           <w:sz w:val="48"/>
           <w:szCs w:val="48"/>
         </w:rPr>
+      </w:pPr>
+      <w:r>
+        <w:rPr>
+          <w:rFonts w:ascii="Arthouse Owned Medium" w:hAnsi="Arthouse Owned Medium"/>
+          <w:sz w:val="48"/>
+          <w:szCs w:val="48"/>
+        </w:rPr>
         <w:lastRenderedPageBreak/>
         <w:t>Effektbewertung Gewässerschutz</w:t>
       </w:r>
@@ -4898,9 +4885,9 @@
           <w:noProof/>
         </w:rPr>
         <w:drawing>
-          <wp:inline distT="0" distB="0" distL="0" distR="0" wp14:anchorId="7FD8A15D" wp14:editId="6AFD4E3C">
-            <wp:extent cx="6645910" cy="4430395"/>
-            <wp:effectExtent l="0" t="0" r="0" b="1905"/>
+          <wp:inline distT="0" distB="0" distL="0" distR="0" wp14:anchorId="7FD8A15D" wp14:editId="25B30ED5">
+            <wp:extent cx="5486662" cy="3657600"/>
+            <wp:effectExtent l="0" t="0" r="0" b="0"/>
             <wp:docPr id="1927336746" name="Picture 4"/>
             <wp:cNvGraphicFramePr>
               <a:graphicFrameLocks xmlns:a="http://schemas.openxmlformats.org/drawingml/2006/main" noChangeAspect="1"/>
@@ -4927,7 +4914,7 @@
                   <pic:spPr>
                     <a:xfrm>
                       <a:off x="0" y="0"/>
-                      <a:ext cx="6645910" cy="4430395"/>
+                      <a:ext cx="5506726" cy="3670975"/>
                     </a:xfrm>
                     <a:prstGeom prst="rect">
                       <a:avLst/>
@@ -5064,15 +5051,15 @@
       <mc:AlternateContent>
         <mc:Choice Requires="wps">
           <w:drawing>
-            <wp:anchor distT="45720" distB="45720" distL="114300" distR="114300" simplePos="0" relativeHeight="251658240" behindDoc="0" locked="0" layoutInCell="1" allowOverlap="1" wp14:anchorId="56368F1E" wp14:editId="6007D1C3">
+            <wp:anchor distT="45720" distB="45720" distL="114300" distR="114300" simplePos="0" relativeHeight="251659264" behindDoc="0" locked="0" layoutInCell="1" allowOverlap="1" wp14:anchorId="5DE1BDE6" wp14:editId="383F155E">
               <wp:simplePos x="0" y="0"/>
               <wp:positionH relativeFrom="margin">
                 <wp:align>right</wp:align>
               </wp:positionH>
               <wp:positionV relativeFrom="paragraph">
-                <wp:posOffset>-39370</wp:posOffset>
+                <wp:posOffset>-131445</wp:posOffset>
               </wp:positionV>
-              <wp:extent cx="3970655" cy="449580"/>
+              <wp:extent cx="3970655" cy="600075"/>
               <wp:effectExtent l="0" t="0" r="0" b="0"/>
               <wp:wrapSquare wrapText="bothSides"/>
               <wp:docPr id="217" name="Textfeld 2"/>
@@ -5088,7 +5075,7 @@
                     <wps:spPr bwMode="auto">
                       <a:xfrm>
                         <a:off x="0" y="0"/>
-                        <a:ext cx="3970655" cy="449580"/>
+                        <a:ext cx="3970655" cy="600075"/>
                       </a:xfrm>
                       <a:prstGeom prst="rect">
                         <a:avLst/>
@@ -5111,21 +5098,60 @@
                               <w:szCs w:val="36"/>
                             </w:rPr>
                           </w:pPr>
-                          <w:proofErr w:type="spellStart"/>
                           <w:r>
                             <w:rPr>
+                              <w:noProof/>
                               <w:sz w:val="36"/>
                               <w:szCs w:val="36"/>
                             </w:rPr>
-                            <w:t>SmartWater</w:t>
-                          </w:r>
-                          <w:proofErr w:type="spellEnd"/>
-                          <w:r>
-                            <w:rPr>
-                              <w:sz w:val="36"/>
-                              <w:szCs w:val="36"/>
-                            </w:rPr>
-                            <w:t xml:space="preserve"> BGI-Planer</w:t>
+                            <w:drawing>
+                              <wp:inline distT="0" distB="0" distL="0" distR="0" wp14:anchorId="066E73B0" wp14:editId="5658EB7F">
+                                <wp:extent cx="2140036" cy="485775"/>
+                                <wp:effectExtent l="0" t="0" r="0" b="0"/>
+                                <wp:docPr id="1601853492" name="Grafik 2"/>
+                                <wp:cNvGraphicFramePr>
+                                  <a:graphicFrameLocks xmlns:a="http://schemas.openxmlformats.org/drawingml/2006/main" noChangeAspect="1"/>
+                                </wp:cNvGraphicFramePr>
+                                <a:graphic xmlns:a="http://schemas.openxmlformats.org/drawingml/2006/main">
+                                  <a:graphicData uri="http://schemas.openxmlformats.org/drawingml/2006/picture">
+                                    <pic:pic xmlns:pic="http://schemas.openxmlformats.org/drawingml/2006/picture">
+                                      <pic:nvPicPr>
+                                        <pic:cNvPr id="0" name="Picture 1"/>
+                                        <pic:cNvPicPr>
+                                          <a:picLocks noChangeAspect="1" noChangeArrowheads="1"/>
+                                        </pic:cNvPicPr>
+                                      </pic:nvPicPr>
+                                      <pic:blipFill>
+                                        <a:blip r:embed="rId1">
+                                          <a:extLst>
+                                            <a:ext uri="{28A0092B-C50C-407E-A947-70E740481C1C}">
+                                              <a14:useLocalDpi xmlns:a14="http://schemas.microsoft.com/office/drawing/2010/main" val="0"/>
+                                            </a:ext>
+                                          </a:extLst>
+                                        </a:blip>
+                                        <a:srcRect/>
+                                        <a:stretch>
+                                          <a:fillRect/>
+                                        </a:stretch>
+                                      </pic:blipFill>
+                                      <pic:spPr bwMode="auto">
+                                        <a:xfrm>
+                                          <a:off x="0" y="0"/>
+                                          <a:ext cx="2145813" cy="487086"/>
+                                        </a:xfrm>
+                                        <a:prstGeom prst="rect">
+                                          <a:avLst/>
+                                        </a:prstGeom>
+                                        <a:noFill/>
+                                        <a:ln>
+                                          <a:noFill/>
+                                        </a:ln>
+                                      </pic:spPr>
+                                    </pic:pic>
+                                  </a:graphicData>
+                                </a:graphic>
+                              </wp:inline>
+                            </w:drawing>
                           </w:r>
                         </w:p>
                       </w:txbxContent>
@@ -5145,13 +5171,13 @@
             </wp:anchor>
           </w:drawing>
         </mc:Choice>
-        <mc:Fallback xmlns:w16cei="http://schemas.microsoft.com/office/word/2026/wordml/cei">
+        <mc:Fallback>
           <w:pict>
-            <v:shapetype w14:anchorId="56368F1E" id="_x0000_t202" coordsize="21600,21600" o:spt="202" path="m,l,21600r21600,l21600,xe">
+            <v:shapetype w14:anchorId="5DE1BDE6" id="_x0000_t202" coordsize="21600,21600" o:spt="202" path="m,l,21600r21600,l21600,xe">
               <v:stroke joinstyle="miter"/>
               <v:path gradientshapeok="t" o:connecttype="rect"/>
             </v:shapetype>
-            <v:shape id="Textfeld 2" o:spid="_x0000_s1026" type="#_x0000_t202" style="position:absolute;margin-left:261.45pt;margin-top:-3.1pt;width:312.65pt;height:35.4pt;z-index:251658240;visibility:visible;mso-wrap-style:square;mso-width-percent:0;mso-height-percent:0;mso-wrap-distance-left:9pt;mso-wrap-distance-top:3.6pt;mso-wrap-distance-right:9pt;mso-wrap-distance-bottom:3.6pt;mso-position-horizontal:right;mso-position-horizontal-relative:margin;mso-position-vertical:absolute;mso-position-vertical-relative:text;mso-width-percent:0;mso-height-percent:0;mso-width-relative:margin;mso-height-relative:margin;v-text-anchor:middle" o:gfxdata="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" filled="f" stroked="f">
+            <v:shape id="Textfeld 2" o:spid="_x0000_s1026" type="#_x0000_t202" style="position:absolute;margin-left:261.45pt;margin-top:-10.35pt;width:312.65pt;height:47.25pt;z-index:251659264;visibility:visible;mso-wrap-style:square;mso-width-percent:0;mso-height-percent:0;mso-wrap-distance-left:9pt;mso-wrap-distance-top:3.6pt;mso-wrap-distance-right:9pt;mso-wrap-distance-bottom:3.6pt;mso-position-horizontal:right;mso-position-horizontal-relative:margin;mso-position-vertical:absolute;mso-position-vertical-relative:text;mso-width-percent:0;mso-height-percent:0;mso-width-relative:margin;mso-height-relative:margin;v-text-anchor:middle" o:gfxdata="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" filled="f" stroked="f">
               <v:textbox>
                 <w:txbxContent>
                   <w:p>
@@ -5162,21 +5188,60 @@
                         <w:szCs w:val="36"/>
                       </w:rPr>
                     </w:pPr>
-                    <w:proofErr w:type="spellStart"/>
                     <w:r>
                       <w:rPr>
+                        <w:noProof/>
                         <w:sz w:val="36"/>
                         <w:szCs w:val="36"/>
                       </w:rPr>
-                      <w:t>SmartWater</w:t>
-                    </w:r>
-                    <w:proofErr w:type="spellEnd"/>
-                    <w:r>
-                      <w:rPr>
-                        <w:sz w:val="36"/>
-                        <w:szCs w:val="36"/>
-                      </w:rPr>
-                      <w:t xml:space="preserve"> BGI-Planer</w:t>
+                      <w:drawing>
+                        <wp:inline distT="0" distB="0" distL="0" distR="0" wp14:anchorId="066E73B0" wp14:editId="5658EB7F">
+                          <wp:extent cx="2140036" cy="485775"/>
+                          <wp:effectExtent l="0" t="0" r="0" b="0"/>
+                          <wp:docPr id="1601853492" name="Grafik 2"/>
+                          <wp:cNvGraphicFramePr>
+                            <a:graphicFrameLocks xmlns:a="http://schemas.openxmlformats.org/drawingml/2006/main" noChangeAspect="1"/>
+                          </wp:cNvGraphicFramePr>
+                          <a:graphic xmlns:a="http://schemas.openxmlformats.org/drawingml/2006/main">
+                            <a:graphicData uri="http://schemas.openxmlformats.org/drawingml/2006/picture">
+                              <pic:pic xmlns:pic="http://schemas.openxmlformats.org/drawingml/2006/picture">
+                                <pic:nvPicPr>
+                                  <pic:cNvPr id="0" name="Picture 1"/>
+                                  <pic:cNvPicPr>
+                                    <a:picLocks noChangeAspect="1" noChangeArrowheads="1"/>
+                                  </pic:cNvPicPr>
+                                </pic:nvPicPr>
+                                <pic:blipFill>
+                                  <a:blip r:embed="rId1">
+                                    <a:extLst>
+                                      <a:ext uri="{28A0092B-C50C-407E-A947-70E740481C1C}">
+                                        <a14:useLocalDpi xmlns:a14="http://schemas.microsoft.com/office/drawing/2010/main" val="0"/>
+                                      </a:ext>
+                                    </a:extLst>
+                                  </a:blip>
+                                  <a:srcRect/>
+                                  <a:stretch>
+                                    <a:fillRect/>
+                                  </a:stretch>
+                                </pic:blipFill>
+                                <pic:spPr bwMode="auto">
+                                  <a:xfrm>
+                                    <a:off x="0" y="0"/>
+                                    <a:ext cx="2145813" cy="487086"/>
+                                  </a:xfrm>
+                                  <a:prstGeom prst="rect">
+                                    <a:avLst/>
+                                  </a:prstGeom>
+                                  <a:noFill/>
+                                  <a:ln>
+                                    <a:noFill/>
+                                  </a:ln>
+                                </pic:spPr>
+                              </pic:pic>
+                            </a:graphicData>
+                          </a:graphic>
+                        </wp:inline>
+                      </w:drawing>
                     </w:r>
                   </w:p>
                 </w:txbxContent>

</xml_diff>

<commit_message>
fix: page break in doc
</commit_message>
<xml_diff>
--- a/src/templates/report.docx
+++ b/src/templates/report.docx
@@ -4679,73 +4679,20 @@
     </w:p>
     <w:p>
       <w:pPr>
-        <w:spacing w:line="240" w:lineRule="auto"/>
         <w:rPr>
           <w:rFonts w:ascii="Arthouse Owned Medium" w:hAnsi="Arthouse Owned Medium"/>
           <w:sz w:val="48"/>
           <w:szCs w:val="48"/>
         </w:rPr>
       </w:pPr>
-    </w:p>
-    <w:p>
-      <w:pPr>
-        <w:spacing w:line="240" w:lineRule="auto"/>
+      <w:r>
         <w:rPr>
           <w:rFonts w:ascii="Arthouse Owned Medium" w:hAnsi="Arthouse Owned Medium"/>
           <w:sz w:val="48"/>
           <w:szCs w:val="48"/>
         </w:rPr>
-      </w:pPr>
-    </w:p>
-    <w:p>
-      <w:pPr>
-        <w:spacing w:line="240" w:lineRule="auto"/>
-        <w:rPr>
-          <w:rFonts w:ascii="Arthouse Owned Medium" w:hAnsi="Arthouse Owned Medium"/>
-          <w:sz w:val="48"/>
-          <w:szCs w:val="48"/>
-        </w:rPr>
-      </w:pPr>
-    </w:p>
-    <w:p>
-      <w:pPr>
-        <w:spacing w:line="240" w:lineRule="auto"/>
-        <w:rPr>
-          <w:rFonts w:ascii="Arthouse Owned Medium" w:hAnsi="Arthouse Owned Medium"/>
-          <w:sz w:val="48"/>
-          <w:szCs w:val="48"/>
-        </w:rPr>
-      </w:pPr>
-    </w:p>
-    <w:p>
-      <w:pPr>
-        <w:spacing w:line="240" w:lineRule="auto"/>
-        <w:rPr>
-          <w:rFonts w:ascii="Arthouse Owned Medium" w:hAnsi="Arthouse Owned Medium"/>
-          <w:sz w:val="48"/>
-          <w:szCs w:val="48"/>
-        </w:rPr>
-      </w:pPr>
-    </w:p>
-    <w:p>
-      <w:pPr>
-        <w:spacing w:line="240" w:lineRule="auto"/>
-        <w:rPr>
-          <w:rFonts w:ascii="Arthouse Owned Medium" w:hAnsi="Arthouse Owned Medium"/>
-          <w:sz w:val="48"/>
-          <w:szCs w:val="48"/>
-        </w:rPr>
-      </w:pPr>
-    </w:p>
-    <w:p>
-      <w:pPr>
-        <w:spacing w:line="240" w:lineRule="auto"/>
-        <w:rPr>
-          <w:rFonts w:ascii="Arthouse Owned Medium" w:hAnsi="Arthouse Owned Medium"/>
-          <w:sz w:val="48"/>
-          <w:szCs w:val="48"/>
-        </w:rPr>
-      </w:pPr>
+        <w:br w:type="page"/>
+      </w:r>
     </w:p>
     <w:p>
       <w:pPr>
@@ -5212,7 +5159,7 @@
                                   </pic:cNvPicPr>
                                 </pic:nvPicPr>
                                 <pic:blipFill>
-                                  <a:blip r:embed="rId1">
+                                  <a:blip r:embed="rId2">
                                     <a:extLst>
                                       <a:ext uri="{28A0092B-C50C-407E-A947-70E740481C1C}">
                                         <a14:useLocalDpi xmlns:a14="http://schemas.microsoft.com/office/drawing/2010/main" val="0"/>

</xml_diff>

<commit_message>
fix: change in doc
</commit_message>
<xml_diff>
--- a/src/templates/report.docx
+++ b/src/templates/report.docx
@@ -4691,95 +4691,78 @@
           <w:sz w:val="48"/>
           <w:szCs w:val="48"/>
         </w:rPr>
-        <w:br w:type="page"/>
+        <w:t>Effektbewertung Gewässerschutz</w:t>
       </w:r>
     </w:p>
     <w:p>
       <w:pPr>
         <w:rPr>
           <w:rFonts w:ascii="Arthouse Owned Medium" w:hAnsi="Arthouse Owned Medium"/>
-          <w:sz w:val="48"/>
-          <w:szCs w:val="48"/>
         </w:rPr>
       </w:pPr>
       <w:r>
         <w:rPr>
           <w:rFonts w:ascii="Arthouse Owned Medium" w:hAnsi="Arthouse Owned Medium"/>
-          <w:sz w:val="48"/>
-          <w:szCs w:val="48"/>
+        </w:rPr>
+        <w:t>Kritische</w:t>
+      </w:r>
+      <w:r>
+        <w:rPr>
+          <w:rFonts w:ascii="Arthouse Owned Medium" w:hAnsi="Arthouse Owned Medium"/>
+        </w:rPr>
+        <w:t xml:space="preserve"> </w:t>
+      </w:r>
+      <w:r>
+        <w:rPr>
+          <w:rFonts w:ascii="Arthouse Owned Medium" w:hAnsi="Arthouse Owned Medium"/>
+        </w:rPr>
+        <w:t>Ereignisse</w:t>
+      </w:r>
+      <w:r>
+        <w:rPr>
+          <w:rFonts w:ascii="Arthouse Owned Medium" w:hAnsi="Arthouse Owned Medium"/>
+        </w:rPr>
+        <w:t xml:space="preserve"> - Simuliert</w:t>
+      </w:r>
+    </w:p>
+    <w:p>
+      <w:pPr>
+        <w:rPr>
+          <w:rFonts w:ascii="Arthouse Owned Medium" w:hAnsi="Arthouse Owned Medium"/>
+        </w:rPr>
+      </w:pPr>
+      <w:r>
+        <w:rPr>
+          <w:rFonts w:ascii="Arthouse Owned Medium" w:hAnsi="Arthouse Owned Medium"/>
+        </w:rPr>
+        <w:t>{%</w:t>
+      </w:r>
+      <w:proofErr w:type="spellStart"/>
+      <w:r>
+        <w:rPr>
+          <w:rFonts w:ascii="Arthouse Owned Medium" w:hAnsi="Arthouse Owned Medium"/>
+        </w:rPr>
+        <w:t>plot_critical_events</w:t>
+      </w:r>
+      <w:proofErr w:type="spellEnd"/>
+      <w:r>
+        <w:rPr>
+          <w:rFonts w:ascii="Arthouse Owned Medium" w:hAnsi="Arthouse Owned Medium"/>
+        </w:rPr>
+        <w:t>}</w:t>
+      </w:r>
+    </w:p>
+    <w:p>
+      <w:pPr>
+        <w:rPr>
+          <w:rFonts w:ascii="Arthouse Owned Medium" w:hAnsi="Arthouse Owned Medium"/>
+        </w:rPr>
+      </w:pPr>
+      <w:r>
+        <w:rPr>
+          <w:rFonts w:ascii="Arthouse Owned Medium" w:hAnsi="Arthouse Owned Medium"/>
         </w:rPr>
         <w:lastRenderedPageBreak/>
-        <w:t>Effektbewertung Gewässerschutz</w:t>
-      </w:r>
-    </w:p>
-    <w:p>
-      <w:pPr>
-        <w:rPr>
-          <w:rFonts w:ascii="Arthouse Owned Medium" w:hAnsi="Arthouse Owned Medium"/>
-        </w:rPr>
-      </w:pPr>
-      <w:r>
-        <w:rPr>
-          <w:rFonts w:ascii="Arthouse Owned Medium" w:hAnsi="Arthouse Owned Medium"/>
-        </w:rPr>
-        <w:t>Kritische</w:t>
-      </w:r>
-      <w:r>
-        <w:rPr>
-          <w:rFonts w:ascii="Arthouse Owned Medium" w:hAnsi="Arthouse Owned Medium"/>
-        </w:rPr>
-        <w:t xml:space="preserve"> </w:t>
-      </w:r>
-      <w:r>
-        <w:rPr>
-          <w:rFonts w:ascii="Arthouse Owned Medium" w:hAnsi="Arthouse Owned Medium"/>
-        </w:rPr>
-        <w:t>Ereignisse</w:t>
-      </w:r>
-      <w:r>
-        <w:rPr>
-          <w:rFonts w:ascii="Arthouse Owned Medium" w:hAnsi="Arthouse Owned Medium"/>
-        </w:rPr>
-        <w:t xml:space="preserve"> - Simuliert</w:t>
-      </w:r>
-    </w:p>
-    <w:p>
-      <w:pPr>
-        <w:rPr>
-          <w:rFonts w:ascii="Arthouse Owned Medium" w:hAnsi="Arthouse Owned Medium"/>
-        </w:rPr>
-      </w:pPr>
-      <w:r>
-        <w:rPr>
-          <w:rFonts w:ascii="Arthouse Owned Medium" w:hAnsi="Arthouse Owned Medium"/>
-        </w:rPr>
-        <w:t>{%</w:t>
-      </w:r>
-      <w:proofErr w:type="spellStart"/>
-      <w:r>
-        <w:rPr>
-          <w:rFonts w:ascii="Arthouse Owned Medium" w:hAnsi="Arthouse Owned Medium"/>
-        </w:rPr>
-        <w:t>plot_critical_events</w:t>
-      </w:r>
-      <w:proofErr w:type="spellEnd"/>
-      <w:r>
-        <w:rPr>
-          <w:rFonts w:ascii="Arthouse Owned Medium" w:hAnsi="Arthouse Owned Medium"/>
-        </w:rPr>
-        <w:t>}</w:t>
-      </w:r>
-    </w:p>
-    <w:p>
-      <w:pPr>
-        <w:rPr>
-          <w:rFonts w:ascii="Arthouse Owned Medium" w:hAnsi="Arthouse Owned Medium"/>
-        </w:rPr>
-      </w:pPr>
-      <w:r>
-        <w:rPr>
-          <w:rFonts w:ascii="Arthouse Owned Medium" w:hAnsi="Arthouse Owned Medium"/>
-        </w:rPr>
         <w:t>Kritische</w:t>
       </w:r>
       <w:r>

</xml_diff>